<commit_message>
docs: embed rendered diagram images into SRS Markdown and docx files
</commit_message>
<xml_diff>
--- a/docs/SRS_Portfolio_TranVuThien.docx
+++ b/docs/SRS_Portfolio_TranVuThien.docx
@@ -3004,287 +3004,65 @@
     </w:p>
     <w:p>
       <w:pPr>
-        <w:spacing w:after="20" w:before="20"/>
-      </w:pPr>
-      <w:r>
-        <w:rPr>
-          <w:rFonts w:ascii="Consolas" w:cs="Consolas" w:eastAsia="Consolas" w:hAnsi="Consolas"/>
-          <w:color w:val="1E293B"/>
+        <w:spacing w:after="80" w:before="200"/>
+        <w:jc w:val="center"/>
+      </w:pPr>
+      <w:r>
+        <w:drawing>
+          <wp:inline distT="0" distB="0" distL="0" distR="0">
+            <wp:extent cx="5334000" cy="590550"/>
+            <wp:effectExtent t="0" r="0" b="0" l="0"/>
+            <wp:docPr id="1" name="" descr="" title=""/>
+            <wp:cNvGraphicFramePr>
+              <a:graphicFrameLocks xmlns:a="http://schemas.openxmlformats.org/drawingml/2006/main" noChangeAspect="1"/>
+            </wp:cNvGraphicFramePr>
+            <a:graphic xmlns:a="http://schemas.openxmlformats.org/drawingml/2006/main">
+              <a:graphicData uri="http://schemas.openxmlformats.org/drawingml/2006/picture">
+                <pic:pic xmlns:pic="http://schemas.openxmlformats.org/drawingml/2006/picture">
+                  <pic:nvPicPr>
+                    <pic:cNvPr id="0" name="" descr=""/>
+                    <pic:cNvPicPr>
+                      <a:picLocks noChangeAspect="1" noChangeArrowheads="1"/>
+                    </pic:cNvPicPr>
+                  </pic:nvPicPr>
+                  <pic:blipFill>
+                    <a:blip r:embed="rId9" cstate="none"/>
+                    <a:srcRect/>
+                    <a:stretch>
+                      <a:fillRect/>
+                    </a:stretch>
+                  </pic:blipFill>
+                  <pic:spPr bwMode="auto">
+                    <a:xfrm>
+                      <a:off x="0" y="0"/>
+                      <a:ext cx="5334000" cy="590550"/>
+                    </a:xfrm>
+                    <a:prstGeom prst="rect">
+                      <a:avLst/>
+                    </a:prstGeom>
+                  </pic:spPr>
+                </pic:pic>
+              </a:graphicData>
+            </a:graphic>
+          </wp:inline>
+        </w:drawing>
+      </w:r>
+    </w:p>
+    <w:p>
+      <w:pPr>
+        <w:spacing w:after="200"/>
+        <w:jc w:val="center"/>
+      </w:pPr>
+      <w:r>
+        <w:rPr>
+          <w:rFonts w:ascii="Arial" w:cs="Arial" w:eastAsia="Arial" w:hAnsi="Arial"/>
+          <w:i/>
+          <w:iCs/>
+          <w:color w:val="64748B"/>
           <w:sz w:val="18"/>
           <w:szCs w:val="18"/>
         </w:rPr>
-        <w:t xml:space="preserve">graph TD
-</w:t>
-      </w:r>
-    </w:p>
-    <w:p>
-      <w:pPr>
-        <w:spacing w:after="20" w:before="20"/>
-      </w:pPr>
-      <w:r>
-        <w:rPr>
-          <w:rFonts w:ascii="Consolas" w:cs="Consolas" w:eastAsia="Consolas" w:hAnsi="Consolas"/>
-          <w:color w:val="1E293B"/>
-          <w:sz w:val="18"/>
-          <w:szCs w:val="18"/>
-        </w:rPr>
-        <w:t xml:space="preserve">    A[Hệ thống Portfolio &amp; Admin Platform] --&gt; B[Phân hệ Public Web]
-</w:t>
-      </w:r>
-    </w:p>
-    <w:p>
-      <w:pPr>
-        <w:spacing w:after="20" w:before="20"/>
-      </w:pPr>
-      <w:r>
-        <w:rPr>
-          <w:rFonts w:ascii="Consolas" w:cs="Consolas" w:eastAsia="Consolas" w:hAnsi="Consolas"/>
-          <w:color w:val="1E293B"/>
-          <w:sz w:val="18"/>
-          <w:szCs w:val="18"/>
-        </w:rPr>
-        <w:t xml:space="preserve">    A --&gt; C[Phân hệ Admin CMS]
-</w:t>
-      </w:r>
-    </w:p>
-    <w:p>
-      <w:pPr>
-        <w:spacing w:after="20" w:before="20"/>
-      </w:pPr>
-      <w:r>
-        <w:rPr>
-          <w:rFonts w:ascii="Consolas" w:cs="Consolas" w:eastAsia="Consolas" w:hAnsi="Consolas"/>
-          <w:color w:val="1E293B"/>
-          <w:sz w:val="18"/>
-          <w:szCs w:val="18"/>
-        </w:rPr>
-        <w:t xml:space="preserve">    A --&gt; D[Phân hệ Hệ thống &amp; Backend API]
-</w:t>
-      </w:r>
-    </w:p>
-    <w:p>
-      <w:pPr>
-        <w:spacing w:after="20" w:before="20"/>
-      </w:pPr>
-      <w:r>
-        <w:rPr>
-          <w:rFonts w:ascii="Consolas" w:cs="Consolas" w:eastAsia="Consolas" w:hAnsi="Consolas"/>
-          <w:color w:val="1E293B"/>
-          <w:sz w:val="18"/>
-          <w:szCs w:val="18"/>
-        </w:rPr>
-        <w:t xml:space="preserve">
-</w:t>
-      </w:r>
-    </w:p>
-    <w:p>
-      <w:pPr>
-        <w:spacing w:after="20" w:before="20"/>
-      </w:pPr>
-      <w:r>
-        <w:rPr>
-          <w:rFonts w:ascii="Consolas" w:cs="Consolas" w:eastAsia="Consolas" w:hAnsi="Consolas"/>
-          <w:color w:val="1E293B"/>
-          <w:sz w:val="18"/>
-          <w:szCs w:val="18"/>
-        </w:rPr>
-        <w:t xml:space="preserve">    B --&gt; B1[Trang chủ tương tác: Hero 3D, About, Timeline, Projects, Skills]
-</w:t>
-      </w:r>
-    </w:p>
-    <w:p>
-      <w:pPr>
-        <w:spacing w:after="20" w:before="20"/>
-      </w:pPr>
-      <w:r>
-        <w:rPr>
-          <w:rFonts w:ascii="Consolas" w:cs="Consolas" w:eastAsia="Consolas" w:hAnsi="Consolas"/>
-          <w:color w:val="1E293B"/>
-          <w:sz w:val="18"/>
-          <w:szCs w:val="18"/>
-        </w:rPr>
-        <w:t xml:space="preserve">    B --&gt; B2[Trang Blog chuyên ngành &amp; Đọc bài viết Markdown]
-</w:t>
-      </w:r>
-    </w:p>
-    <w:p>
-      <w:pPr>
-        <w:spacing w:after="20" w:before="20"/>
-      </w:pPr>
-      <w:r>
-        <w:rPr>
-          <w:rFonts w:ascii="Consolas" w:cs="Consolas" w:eastAsia="Consolas" w:hAnsi="Consolas"/>
-          <w:color w:val="1E293B"/>
-          <w:sz w:val="18"/>
-          <w:szCs w:val="18"/>
-        </w:rPr>
-        <w:t xml:space="preserve">    B --&gt; B3[Form Liên hệ &amp; Gửi phản hồi]
-</w:t>
-      </w:r>
-    </w:p>
-    <w:p>
-      <w:pPr>
-        <w:spacing w:after="20" w:before="20"/>
-      </w:pPr>
-      <w:r>
-        <w:rPr>
-          <w:rFonts w:ascii="Consolas" w:cs="Consolas" w:eastAsia="Consolas" w:hAnsi="Consolas"/>
-          <w:color w:val="1E293B"/>
-          <w:sz w:val="18"/>
-          <w:szCs w:val="18"/>
-        </w:rPr>
-        <w:t xml:space="preserve">    B --&gt; B4[Tiện ích: Interactive Terminal, Modal xem CV EN/VI, GitHub Stats]
-</w:t>
-      </w:r>
-    </w:p>
-    <w:p>
-      <w:pPr>
-        <w:spacing w:after="20" w:before="20"/>
-      </w:pPr>
-      <w:r>
-        <w:rPr>
-          <w:rFonts w:ascii="Consolas" w:cs="Consolas" w:eastAsia="Consolas" w:hAnsi="Consolas"/>
-          <w:color w:val="1E293B"/>
-          <w:sz w:val="18"/>
-          <w:szCs w:val="18"/>
-        </w:rPr>
-        <w:t xml:space="preserve">
-</w:t>
-      </w:r>
-    </w:p>
-    <w:p>
-      <w:pPr>
-        <w:spacing w:after="20" w:before="20"/>
-      </w:pPr>
-      <w:r>
-        <w:rPr>
-          <w:rFonts w:ascii="Consolas" w:cs="Consolas" w:eastAsia="Consolas" w:hAnsi="Consolas"/>
-          <w:color w:val="1E293B"/>
-          <w:sz w:val="18"/>
-          <w:szCs w:val="18"/>
-        </w:rPr>
-        <w:t xml:space="preserve">    C --&gt; C1[Xác thực đăng nhập JWT &amp; Quản lý phiên]
-</w:t>
-      </w:r>
-    </w:p>
-    <w:p>
-      <w:pPr>
-        <w:spacing w:after="20" w:before="20"/>
-      </w:pPr>
-      <w:r>
-        <w:rPr>
-          <w:rFonts w:ascii="Consolas" w:cs="Consolas" w:eastAsia="Consolas" w:hAnsi="Consolas"/>
-          <w:color w:val="1E293B"/>
-          <w:sz w:val="18"/>
-          <w:szCs w:val="18"/>
-        </w:rPr>
-        <w:t xml:space="preserve">    C --&gt; C2[Dashboard phân tích truy cập thời gian thực]
-</w:t>
-      </w:r>
-    </w:p>
-    <w:p>
-      <w:pPr>
-        <w:spacing w:after="20" w:before="20"/>
-      </w:pPr>
-      <w:r>
-        <w:rPr>
-          <w:rFonts w:ascii="Consolas" w:cs="Consolas" w:eastAsia="Consolas" w:hAnsi="Consolas"/>
-          <w:color w:val="1E293B"/>
-          <w:sz w:val="18"/>
-          <w:szCs w:val="18"/>
-        </w:rPr>
-        <w:t xml:space="preserve">    C --&gt; C3[Quản lý tài nguyên CRUD &amp; Kéo thả sắp xếp]
-</w:t>
-      </w:r>
-    </w:p>
-    <w:p>
-      <w:pPr>
-        <w:spacing w:after="20" w:before="20"/>
-      </w:pPr>
-      <w:r>
-        <w:rPr>
-          <w:rFonts w:ascii="Consolas" w:cs="Consolas" w:eastAsia="Consolas" w:hAnsi="Consolas"/>
-          <w:color w:val="1E293B"/>
-          <w:sz w:val="18"/>
-          <w:szCs w:val="18"/>
-        </w:rPr>
-        <w:t xml:space="preserve">    C --&gt; C4[Hộp thư tin nhắn liên hệ &amp; Tải ảnh Supabase Storage]
-</w:t>
-      </w:r>
-    </w:p>
-    <w:p>
-      <w:pPr>
-        <w:spacing w:after="20" w:before="20"/>
-      </w:pPr>
-      <w:r>
-        <w:rPr>
-          <w:rFonts w:ascii="Consolas" w:cs="Consolas" w:eastAsia="Consolas" w:hAnsi="Consolas"/>
-          <w:color w:val="1E293B"/>
-          <w:sz w:val="18"/>
-          <w:szCs w:val="18"/>
-        </w:rPr>
-        <w:t xml:space="preserve">
-</w:t>
-      </w:r>
-    </w:p>
-    <w:p>
-      <w:pPr>
-        <w:spacing w:after="20" w:before="20"/>
-      </w:pPr>
-      <w:r>
-        <w:rPr>
-          <w:rFonts w:ascii="Consolas" w:cs="Consolas" w:eastAsia="Consolas" w:hAnsi="Consolas"/>
-          <w:color w:val="1E293B"/>
-          <w:sz w:val="18"/>
-          <w:szCs w:val="18"/>
-        </w:rPr>
-        <w:t xml:space="preserve">    D --&gt; D1[Spring Boot RESTful Services &amp; Cache 10-min]
-</w:t>
-      </w:r>
-    </w:p>
-    <w:p>
-      <w:pPr>
-        <w:spacing w:after="20" w:before="20"/>
-      </w:pPr>
-      <w:r>
-        <w:rPr>
-          <w:rFonts w:ascii="Consolas" w:cs="Consolas" w:eastAsia="Consolas" w:hAnsi="Consolas"/>
-          <w:color w:val="1E293B"/>
-          <w:sz w:val="18"/>
-          <w:szCs w:val="18"/>
-        </w:rPr>
-        <w:t xml:space="preserve">    D --&gt; D2[Bảo mật đa tầng: Rate-limit, Lockout, CSRF/CORS]
-</w:t>
-      </w:r>
-    </w:p>
-    <w:p>
-      <w:pPr>
-        <w:spacing w:after="20" w:before="20"/>
-      </w:pPr>
-      <w:r>
-        <w:rPr>
-          <w:rFonts w:ascii="Consolas" w:cs="Consolas" w:eastAsia="Consolas" w:hAnsi="Consolas"/>
-          <w:color w:val="1E293B"/>
-          <w:sz w:val="18"/>
-          <w:szCs w:val="18"/>
-        </w:rPr>
-        <w:t xml:space="preserve">    D --&gt; D3[Xử lý tác vụ bất đồng bộ: Dual Mail Sender SMTP/Resend]
-</w:t>
-      </w:r>
-    </w:p>
-    <w:p>
-      <w:pPr>
-        <w:spacing w:after="20" w:before="20"/>
-      </w:pPr>
-      <w:r>
-        <w:rPr>
-          <w:rFonts w:ascii="Consolas" w:cs="Consolas" w:eastAsia="Consolas" w:hAnsi="Consolas"/>
-          <w:color w:val="1E293B"/>
-          <w:sz w:val="18"/>
-          <w:szCs w:val="18"/>
-        </w:rPr>
-        <w:t xml:space="preserve">    D --&gt; D4[Supabase PostgreSQL &amp; Flyway Migration]
-</w:t>
+        <w:t xml:space="preserve">Hình: Sơ đồ phân hệ chức năng chính</w:t>
       </w:r>
     </w:p>
     <w:p>
@@ -9191,1397 +8969,65 @@
     </w:p>
     <w:p>
       <w:pPr>
-        <w:spacing w:after="20" w:before="20"/>
-      </w:pPr>
-      <w:r>
-        <w:rPr>
-          <w:rFonts w:ascii="Consolas" w:cs="Consolas" w:eastAsia="Consolas" w:hAnsi="Consolas"/>
-          <w:color w:val="1E293B"/>
+        <w:spacing w:after="80" w:before="200"/>
+        <w:jc w:val="center"/>
+      </w:pPr>
+      <w:r>
+        <w:drawing>
+          <wp:inline distT="0" distB="0" distL="0" distR="0">
+            <wp:extent cx="5334000" cy="1666875"/>
+            <wp:effectExtent t="0" r="0" b="0" l="0"/>
+            <wp:docPr id="1" name="" descr="" title=""/>
+            <wp:cNvGraphicFramePr>
+              <a:graphicFrameLocks xmlns:a="http://schemas.openxmlformats.org/drawingml/2006/main" noChangeAspect="1"/>
+            </wp:cNvGraphicFramePr>
+            <a:graphic xmlns:a="http://schemas.openxmlformats.org/drawingml/2006/main">
+              <a:graphicData uri="http://schemas.openxmlformats.org/drawingml/2006/picture">
+                <pic:pic xmlns:pic="http://schemas.openxmlformats.org/drawingml/2006/picture">
+                  <pic:nvPicPr>
+                    <pic:cNvPr id="0" name="" descr=""/>
+                    <pic:cNvPicPr>
+                      <a:picLocks noChangeAspect="1" noChangeArrowheads="1"/>
+                    </pic:cNvPicPr>
+                  </pic:nvPicPr>
+                  <pic:blipFill>
+                    <a:blip r:embed="rId10" cstate="none"/>
+                    <a:srcRect/>
+                    <a:stretch>
+                      <a:fillRect/>
+                    </a:stretch>
+                  </pic:blipFill>
+                  <pic:spPr bwMode="auto">
+                    <a:xfrm>
+                      <a:off x="0" y="0"/>
+                      <a:ext cx="5334000" cy="1666875"/>
+                    </a:xfrm>
+                    <a:prstGeom prst="rect">
+                      <a:avLst/>
+                    </a:prstGeom>
+                  </pic:spPr>
+                </pic:pic>
+              </a:graphicData>
+            </a:graphic>
+          </wp:inline>
+        </w:drawing>
+      </w:r>
+    </w:p>
+    <w:p>
+      <w:pPr>
+        <w:spacing w:after="200"/>
+        <w:jc w:val="center"/>
+      </w:pPr>
+      <w:r>
+        <w:rPr>
+          <w:rFonts w:ascii="Arial" w:cs="Arial" w:eastAsia="Arial" w:hAnsi="Arial"/>
+          <w:i/>
+          <w:iCs/>
+          <w:color w:val="64748B"/>
           <w:sz w:val="18"/>
           <w:szCs w:val="18"/>
         </w:rPr>
-        <w:t xml:space="preserve">erDiagram
-</w:t>
-      </w:r>
-    </w:p>
-    <w:p>
-      <w:pPr>
-        <w:spacing w:after="20" w:before="20"/>
-      </w:pPr>
-      <w:r>
-        <w:rPr>
-          <w:rFonts w:ascii="Consolas" w:cs="Consolas" w:eastAsia="Consolas" w:hAnsi="Consolas"/>
-          <w:color w:val="1E293B"/>
-          <w:sz w:val="18"/>
-          <w:szCs w:val="18"/>
-        </w:rPr>
-        <w:t xml:space="preserve">    users ||--o{ refresh_tokens : "owns"
-</w:t>
-      </w:r>
-    </w:p>
-    <w:p>
-      <w:pPr>
-        <w:spacing w:after="20" w:before="20"/>
-      </w:pPr>
-      <w:r>
-        <w:rPr>
-          <w:rFonts w:ascii="Consolas" w:cs="Consolas" w:eastAsia="Consolas" w:hAnsi="Consolas"/>
-          <w:color w:val="1E293B"/>
-          <w:sz w:val="18"/>
-          <w:szCs w:val="18"/>
-        </w:rPr>
-        <w:t xml:space="preserve">    profile {
-</w:t>
-      </w:r>
-    </w:p>
-    <w:p>
-      <w:pPr>
-        <w:spacing w:after="20" w:before="20"/>
-      </w:pPr>
-      <w:r>
-        <w:rPr>
-          <w:rFonts w:ascii="Consolas" w:cs="Consolas" w:eastAsia="Consolas" w:hAnsi="Consolas"/>
-          <w:color w:val="1E293B"/>
-          <w:sz w:val="18"/>
-          <w:szCs w:val="18"/>
-        </w:rPr>
-        <w:t xml:space="preserve">        BIGINT id PK
-</w:t>
-      </w:r>
-    </w:p>
-    <w:p>
-      <w:pPr>
-        <w:spacing w:after="20" w:before="20"/>
-      </w:pPr>
-      <w:r>
-        <w:rPr>
-          <w:rFonts w:ascii="Consolas" w:cs="Consolas" w:eastAsia="Consolas" w:hAnsi="Consolas"/>
-          <w:color w:val="1E293B"/>
-          <w:sz w:val="18"/>
-          <w:szCs w:val="18"/>
-        </w:rPr>
-        <w:t xml:space="preserve">        VARCHAR full_name
-</w:t>
-      </w:r>
-    </w:p>
-    <w:p>
-      <w:pPr>
-        <w:spacing w:after="20" w:before="20"/>
-      </w:pPr>
-      <w:r>
-        <w:rPr>
-          <w:rFonts w:ascii="Consolas" w:cs="Consolas" w:eastAsia="Consolas" w:hAnsi="Consolas"/>
-          <w:color w:val="1E293B"/>
-          <w:sz w:val="18"/>
-          <w:szCs w:val="18"/>
-        </w:rPr>
-        <w:t xml:space="preserve">        VARCHAR title
-</w:t>
-      </w:r>
-    </w:p>
-    <w:p>
-      <w:pPr>
-        <w:spacing w:after="20" w:before="20"/>
-      </w:pPr>
-      <w:r>
-        <w:rPr>
-          <w:rFonts w:ascii="Consolas" w:cs="Consolas" w:eastAsia="Consolas" w:hAnsi="Consolas"/>
-          <w:color w:val="1E293B"/>
-          <w:sz w:val="18"/>
-          <w:szCs w:val="18"/>
-        </w:rPr>
-        <w:t xml:space="preserve">        TEXT summary
-</w:t>
-      </w:r>
-    </w:p>
-    <w:p>
-      <w:pPr>
-        <w:spacing w:after="20" w:before="20"/>
-      </w:pPr>
-      <w:r>
-        <w:rPr>
-          <w:rFonts w:ascii="Consolas" w:cs="Consolas" w:eastAsia="Consolas" w:hAnsi="Consolas"/>
-          <w:color w:val="1E293B"/>
-          <w:sz w:val="18"/>
-          <w:szCs w:val="18"/>
-        </w:rPr>
-        <w:t xml:space="preserve">        VARCHAR avatar_url
-</w:t>
-      </w:r>
-    </w:p>
-    <w:p>
-      <w:pPr>
-        <w:spacing w:after="20" w:before="20"/>
-      </w:pPr>
-      <w:r>
-        <w:rPr>
-          <w:rFonts w:ascii="Consolas" w:cs="Consolas" w:eastAsia="Consolas" w:hAnsi="Consolas"/>
-          <w:color w:val="1E293B"/>
-          <w:sz w:val="18"/>
-          <w:szCs w:val="18"/>
-        </w:rPr>
-        <w:t xml:space="preserve">        VARCHAR email
-</w:t>
-      </w:r>
-    </w:p>
-    <w:p>
-      <w:pPr>
-        <w:spacing w:after="20" w:before="20"/>
-      </w:pPr>
-      <w:r>
-        <w:rPr>
-          <w:rFonts w:ascii="Consolas" w:cs="Consolas" w:eastAsia="Consolas" w:hAnsi="Consolas"/>
-          <w:color w:val="1E293B"/>
-          <w:sz w:val="18"/>
-          <w:szCs w:val="18"/>
-        </w:rPr>
-        <w:t xml:space="preserve">        VARCHAR phone
-</w:t>
-      </w:r>
-    </w:p>
-    <w:p>
-      <w:pPr>
-        <w:spacing w:after="20" w:before="20"/>
-      </w:pPr>
-      <w:r>
-        <w:rPr>
-          <w:rFonts w:ascii="Consolas" w:cs="Consolas" w:eastAsia="Consolas" w:hAnsi="Consolas"/>
-          <w:color w:val="1E293B"/>
-          <w:sz w:val="18"/>
-          <w:szCs w:val="18"/>
-        </w:rPr>
-        <w:t xml:space="preserve">        VARCHAR location
-</w:t>
-      </w:r>
-    </w:p>
-    <w:p>
-      <w:pPr>
-        <w:spacing w:after="20" w:before="20"/>
-      </w:pPr>
-      <w:r>
-        <w:rPr>
-          <w:rFonts w:ascii="Consolas" w:cs="Consolas" w:eastAsia="Consolas" w:hAnsi="Consolas"/>
-          <w:color w:val="1E293B"/>
-          <w:sz w:val="18"/>
-          <w:szCs w:val="18"/>
-        </w:rPr>
-        <w:t xml:space="preserve">        VARCHAR cv_url
-</w:t>
-      </w:r>
-    </w:p>
-    <w:p>
-      <w:pPr>
-        <w:spacing w:after="20" w:before="20"/>
-      </w:pPr>
-      <w:r>
-        <w:rPr>
-          <w:rFonts w:ascii="Consolas" w:cs="Consolas" w:eastAsia="Consolas" w:hAnsi="Consolas"/>
-          <w:color w:val="1E293B"/>
-          <w:sz w:val="18"/>
-          <w:szCs w:val="18"/>
-        </w:rPr>
-        <w:t xml:space="preserve">        TEXT typing_roles
-</w:t>
-      </w:r>
-    </w:p>
-    <w:p>
-      <w:pPr>
-        <w:spacing w:after="20" w:before="20"/>
-      </w:pPr>
-      <w:r>
-        <w:rPr>
-          <w:rFonts w:ascii="Consolas" w:cs="Consolas" w:eastAsia="Consolas" w:hAnsi="Consolas"/>
-          <w:color w:val="1E293B"/>
-          <w:sz w:val="18"/>
-          <w:szCs w:val="18"/>
-        </w:rPr>
-        <w:t xml:space="preserve">        INT years_experience
-</w:t>
-      </w:r>
-    </w:p>
-    <w:p>
-      <w:pPr>
-        <w:spacing w:after="20" w:before="20"/>
-      </w:pPr>
-      <w:r>
-        <w:rPr>
-          <w:rFonts w:ascii="Consolas" w:cs="Consolas" w:eastAsia="Consolas" w:hAnsi="Consolas"/>
-          <w:color w:val="1E293B"/>
-          <w:sz w:val="18"/>
-          <w:szCs w:val="18"/>
-        </w:rPr>
-        <w:t xml:space="preserve">    }
-</w:t>
-      </w:r>
-    </w:p>
-    <w:p>
-      <w:pPr>
-        <w:spacing w:after="20" w:before="20"/>
-      </w:pPr>
-      <w:r>
-        <w:rPr>
-          <w:rFonts w:ascii="Consolas" w:cs="Consolas" w:eastAsia="Consolas" w:hAnsi="Consolas"/>
-          <w:color w:val="1E293B"/>
-          <w:sz w:val="18"/>
-          <w:szCs w:val="18"/>
-        </w:rPr>
-        <w:t xml:space="preserve">    skills {
-</w:t>
-      </w:r>
-    </w:p>
-    <w:p>
-      <w:pPr>
-        <w:spacing w:after="20" w:before="20"/>
-      </w:pPr>
-      <w:r>
-        <w:rPr>
-          <w:rFonts w:ascii="Consolas" w:cs="Consolas" w:eastAsia="Consolas" w:hAnsi="Consolas"/>
-          <w:color w:val="1E293B"/>
-          <w:sz w:val="18"/>
-          <w:szCs w:val="18"/>
-        </w:rPr>
-        <w:t xml:space="preserve">        BIGINT id PK
-</w:t>
-      </w:r>
-    </w:p>
-    <w:p>
-      <w:pPr>
-        <w:spacing w:after="20" w:before="20"/>
-      </w:pPr>
-      <w:r>
-        <w:rPr>
-          <w:rFonts w:ascii="Consolas" w:cs="Consolas" w:eastAsia="Consolas" w:hAnsi="Consolas"/>
-          <w:color w:val="1E293B"/>
-          <w:sz w:val="18"/>
-          <w:szCs w:val="18"/>
-        </w:rPr>
-        <w:t xml:space="preserve">        VARCHAR name
-</w:t>
-      </w:r>
-    </w:p>
-    <w:p>
-      <w:pPr>
-        <w:spacing w:after="20" w:before="20"/>
-      </w:pPr>
-      <w:r>
-        <w:rPr>
-          <w:rFonts w:ascii="Consolas" w:cs="Consolas" w:eastAsia="Consolas" w:hAnsi="Consolas"/>
-          <w:color w:val="1E293B"/>
-          <w:sz w:val="18"/>
-          <w:szCs w:val="18"/>
-        </w:rPr>
-        <w:t xml:space="preserve">        VARCHAR category
-</w:t>
-      </w:r>
-    </w:p>
-    <w:p>
-      <w:pPr>
-        <w:spacing w:after="20" w:before="20"/>
-      </w:pPr>
-      <w:r>
-        <w:rPr>
-          <w:rFonts w:ascii="Consolas" w:cs="Consolas" w:eastAsia="Consolas" w:hAnsi="Consolas"/>
-          <w:color w:val="1E293B"/>
-          <w:sz w:val="18"/>
-          <w:szCs w:val="18"/>
-        </w:rPr>
-        <w:t xml:space="preserve">        INT proficiency
-</w:t>
-      </w:r>
-    </w:p>
-    <w:p>
-      <w:pPr>
-        <w:spacing w:after="20" w:before="20"/>
-      </w:pPr>
-      <w:r>
-        <w:rPr>
-          <w:rFonts w:ascii="Consolas" w:cs="Consolas" w:eastAsia="Consolas" w:hAnsi="Consolas"/>
-          <w:color w:val="1E293B"/>
-          <w:sz w:val="18"/>
-          <w:szCs w:val="18"/>
-        </w:rPr>
-        <w:t xml:space="preserve">        VARCHAR icon
-</w:t>
-      </w:r>
-    </w:p>
-    <w:p>
-      <w:pPr>
-        <w:spacing w:after="20" w:before="20"/>
-      </w:pPr>
-      <w:r>
-        <w:rPr>
-          <w:rFonts w:ascii="Consolas" w:cs="Consolas" w:eastAsia="Consolas" w:hAnsi="Consolas"/>
-          <w:color w:val="1E293B"/>
-          <w:sz w:val="18"/>
-          <w:szCs w:val="18"/>
-        </w:rPr>
-        <w:t xml:space="preserve">        INT sort_order
-</w:t>
-      </w:r>
-    </w:p>
-    <w:p>
-      <w:pPr>
-        <w:spacing w:after="20" w:before="20"/>
-      </w:pPr>
-      <w:r>
-        <w:rPr>
-          <w:rFonts w:ascii="Consolas" w:cs="Consolas" w:eastAsia="Consolas" w:hAnsi="Consolas"/>
-          <w:color w:val="1E293B"/>
-          <w:sz w:val="18"/>
-          <w:szCs w:val="18"/>
-        </w:rPr>
-        <w:t xml:space="preserve">    }
-</w:t>
-      </w:r>
-    </w:p>
-    <w:p>
-      <w:pPr>
-        <w:spacing w:after="20" w:before="20"/>
-      </w:pPr>
-      <w:r>
-        <w:rPr>
-          <w:rFonts w:ascii="Consolas" w:cs="Consolas" w:eastAsia="Consolas" w:hAnsi="Consolas"/>
-          <w:color w:val="1E293B"/>
-          <w:sz w:val="18"/>
-          <w:szCs w:val="18"/>
-        </w:rPr>
-        <w:t xml:space="preserve">    experiences {
-</w:t>
-      </w:r>
-    </w:p>
-    <w:p>
-      <w:pPr>
-        <w:spacing w:after="20" w:before="20"/>
-      </w:pPr>
-      <w:r>
-        <w:rPr>
-          <w:rFonts w:ascii="Consolas" w:cs="Consolas" w:eastAsia="Consolas" w:hAnsi="Consolas"/>
-          <w:color w:val="1E293B"/>
-          <w:sz w:val="18"/>
-          <w:szCs w:val="18"/>
-        </w:rPr>
-        <w:t xml:space="preserve">        BIGINT id PK
-</w:t>
-      </w:r>
-    </w:p>
-    <w:p>
-      <w:pPr>
-        <w:spacing w:after="20" w:before="20"/>
-      </w:pPr>
-      <w:r>
-        <w:rPr>
-          <w:rFonts w:ascii="Consolas" w:cs="Consolas" w:eastAsia="Consolas" w:hAnsi="Consolas"/>
-          <w:color w:val="1E293B"/>
-          <w:sz w:val="18"/>
-          <w:szCs w:val="18"/>
-        </w:rPr>
-        <w:t xml:space="preserve">        VARCHAR company
-</w:t>
-      </w:r>
-    </w:p>
-    <w:p>
-      <w:pPr>
-        <w:spacing w:after="20" w:before="20"/>
-      </w:pPr>
-      <w:r>
-        <w:rPr>
-          <w:rFonts w:ascii="Consolas" w:cs="Consolas" w:eastAsia="Consolas" w:hAnsi="Consolas"/>
-          <w:color w:val="1E293B"/>
-          <w:sz w:val="18"/>
-          <w:szCs w:val="18"/>
-        </w:rPr>
-        <w:t xml:space="preserve">        VARCHAR role
-</w:t>
-      </w:r>
-    </w:p>
-    <w:p>
-      <w:pPr>
-        <w:spacing w:after="20" w:before="20"/>
-      </w:pPr>
-      <w:r>
-        <w:rPr>
-          <w:rFonts w:ascii="Consolas" w:cs="Consolas" w:eastAsia="Consolas" w:hAnsi="Consolas"/>
-          <w:color w:val="1E293B"/>
-          <w:sz w:val="18"/>
-          <w:szCs w:val="18"/>
-        </w:rPr>
-        <w:t xml:space="preserve">        VARCHAR period
-</w:t>
-      </w:r>
-    </w:p>
-    <w:p>
-      <w:pPr>
-        <w:spacing w:after="20" w:before="20"/>
-      </w:pPr>
-      <w:r>
-        <w:rPr>
-          <w:rFonts w:ascii="Consolas" w:cs="Consolas" w:eastAsia="Consolas" w:hAnsi="Consolas"/>
-          <w:color w:val="1E293B"/>
-          <w:sz w:val="18"/>
-          <w:szCs w:val="18"/>
-        </w:rPr>
-        <w:t xml:space="preserve">        TEXT description
-</w:t>
-      </w:r>
-    </w:p>
-    <w:p>
-      <w:pPr>
-        <w:spacing w:after="20" w:before="20"/>
-      </w:pPr>
-      <w:r>
-        <w:rPr>
-          <w:rFonts w:ascii="Consolas" w:cs="Consolas" w:eastAsia="Consolas" w:hAnsi="Consolas"/>
-          <w:color w:val="1E293B"/>
-          <w:sz w:val="18"/>
-          <w:szCs w:val="18"/>
-        </w:rPr>
-        <w:t xml:space="preserve">        TEXT tech_stack
-</w:t>
-      </w:r>
-    </w:p>
-    <w:p>
-      <w:pPr>
-        <w:spacing w:after="20" w:before="20"/>
-      </w:pPr>
-      <w:r>
-        <w:rPr>
-          <w:rFonts w:ascii="Consolas" w:cs="Consolas" w:eastAsia="Consolas" w:hAnsi="Consolas"/>
-          <w:color w:val="1E293B"/>
-          <w:sz w:val="18"/>
-          <w:szCs w:val="18"/>
-        </w:rPr>
-        <w:t xml:space="preserve">        INT sort_order
-</w:t>
-      </w:r>
-    </w:p>
-    <w:p>
-      <w:pPr>
-        <w:spacing w:after="20" w:before="20"/>
-      </w:pPr>
-      <w:r>
-        <w:rPr>
-          <w:rFonts w:ascii="Consolas" w:cs="Consolas" w:eastAsia="Consolas" w:hAnsi="Consolas"/>
-          <w:color w:val="1E293B"/>
-          <w:sz w:val="18"/>
-          <w:szCs w:val="18"/>
-        </w:rPr>
-        <w:t xml:space="preserve">    }
-</w:t>
-      </w:r>
-    </w:p>
-    <w:p>
-      <w:pPr>
-        <w:spacing w:after="20" w:before="20"/>
-      </w:pPr>
-      <w:r>
-        <w:rPr>
-          <w:rFonts w:ascii="Consolas" w:cs="Consolas" w:eastAsia="Consolas" w:hAnsi="Consolas"/>
-          <w:color w:val="1E293B"/>
-          <w:sz w:val="18"/>
-          <w:szCs w:val="18"/>
-        </w:rPr>
-        <w:t xml:space="preserve">    projects {
-</w:t>
-      </w:r>
-    </w:p>
-    <w:p>
-      <w:pPr>
-        <w:spacing w:after="20" w:before="20"/>
-      </w:pPr>
-      <w:r>
-        <w:rPr>
-          <w:rFonts w:ascii="Consolas" w:cs="Consolas" w:eastAsia="Consolas" w:hAnsi="Consolas"/>
-          <w:color w:val="1E293B"/>
-          <w:sz w:val="18"/>
-          <w:szCs w:val="18"/>
-        </w:rPr>
-        <w:t xml:space="preserve">        BIGINT id PK
-</w:t>
-      </w:r>
-    </w:p>
-    <w:p>
-      <w:pPr>
-        <w:spacing w:after="20" w:before="20"/>
-      </w:pPr>
-      <w:r>
-        <w:rPr>
-          <w:rFonts w:ascii="Consolas" w:cs="Consolas" w:eastAsia="Consolas" w:hAnsi="Consolas"/>
-          <w:color w:val="1E293B"/>
-          <w:sz w:val="18"/>
-          <w:szCs w:val="18"/>
-        </w:rPr>
-        <w:t xml:space="preserve">        VARCHAR name
-</w:t>
-      </w:r>
-    </w:p>
-    <w:p>
-      <w:pPr>
-        <w:spacing w:after="20" w:before="20"/>
-      </w:pPr>
-      <w:r>
-        <w:rPr>
-          <w:rFonts w:ascii="Consolas" w:cs="Consolas" w:eastAsia="Consolas" w:hAnsi="Consolas"/>
-          <w:color w:val="1E293B"/>
-          <w:sz w:val="18"/>
-          <w:szCs w:val="18"/>
-        </w:rPr>
-        <w:t xml:space="preserve">        VARCHAR period
-</w:t>
-      </w:r>
-    </w:p>
-    <w:p>
-      <w:pPr>
-        <w:spacing w:after="20" w:before="20"/>
-      </w:pPr>
-      <w:r>
-        <w:rPr>
-          <w:rFonts w:ascii="Consolas" w:cs="Consolas" w:eastAsia="Consolas" w:hAnsi="Consolas"/>
-          <w:color w:val="1E293B"/>
-          <w:sz w:val="18"/>
-          <w:szCs w:val="18"/>
-        </w:rPr>
-        <w:t xml:space="preserve">        TEXT description
-</w:t>
-      </w:r>
-    </w:p>
-    <w:p>
-      <w:pPr>
-        <w:spacing w:after="20" w:before="20"/>
-      </w:pPr>
-      <w:r>
-        <w:rPr>
-          <w:rFonts w:ascii="Consolas" w:cs="Consolas" w:eastAsia="Consolas" w:hAnsi="Consolas"/>
-          <w:color w:val="1E293B"/>
-          <w:sz w:val="18"/>
-          <w:szCs w:val="18"/>
-        </w:rPr>
-        <w:t xml:space="preserve">        TEXT tech_stack
-</w:t>
-      </w:r>
-    </w:p>
-    <w:p>
-      <w:pPr>
-        <w:spacing w:after="20" w:before="20"/>
-      </w:pPr>
-      <w:r>
-        <w:rPr>
-          <w:rFonts w:ascii="Consolas" w:cs="Consolas" w:eastAsia="Consolas" w:hAnsi="Consolas"/>
-          <w:color w:val="1E293B"/>
-          <w:sz w:val="18"/>
-          <w:szCs w:val="18"/>
-        </w:rPr>
-        <w:t xml:space="preserve">        VARCHAR image_url
-</w:t>
-      </w:r>
-    </w:p>
-    <w:p>
-      <w:pPr>
-        <w:spacing w:after="20" w:before="20"/>
-      </w:pPr>
-      <w:r>
-        <w:rPr>
-          <w:rFonts w:ascii="Consolas" w:cs="Consolas" w:eastAsia="Consolas" w:hAnsi="Consolas"/>
-          <w:color w:val="1E293B"/>
-          <w:sz w:val="18"/>
-          <w:szCs w:val="18"/>
-        </w:rPr>
-        <w:t xml:space="preserve">        VARCHAR demo_url
-</w:t>
-      </w:r>
-    </w:p>
-    <w:p>
-      <w:pPr>
-        <w:spacing w:after="20" w:before="20"/>
-      </w:pPr>
-      <w:r>
-        <w:rPr>
-          <w:rFonts w:ascii="Consolas" w:cs="Consolas" w:eastAsia="Consolas" w:hAnsi="Consolas"/>
-          <w:color w:val="1E293B"/>
-          <w:sz w:val="18"/>
-          <w:szCs w:val="18"/>
-        </w:rPr>
-        <w:t xml:space="preserve">        VARCHAR repo_url
-</w:t>
-      </w:r>
-    </w:p>
-    <w:p>
-      <w:pPr>
-        <w:spacing w:after="20" w:before="20"/>
-      </w:pPr>
-      <w:r>
-        <w:rPr>
-          <w:rFonts w:ascii="Consolas" w:cs="Consolas" w:eastAsia="Consolas" w:hAnsi="Consolas"/>
-          <w:color w:val="1E293B"/>
-          <w:sz w:val="18"/>
-          <w:szCs w:val="18"/>
-        </w:rPr>
-        <w:t xml:space="preserve">        BOOLEAN featured
-</w:t>
-      </w:r>
-    </w:p>
-    <w:p>
-      <w:pPr>
-        <w:spacing w:after="20" w:before="20"/>
-      </w:pPr>
-      <w:r>
-        <w:rPr>
-          <w:rFonts w:ascii="Consolas" w:cs="Consolas" w:eastAsia="Consolas" w:hAnsi="Consolas"/>
-          <w:color w:val="1E293B"/>
-          <w:sz w:val="18"/>
-          <w:szCs w:val="18"/>
-        </w:rPr>
-        <w:t xml:space="preserve">        INT sort_order
-</w:t>
-      </w:r>
-    </w:p>
-    <w:p>
-      <w:pPr>
-        <w:spacing w:after="20" w:before="20"/>
-      </w:pPr>
-      <w:r>
-        <w:rPr>
-          <w:rFonts w:ascii="Consolas" w:cs="Consolas" w:eastAsia="Consolas" w:hAnsi="Consolas"/>
-          <w:color w:val="1E293B"/>
-          <w:sz w:val="18"/>
-          <w:szCs w:val="18"/>
-        </w:rPr>
-        <w:t xml:space="preserve">    }
-</w:t>
-      </w:r>
-    </w:p>
-    <w:p>
-      <w:pPr>
-        <w:spacing w:after="20" w:before="20"/>
-      </w:pPr>
-      <w:r>
-        <w:rPr>
-          <w:rFonts w:ascii="Consolas" w:cs="Consolas" w:eastAsia="Consolas" w:hAnsi="Consolas"/>
-          <w:color w:val="1E293B"/>
-          <w:sz w:val="18"/>
-          <w:szCs w:val="18"/>
-        </w:rPr>
-        <w:t xml:space="preserve">    posts {
-</w:t>
-      </w:r>
-    </w:p>
-    <w:p>
-      <w:pPr>
-        <w:spacing w:after="20" w:before="20"/>
-      </w:pPr>
-      <w:r>
-        <w:rPr>
-          <w:rFonts w:ascii="Consolas" w:cs="Consolas" w:eastAsia="Consolas" w:hAnsi="Consolas"/>
-          <w:color w:val="1E293B"/>
-          <w:sz w:val="18"/>
-          <w:szCs w:val="18"/>
-        </w:rPr>
-        <w:t xml:space="preserve">        BIGINT id PK
-</w:t>
-      </w:r>
-    </w:p>
-    <w:p>
-      <w:pPr>
-        <w:spacing w:after="20" w:before="20"/>
-      </w:pPr>
-      <w:r>
-        <w:rPr>
-          <w:rFonts w:ascii="Consolas" w:cs="Consolas" w:eastAsia="Consolas" w:hAnsi="Consolas"/>
-          <w:color w:val="1E293B"/>
-          <w:sz w:val="18"/>
-          <w:szCs w:val="18"/>
-        </w:rPr>
-        <w:t xml:space="preserve">        VARCHAR title
-</w:t>
-      </w:r>
-    </w:p>
-    <w:p>
-      <w:pPr>
-        <w:spacing w:after="20" w:before="20"/>
-      </w:pPr>
-      <w:r>
-        <w:rPr>
-          <w:rFonts w:ascii="Consolas" w:cs="Consolas" w:eastAsia="Consolas" w:hAnsi="Consolas"/>
-          <w:color w:val="1E293B"/>
-          <w:sz w:val="18"/>
-          <w:szCs w:val="18"/>
-        </w:rPr>
-        <w:t xml:space="preserve">        VARCHAR slug UK
-</w:t>
-      </w:r>
-    </w:p>
-    <w:p>
-      <w:pPr>
-        <w:spacing w:after="20" w:before="20"/>
-      </w:pPr>
-      <w:r>
-        <w:rPr>
-          <w:rFonts w:ascii="Consolas" w:cs="Consolas" w:eastAsia="Consolas" w:hAnsi="Consolas"/>
-          <w:color w:val="1E293B"/>
-          <w:sz w:val="18"/>
-          <w:szCs w:val="18"/>
-        </w:rPr>
-        <w:t xml:space="preserve">        TEXT summary
-</w:t>
-      </w:r>
-    </w:p>
-    <w:p>
-      <w:pPr>
-        <w:spacing w:after="20" w:before="20"/>
-      </w:pPr>
-      <w:r>
-        <w:rPr>
-          <w:rFonts w:ascii="Consolas" w:cs="Consolas" w:eastAsia="Consolas" w:hAnsi="Consolas"/>
-          <w:color w:val="1E293B"/>
-          <w:sz w:val="18"/>
-          <w:szCs w:val="18"/>
-        </w:rPr>
-        <w:t xml:space="preserve">        TEXT content
-</w:t>
-      </w:r>
-    </w:p>
-    <w:p>
-      <w:pPr>
-        <w:spacing w:after="20" w:before="20"/>
-      </w:pPr>
-      <w:r>
-        <w:rPr>
-          <w:rFonts w:ascii="Consolas" w:cs="Consolas" w:eastAsia="Consolas" w:hAnsi="Consolas"/>
-          <w:color w:val="1E293B"/>
-          <w:sz w:val="18"/>
-          <w:szCs w:val="18"/>
-        </w:rPr>
-        <w:t xml:space="preserve">        VARCHAR cover_image_url
-</w:t>
-      </w:r>
-    </w:p>
-    <w:p>
-      <w:pPr>
-        <w:spacing w:after="20" w:before="20"/>
-      </w:pPr>
-      <w:r>
-        <w:rPr>
-          <w:rFonts w:ascii="Consolas" w:cs="Consolas" w:eastAsia="Consolas" w:hAnsi="Consolas"/>
-          <w:color w:val="1E293B"/>
-          <w:sz w:val="18"/>
-          <w:szCs w:val="18"/>
-        </w:rPr>
-        <w:t xml:space="preserve">        VARCHAR tags
-</w:t>
-      </w:r>
-    </w:p>
-    <w:p>
-      <w:pPr>
-        <w:spacing w:after="20" w:before="20"/>
-      </w:pPr>
-      <w:r>
-        <w:rPr>
-          <w:rFonts w:ascii="Consolas" w:cs="Consolas" w:eastAsia="Consolas" w:hAnsi="Consolas"/>
-          <w:color w:val="1E293B"/>
-          <w:sz w:val="18"/>
-          <w:szCs w:val="18"/>
-        </w:rPr>
-        <w:t xml:space="preserve">        BOOLEAN published
-</w:t>
-      </w:r>
-    </w:p>
-    <w:p>
-      <w:pPr>
-        <w:spacing w:after="20" w:before="20"/>
-      </w:pPr>
-      <w:r>
-        <w:rPr>
-          <w:rFonts w:ascii="Consolas" w:cs="Consolas" w:eastAsia="Consolas" w:hAnsi="Consolas"/>
-          <w:color w:val="1E293B"/>
-          <w:sz w:val="18"/>
-          <w:szCs w:val="18"/>
-        </w:rPr>
-        <w:t xml:space="preserve">        INT views_count
-</w:t>
-      </w:r>
-    </w:p>
-    <w:p>
-      <w:pPr>
-        <w:spacing w:after="20" w:before="20"/>
-      </w:pPr>
-      <w:r>
-        <w:rPr>
-          <w:rFonts w:ascii="Consolas" w:cs="Consolas" w:eastAsia="Consolas" w:hAnsi="Consolas"/>
-          <w:color w:val="1E293B"/>
-          <w:sz w:val="18"/>
-          <w:szCs w:val="18"/>
-        </w:rPr>
-        <w:t xml:space="preserve">        INT reading_time_minutes
-</w:t>
-      </w:r>
-    </w:p>
-    <w:p>
-      <w:pPr>
-        <w:spacing w:after="20" w:before="20"/>
-      </w:pPr>
-      <w:r>
-        <w:rPr>
-          <w:rFonts w:ascii="Consolas" w:cs="Consolas" w:eastAsia="Consolas" w:hAnsi="Consolas"/>
-          <w:color w:val="1E293B"/>
-          <w:sz w:val="18"/>
-          <w:szCs w:val="18"/>
-        </w:rPr>
-        <w:t xml:space="preserve">        INT sort_order
-</w:t>
-      </w:r>
-    </w:p>
-    <w:p>
-      <w:pPr>
-        <w:spacing w:after="20" w:before="20"/>
-      </w:pPr>
-      <w:r>
-        <w:rPr>
-          <w:rFonts w:ascii="Consolas" w:cs="Consolas" w:eastAsia="Consolas" w:hAnsi="Consolas"/>
-          <w:color w:val="1E293B"/>
-          <w:sz w:val="18"/>
-          <w:szCs w:val="18"/>
-        </w:rPr>
-        <w:t xml:space="preserve">        TIMESTAMP created_at
-</w:t>
-      </w:r>
-    </w:p>
-    <w:p>
-      <w:pPr>
-        <w:spacing w:after="20" w:before="20"/>
-      </w:pPr>
-      <w:r>
-        <w:rPr>
-          <w:rFonts w:ascii="Consolas" w:cs="Consolas" w:eastAsia="Consolas" w:hAnsi="Consolas"/>
-          <w:color w:val="1E293B"/>
-          <w:sz w:val="18"/>
-          <w:szCs w:val="18"/>
-        </w:rPr>
-        <w:t xml:space="preserve">        TIMESTAMP updated_at
-</w:t>
-      </w:r>
-    </w:p>
-    <w:p>
-      <w:pPr>
-        <w:spacing w:after="20" w:before="20"/>
-      </w:pPr>
-      <w:r>
-        <w:rPr>
-          <w:rFonts w:ascii="Consolas" w:cs="Consolas" w:eastAsia="Consolas" w:hAnsi="Consolas"/>
-          <w:color w:val="1E293B"/>
-          <w:sz w:val="18"/>
-          <w:szCs w:val="18"/>
-        </w:rPr>
-        <w:t xml:space="preserve">    }
-</w:t>
-      </w:r>
-    </w:p>
-    <w:p>
-      <w:pPr>
-        <w:spacing w:after="20" w:before="20"/>
-      </w:pPr>
-      <w:r>
-        <w:rPr>
-          <w:rFonts w:ascii="Consolas" w:cs="Consolas" w:eastAsia="Consolas" w:hAnsi="Consolas"/>
-          <w:color w:val="1E293B"/>
-          <w:sz w:val="18"/>
-          <w:szCs w:val="18"/>
-        </w:rPr>
-        <w:t xml:space="preserve">    contact_messages {
-</w:t>
-      </w:r>
-    </w:p>
-    <w:p>
-      <w:pPr>
-        <w:spacing w:after="20" w:before="20"/>
-      </w:pPr>
-      <w:r>
-        <w:rPr>
-          <w:rFonts w:ascii="Consolas" w:cs="Consolas" w:eastAsia="Consolas" w:hAnsi="Consolas"/>
-          <w:color w:val="1E293B"/>
-          <w:sz w:val="18"/>
-          <w:szCs w:val="18"/>
-        </w:rPr>
-        <w:t xml:space="preserve">        BIGINT id PK
-</w:t>
-      </w:r>
-    </w:p>
-    <w:p>
-      <w:pPr>
-        <w:spacing w:after="20" w:before="20"/>
-      </w:pPr>
-      <w:r>
-        <w:rPr>
-          <w:rFonts w:ascii="Consolas" w:cs="Consolas" w:eastAsia="Consolas" w:hAnsi="Consolas"/>
-          <w:color w:val="1E293B"/>
-          <w:sz w:val="18"/>
-          <w:szCs w:val="18"/>
-        </w:rPr>
-        <w:t xml:space="preserve">        VARCHAR name
-</w:t>
-      </w:r>
-    </w:p>
-    <w:p>
-      <w:pPr>
-        <w:spacing w:after="20" w:before="20"/>
-      </w:pPr>
-      <w:r>
-        <w:rPr>
-          <w:rFonts w:ascii="Consolas" w:cs="Consolas" w:eastAsia="Consolas" w:hAnsi="Consolas"/>
-          <w:color w:val="1E293B"/>
-          <w:sz w:val="18"/>
-          <w:szCs w:val="18"/>
-        </w:rPr>
-        <w:t xml:space="preserve">        VARCHAR email
-</w:t>
-      </w:r>
-    </w:p>
-    <w:p>
-      <w:pPr>
-        <w:spacing w:after="20" w:before="20"/>
-      </w:pPr>
-      <w:r>
-        <w:rPr>
-          <w:rFonts w:ascii="Consolas" w:cs="Consolas" w:eastAsia="Consolas" w:hAnsi="Consolas"/>
-          <w:color w:val="1E293B"/>
-          <w:sz w:val="18"/>
-          <w:szCs w:val="18"/>
-        </w:rPr>
-        <w:t xml:space="preserve">        VARCHAR subject
-</w:t>
-      </w:r>
-    </w:p>
-    <w:p>
-      <w:pPr>
-        <w:spacing w:after="20" w:before="20"/>
-      </w:pPr>
-      <w:r>
-        <w:rPr>
-          <w:rFonts w:ascii="Consolas" w:cs="Consolas" w:eastAsia="Consolas" w:hAnsi="Consolas"/>
-          <w:color w:val="1E293B"/>
-          <w:sz w:val="18"/>
-          <w:szCs w:val="18"/>
-        </w:rPr>
-        <w:t xml:space="preserve">        TEXT message
-</w:t>
-      </w:r>
-    </w:p>
-    <w:p>
-      <w:pPr>
-        <w:spacing w:after="20" w:before="20"/>
-      </w:pPr>
-      <w:r>
-        <w:rPr>
-          <w:rFonts w:ascii="Consolas" w:cs="Consolas" w:eastAsia="Consolas" w:hAnsi="Consolas"/>
-          <w:color w:val="1E293B"/>
-          <w:sz w:val="18"/>
-          <w:szCs w:val="18"/>
-        </w:rPr>
-        <w:t xml:space="preserve">        TIMESTAMP created_at
-</w:t>
-      </w:r>
-    </w:p>
-    <w:p>
-      <w:pPr>
-        <w:spacing w:after="20" w:before="20"/>
-      </w:pPr>
-      <w:r>
-        <w:rPr>
-          <w:rFonts w:ascii="Consolas" w:cs="Consolas" w:eastAsia="Consolas" w:hAnsi="Consolas"/>
-          <w:color w:val="1E293B"/>
-          <w:sz w:val="18"/>
-          <w:szCs w:val="18"/>
-        </w:rPr>
-        <w:t xml:space="preserve">        BOOLEAN is_read
-</w:t>
-      </w:r>
-    </w:p>
-    <w:p>
-      <w:pPr>
-        <w:spacing w:after="20" w:before="20"/>
-      </w:pPr>
-      <w:r>
-        <w:rPr>
-          <w:rFonts w:ascii="Consolas" w:cs="Consolas" w:eastAsia="Consolas" w:hAnsi="Consolas"/>
-          <w:color w:val="1E293B"/>
-          <w:sz w:val="18"/>
-          <w:szCs w:val="18"/>
-        </w:rPr>
-        <w:t xml:space="preserve">    }
-</w:t>
-      </w:r>
-    </w:p>
-    <w:p>
-      <w:pPr>
-        <w:spacing w:after="20" w:before="20"/>
-      </w:pPr>
-      <w:r>
-        <w:rPr>
-          <w:rFonts w:ascii="Consolas" w:cs="Consolas" w:eastAsia="Consolas" w:hAnsi="Consolas"/>
-          <w:color w:val="1E293B"/>
-          <w:sz w:val="18"/>
-          <w:szCs w:val="18"/>
-        </w:rPr>
-        <w:t xml:space="preserve">    analytics_events {
-</w:t>
-      </w:r>
-    </w:p>
-    <w:p>
-      <w:pPr>
-        <w:spacing w:after="20" w:before="20"/>
-      </w:pPr>
-      <w:r>
-        <w:rPr>
-          <w:rFonts w:ascii="Consolas" w:cs="Consolas" w:eastAsia="Consolas" w:hAnsi="Consolas"/>
-          <w:color w:val="1E293B"/>
-          <w:sz w:val="18"/>
-          <w:szCs w:val="18"/>
-        </w:rPr>
-        <w:t xml:space="preserve">        BIGINT id PK
-</w:t>
-      </w:r>
-    </w:p>
-    <w:p>
-      <w:pPr>
-        <w:spacing w:after="20" w:before="20"/>
-      </w:pPr>
-      <w:r>
-        <w:rPr>
-          <w:rFonts w:ascii="Consolas" w:cs="Consolas" w:eastAsia="Consolas" w:hAnsi="Consolas"/>
-          <w:color w:val="1E293B"/>
-          <w:sz w:val="18"/>
-          <w:szCs w:val="18"/>
-        </w:rPr>
-        <w:t xml:space="preserve">        VARCHAR event_type
-</w:t>
-      </w:r>
-    </w:p>
-    <w:p>
-      <w:pPr>
-        <w:spacing w:after="20" w:before="20"/>
-      </w:pPr>
-      <w:r>
-        <w:rPr>
-          <w:rFonts w:ascii="Consolas" w:cs="Consolas" w:eastAsia="Consolas" w:hAnsi="Consolas"/>
-          <w:color w:val="1E293B"/>
-          <w:sz w:val="18"/>
-          <w:szCs w:val="18"/>
-        </w:rPr>
-        <w:t xml:space="preserve">        VARCHAR path
-</w:t>
-      </w:r>
-    </w:p>
-    <w:p>
-      <w:pPr>
-        <w:spacing w:after="20" w:before="20"/>
-      </w:pPr>
-      <w:r>
-        <w:rPr>
-          <w:rFonts w:ascii="Consolas" w:cs="Consolas" w:eastAsia="Consolas" w:hAnsi="Consolas"/>
-          <w:color w:val="1E293B"/>
-          <w:sz w:val="18"/>
-          <w:szCs w:val="18"/>
-        </w:rPr>
-        <w:t xml:space="preserve">        VARCHAR referrer
-</w:t>
-      </w:r>
-    </w:p>
-    <w:p>
-      <w:pPr>
-        <w:spacing w:after="20" w:before="20"/>
-      </w:pPr>
-      <w:r>
-        <w:rPr>
-          <w:rFonts w:ascii="Consolas" w:cs="Consolas" w:eastAsia="Consolas" w:hAnsi="Consolas"/>
-          <w:color w:val="1E293B"/>
-          <w:sz w:val="18"/>
-          <w:szCs w:val="18"/>
-        </w:rPr>
-        <w:t xml:space="preserve">        VARCHAR ip_hash
-</w:t>
-      </w:r>
-    </w:p>
-    <w:p>
-      <w:pPr>
-        <w:spacing w:after="20" w:before="20"/>
-      </w:pPr>
-      <w:r>
-        <w:rPr>
-          <w:rFonts w:ascii="Consolas" w:cs="Consolas" w:eastAsia="Consolas" w:hAnsi="Consolas"/>
-          <w:color w:val="1E293B"/>
-          <w:sz w:val="18"/>
-          <w:szCs w:val="18"/>
-        </w:rPr>
-        <w:t xml:space="preserve">        VARCHAR device_type
-</w:t>
-      </w:r>
-    </w:p>
-    <w:p>
-      <w:pPr>
-        <w:spacing w:after="20" w:before="20"/>
-      </w:pPr>
-      <w:r>
-        <w:rPr>
-          <w:rFonts w:ascii="Consolas" w:cs="Consolas" w:eastAsia="Consolas" w:hAnsi="Consolas"/>
-          <w:color w:val="1E293B"/>
-          <w:sz w:val="18"/>
-          <w:szCs w:val="18"/>
-        </w:rPr>
-        <w:t xml:space="preserve">        TIMESTAMP created_at
-</w:t>
-      </w:r>
-    </w:p>
-    <w:p>
-      <w:pPr>
-        <w:spacing w:after="20" w:before="20"/>
-      </w:pPr>
-      <w:r>
-        <w:rPr>
-          <w:rFonts w:ascii="Consolas" w:cs="Consolas" w:eastAsia="Consolas" w:hAnsi="Consolas"/>
-          <w:color w:val="1E293B"/>
-          <w:sz w:val="18"/>
-          <w:szCs w:val="18"/>
-        </w:rPr>
-        <w:t xml:space="preserve">    }
-</w:t>
-      </w:r>
-    </w:p>
-    <w:p>
-      <w:pPr>
-        <w:spacing w:after="20" w:before="20"/>
-      </w:pPr>
-      <w:r>
-        <w:rPr>
-          <w:rFonts w:ascii="Consolas" w:cs="Consolas" w:eastAsia="Consolas" w:hAnsi="Consolas"/>
-          <w:color w:val="1E293B"/>
-          <w:sz w:val="18"/>
-          <w:szCs w:val="18"/>
-        </w:rPr>
-        <w:t xml:space="preserve">    users {
-</w:t>
-      </w:r>
-    </w:p>
-    <w:p>
-      <w:pPr>
-        <w:spacing w:after="20" w:before="20"/>
-      </w:pPr>
-      <w:r>
-        <w:rPr>
-          <w:rFonts w:ascii="Consolas" w:cs="Consolas" w:eastAsia="Consolas" w:hAnsi="Consolas"/>
-          <w:color w:val="1E293B"/>
-          <w:sz w:val="18"/>
-          <w:szCs w:val="18"/>
-        </w:rPr>
-        <w:t xml:space="preserve">        BIGINT id PK
-</w:t>
-      </w:r>
-    </w:p>
-    <w:p>
-      <w:pPr>
-        <w:spacing w:after="20" w:before="20"/>
-      </w:pPr>
-      <w:r>
-        <w:rPr>
-          <w:rFonts w:ascii="Consolas" w:cs="Consolas" w:eastAsia="Consolas" w:hAnsi="Consolas"/>
-          <w:color w:val="1E293B"/>
-          <w:sz w:val="18"/>
-          <w:szCs w:val="18"/>
-        </w:rPr>
-        <w:t xml:space="preserve">        VARCHAR email UK
-</w:t>
-      </w:r>
-    </w:p>
-    <w:p>
-      <w:pPr>
-        <w:spacing w:after="20" w:before="20"/>
-      </w:pPr>
-      <w:r>
-        <w:rPr>
-          <w:rFonts w:ascii="Consolas" w:cs="Consolas" w:eastAsia="Consolas" w:hAnsi="Consolas"/>
-          <w:color w:val="1E293B"/>
-          <w:sz w:val="18"/>
-          <w:szCs w:val="18"/>
-        </w:rPr>
-        <w:t xml:space="preserve">        VARCHAR password_hash
-</w:t>
-      </w:r>
-    </w:p>
-    <w:p>
-      <w:pPr>
-        <w:spacing w:after="20" w:before="20"/>
-      </w:pPr>
-      <w:r>
-        <w:rPr>
-          <w:rFonts w:ascii="Consolas" w:cs="Consolas" w:eastAsia="Consolas" w:hAnsi="Consolas"/>
-          <w:color w:val="1E293B"/>
-          <w:sz w:val="18"/>
-          <w:szCs w:val="18"/>
-        </w:rPr>
-        <w:t xml:space="preserve">        VARCHAR role
-</w:t>
-      </w:r>
-    </w:p>
-    <w:p>
-      <w:pPr>
-        <w:spacing w:after="20" w:before="20"/>
-      </w:pPr>
-      <w:r>
-        <w:rPr>
-          <w:rFonts w:ascii="Consolas" w:cs="Consolas" w:eastAsia="Consolas" w:hAnsi="Consolas"/>
-          <w:color w:val="1E293B"/>
-          <w:sz w:val="18"/>
-          <w:szCs w:val="18"/>
-        </w:rPr>
-        <w:t xml:space="preserve">        INT failed_attempts
-</w:t>
-      </w:r>
-    </w:p>
-    <w:p>
-      <w:pPr>
-        <w:spacing w:after="20" w:before="20"/>
-      </w:pPr>
-      <w:r>
-        <w:rPr>
-          <w:rFonts w:ascii="Consolas" w:cs="Consolas" w:eastAsia="Consolas" w:hAnsi="Consolas"/>
-          <w:color w:val="1E293B"/>
-          <w:sz w:val="18"/>
-          <w:szCs w:val="18"/>
-        </w:rPr>
-        <w:t xml:space="preserve">        TIMESTAMP locked_until
-</w:t>
-      </w:r>
-    </w:p>
-    <w:p>
-      <w:pPr>
-        <w:spacing w:after="20" w:before="20"/>
-      </w:pPr>
-      <w:r>
-        <w:rPr>
-          <w:rFonts w:ascii="Consolas" w:cs="Consolas" w:eastAsia="Consolas" w:hAnsi="Consolas"/>
-          <w:color w:val="1E293B"/>
-          <w:sz w:val="18"/>
-          <w:szCs w:val="18"/>
-        </w:rPr>
-        <w:t xml:space="preserve">    }
-</w:t>
-      </w:r>
-    </w:p>
-    <w:p>
-      <w:pPr>
-        <w:spacing w:after="20" w:before="20"/>
-      </w:pPr>
-      <w:r>
-        <w:rPr>
-          <w:rFonts w:ascii="Consolas" w:cs="Consolas" w:eastAsia="Consolas" w:hAnsi="Consolas"/>
-          <w:color w:val="1E293B"/>
-          <w:sz w:val="18"/>
-          <w:szCs w:val="18"/>
-        </w:rPr>
-        <w:t xml:space="preserve">    refresh_tokens {
-</w:t>
-      </w:r>
-    </w:p>
-    <w:p>
-      <w:pPr>
-        <w:spacing w:after="20" w:before="20"/>
-      </w:pPr>
-      <w:r>
-        <w:rPr>
-          <w:rFonts w:ascii="Consolas" w:cs="Consolas" w:eastAsia="Consolas" w:hAnsi="Consolas"/>
-          <w:color w:val="1E293B"/>
-          <w:sz w:val="18"/>
-          <w:szCs w:val="18"/>
-        </w:rPr>
-        <w:t xml:space="preserve">        BIGINT id PK
-</w:t>
-      </w:r>
-    </w:p>
-    <w:p>
-      <w:pPr>
-        <w:spacing w:after="20" w:before="20"/>
-      </w:pPr>
-      <w:r>
-        <w:rPr>
-          <w:rFonts w:ascii="Consolas" w:cs="Consolas" w:eastAsia="Consolas" w:hAnsi="Consolas"/>
-          <w:color w:val="1E293B"/>
-          <w:sz w:val="18"/>
-          <w:szCs w:val="18"/>
-        </w:rPr>
-        <w:t xml:space="preserve">        BIGINT user_id FK
-</w:t>
-      </w:r>
-    </w:p>
-    <w:p>
-      <w:pPr>
-        <w:spacing w:after="20" w:before="20"/>
-      </w:pPr>
-      <w:r>
-        <w:rPr>
-          <w:rFonts w:ascii="Consolas" w:cs="Consolas" w:eastAsia="Consolas" w:hAnsi="Consolas"/>
-          <w:color w:val="1E293B"/>
-          <w:sz w:val="18"/>
-          <w:szCs w:val="18"/>
-        </w:rPr>
-        <w:t xml:space="preserve">        VARCHAR token_hash UK
-</w:t>
-      </w:r>
-    </w:p>
-    <w:p>
-      <w:pPr>
-        <w:spacing w:after="20" w:before="20"/>
-      </w:pPr>
-      <w:r>
-        <w:rPr>
-          <w:rFonts w:ascii="Consolas" w:cs="Consolas" w:eastAsia="Consolas" w:hAnsi="Consolas"/>
-          <w:color w:val="1E293B"/>
-          <w:sz w:val="18"/>
-          <w:szCs w:val="18"/>
-        </w:rPr>
-        <w:t xml:space="preserve">        TIMESTAMP expires_at
-</w:t>
-      </w:r>
-    </w:p>
-    <w:p>
-      <w:pPr>
-        <w:spacing w:after="20" w:before="20"/>
-      </w:pPr>
-      <w:r>
-        <w:rPr>
-          <w:rFonts w:ascii="Consolas" w:cs="Consolas" w:eastAsia="Consolas" w:hAnsi="Consolas"/>
-          <w:color w:val="1E293B"/>
-          <w:sz w:val="18"/>
-          <w:szCs w:val="18"/>
-        </w:rPr>
-        <w:t xml:space="preserve">        BOOLEAN revoked
-</w:t>
-      </w:r>
-    </w:p>
-    <w:p>
-      <w:pPr>
-        <w:spacing w:after="20" w:before="20"/>
-      </w:pPr>
-      <w:r>
-        <w:rPr>
-          <w:rFonts w:ascii="Consolas" w:cs="Consolas" w:eastAsia="Consolas" w:hAnsi="Consolas"/>
-          <w:color w:val="1E293B"/>
-          <w:sz w:val="18"/>
-          <w:szCs w:val="18"/>
-        </w:rPr>
-        <w:t xml:space="preserve">        TIMESTAMP created_at
-</w:t>
-      </w:r>
-    </w:p>
-    <w:p>
-      <w:pPr>
-        <w:spacing w:after="20" w:before="20"/>
-      </w:pPr>
-      <w:r>
-        <w:rPr>
-          <w:rFonts w:ascii="Consolas" w:cs="Consolas" w:eastAsia="Consolas" w:hAnsi="Consolas"/>
-          <w:color w:val="1E293B"/>
-          <w:sz w:val="18"/>
-          <w:szCs w:val="18"/>
-        </w:rPr>
-        <w:t xml:space="preserve">    }
-</w:t>
+        <w:t xml:space="preserve">Hình: Sơ đồ thực thể liên kết ERD</w:t>
       </w:r>
     </w:p>
     <w:p>

</xml_diff>

<commit_message>
docs: improve diagram readability with high-res rendering and detailed breakdown tables
</commit_message>
<xml_diff>
--- a/docs/SRS_Portfolio_TranVuThien.docx
+++ b/docs/SRS_Portfolio_TranVuThien.docx
@@ -3010,7 +3010,7 @@
       <w:r>
         <w:drawing>
           <wp:inline distT="0" distB="0" distL="0" distR="0">
-            <wp:extent cx="5334000" cy="590550"/>
+            <wp:extent cx="5429250" cy="847725"/>
             <wp:effectExtent t="0" r="0" b="0" l="0"/>
             <wp:docPr id="1" name="" descr="" title=""/>
             <wp:cNvGraphicFramePr>
@@ -3035,7 +3035,7 @@
                   <pic:spPr bwMode="auto">
                     <a:xfrm>
                       <a:off x="0" y="0"/>
-                      <a:ext cx="5334000" cy="590550"/>
+                      <a:ext cx="5429250" cy="847725"/>
                     </a:xfrm>
                     <a:prstGeom prst="rect">
                       <a:avLst/>
@@ -3067,7 +3067,1930 @@
     </w:p>
     <w:p>
       <w:pPr>
-        <w:spacing w:after="120"/>
+        <w:pStyle w:val="Heading3"/>
+        <w:spacing w:after="80" w:before="180"/>
+      </w:pPr>
+      <w:r>
+        <w:rPr>
+          <w:rFonts w:ascii="Arial" w:cs="Arial" w:eastAsia="Arial" w:hAnsi="Arial"/>
+          <w:b/>
+          <w:bCs/>
+          <w:color w:val="334155"/>
+          <w:sz w:val="22"/>
+          <w:szCs w:val="22"/>
+        </w:rPr>
+        <w:t xml:space="preserve">Bảng 2.2: Bảng phân rã chi tiết các phân hệ chức năng</w:t>
+      </w:r>
+    </w:p>
+    <w:tbl>
+      <w:tblPr>
+        <w:tblW w:type="dxa" w:w="9360"/>
+        <w:tblBorders>
+          <w:top w:val="single" w:color="auto" w:sz="4"/>
+          <w:left w:val="single" w:color="auto" w:sz="4"/>
+          <w:bottom w:val="single" w:color="auto" w:sz="4"/>
+          <w:right w:val="single" w:color="auto" w:sz="4"/>
+          <w:insideH w:val="single" w:color="auto" w:sz="4"/>
+          <w:insideV w:val="single" w:color="auto" w:sz="4"/>
+        </w:tblBorders>
+      </w:tblPr>
+      <w:tblGrid>
+        <w:gridCol w:w="1800"/>
+        <w:gridCol w:w="1800"/>
+        <w:gridCol w:w="2200"/>
+        <w:gridCol w:w="3560"/>
+      </w:tblGrid>
+      <w:tr>
+        <w:trPr>
+          <w:tblHeader/>
+        </w:trPr>
+        <w:tc>
+          <w:tcPr>
+            <w:tcW w:type="dxa" w:w="1800"/>
+            <w:tcBorders>
+              <w:top w:val="single" w:color="CBD5E1" w:sz="4"/>
+              <w:left w:val="single" w:color="CBD5E1" w:sz="4"/>
+              <w:bottom w:val="single" w:color="CBD5E1" w:sz="4"/>
+              <w:right w:val="single" w:color="CBD5E1" w:sz="4"/>
+            </w:tcBorders>
+            <w:shd w:fill="1E3A8A" w:color="auto" w:val="solid"/>
+            <w:tcMar>
+              <w:top w:type="dxa" w:w="100"/>
+              <w:left w:type="dxa" w:w="140"/>
+              <w:bottom w:type="dxa" w:w="100"/>
+              <w:right w:type="dxa" w:w="140"/>
+            </w:tcMar>
+          </w:tcPr>
+          <w:p>
+            <w:pPr>
+              <w:spacing w:after="40" w:before="40"/>
+            </w:pPr>
+            <w:r>
+              <w:rPr>
+                <w:rFonts w:ascii="Arial" w:cs="Arial" w:eastAsia="Arial" w:hAnsi="Arial"/>
+                <w:b/>
+                <w:bCs/>
+                <w:color w:val="FFFFFF"/>
+                <w:sz w:val="19"/>
+                <w:szCs w:val="19"/>
+              </w:rPr>
+              <w:t xml:space="preserve">Phân hệ chính</w:t>
+            </w:r>
+          </w:p>
+        </w:tc>
+        <w:tc>
+          <w:tcPr>
+            <w:tcW w:type="dxa" w:w="1800"/>
+            <w:tcBorders>
+              <w:top w:val="single" w:color="CBD5E1" w:sz="4"/>
+              <w:left w:val="single" w:color="CBD5E1" w:sz="4"/>
+              <w:bottom w:val="single" w:color="CBD5E1" w:sz="4"/>
+              <w:right w:val="single" w:color="CBD5E1" w:sz="4"/>
+            </w:tcBorders>
+            <w:shd w:fill="1E3A8A" w:color="auto" w:val="solid"/>
+            <w:tcMar>
+              <w:top w:type="dxa" w:w="100"/>
+              <w:left w:type="dxa" w:w="140"/>
+              <w:bottom w:type="dxa" w:w="100"/>
+              <w:right w:type="dxa" w:w="140"/>
+            </w:tcMar>
+          </w:tcPr>
+          <w:p>
+            <w:pPr>
+              <w:spacing w:after="40" w:before="40"/>
+            </w:pPr>
+            <w:r>
+              <w:rPr>
+                <w:rFonts w:ascii="Arial" w:cs="Arial" w:eastAsia="Arial" w:hAnsi="Arial"/>
+                <w:b/>
+                <w:bCs/>
+                <w:color w:val="FFFFFF"/>
+                <w:sz w:val="19"/>
+                <w:szCs w:val="19"/>
+              </w:rPr>
+              <w:t xml:space="preserve">Thành phần / Chức năng con</w:t>
+            </w:r>
+          </w:p>
+        </w:tc>
+        <w:tc>
+          <w:tcPr>
+            <w:tcW w:type="dxa" w:w="2200"/>
+            <w:tcBorders>
+              <w:top w:val="single" w:color="CBD5E1" w:sz="4"/>
+              <w:left w:val="single" w:color="CBD5E1" w:sz="4"/>
+              <w:bottom w:val="single" w:color="CBD5E1" w:sz="4"/>
+              <w:right w:val="single" w:color="CBD5E1" w:sz="4"/>
+            </w:tcBorders>
+            <w:shd w:fill="1E3A8A" w:color="auto" w:val="solid"/>
+            <w:tcMar>
+              <w:top w:type="dxa" w:w="100"/>
+              <w:left w:type="dxa" w:w="140"/>
+              <w:bottom w:type="dxa" w:w="100"/>
+              <w:right w:type="dxa" w:w="140"/>
+            </w:tcMar>
+          </w:tcPr>
+          <w:p>
+            <w:pPr>
+              <w:spacing w:after="40" w:before="40"/>
+            </w:pPr>
+            <w:r>
+              <w:rPr>
+                <w:rFonts w:ascii="Arial" w:cs="Arial" w:eastAsia="Arial" w:hAnsi="Arial"/>
+                <w:b/>
+                <w:bCs/>
+                <w:color w:val="FFFFFF"/>
+                <w:sz w:val="19"/>
+                <w:szCs w:val="19"/>
+              </w:rPr>
+              <w:t xml:space="preserve">Công nghệ chủ đạo</w:t>
+            </w:r>
+          </w:p>
+        </w:tc>
+        <w:tc>
+          <w:tcPr>
+            <w:tcW w:type="dxa" w:w="3560"/>
+            <w:tcBorders>
+              <w:top w:val="single" w:color="CBD5E1" w:sz="4"/>
+              <w:left w:val="single" w:color="CBD5E1" w:sz="4"/>
+              <w:bottom w:val="single" w:color="CBD5E1" w:sz="4"/>
+              <w:right w:val="single" w:color="CBD5E1" w:sz="4"/>
+            </w:tcBorders>
+            <w:shd w:fill="1E3A8A" w:color="auto" w:val="solid"/>
+            <w:tcMar>
+              <w:top w:type="dxa" w:w="100"/>
+              <w:left w:type="dxa" w:w="140"/>
+              <w:bottom w:type="dxa" w:w="100"/>
+              <w:right w:type="dxa" w:w="140"/>
+            </w:tcMar>
+          </w:tcPr>
+          <w:p>
+            <w:pPr>
+              <w:spacing w:after="40" w:before="40"/>
+            </w:pPr>
+            <w:r>
+              <w:rPr>
+                <w:rFonts w:ascii="Arial" w:cs="Arial" w:eastAsia="Arial" w:hAnsi="Arial"/>
+                <w:b/>
+                <w:bCs/>
+                <w:color w:val="FFFFFF"/>
+                <w:sz w:val="19"/>
+                <w:szCs w:val="19"/>
+              </w:rPr>
+              <w:t xml:space="preserve">Trách nhiệm &amp; Mô tả hoạt động</w:t>
+            </w:r>
+          </w:p>
+        </w:tc>
+      </w:tr>
+      <w:tr>
+        <w:tc>
+          <w:tcPr>
+            <w:tcW w:type="dxa" w:w="1800"/>
+            <w:tcBorders>
+              <w:top w:val="single" w:color="CBD5E1" w:sz="4"/>
+              <w:left w:val="single" w:color="CBD5E1" w:sz="4"/>
+              <w:bottom w:val="single" w:color="CBD5E1" w:sz="4"/>
+              <w:right w:val="single" w:color="CBD5E1" w:sz="4"/>
+            </w:tcBorders>
+            <w:tcMar>
+              <w:top w:type="dxa" w:w="100"/>
+              <w:left w:type="dxa" w:w="140"/>
+              <w:bottom w:type="dxa" w:w="100"/>
+              <w:right w:type="dxa" w:w="140"/>
+            </w:tcMar>
+          </w:tcPr>
+          <w:p>
+            <w:pPr>
+              <w:spacing w:after="20" w:before="40"/>
+            </w:pPr>
+            <w:r>
+              <w:rPr>
+                <w:rFonts w:ascii="Arial" w:cs="Arial" w:eastAsia="Arial" w:hAnsi="Arial"/>
+                <w:b/>
+                <w:bCs/>
+                <w:color w:val="1F2937"/>
+                <w:sz w:val="19"/>
+                <w:szCs w:val="19"/>
+              </w:rPr>
+              <w:t xml:space="preserve">1. Public Web</w:t>
+            </w:r>
+          </w:p>
+          <w:p>
+            <w:pPr>
+              <w:spacing w:after="40" w:before="20"/>
+            </w:pPr>
+            <w:r>
+              <w:rPr>
+                <w:rFonts w:ascii="Arial" w:cs="Arial" w:eastAsia="Arial" w:hAnsi="Arial"/>
+                <w:b w:val="false"/>
+                <w:bCs w:val="false"/>
+                <w:color w:val="1F2937"/>
+                <w:sz w:val="19"/>
+                <w:szCs w:val="19"/>
+              </w:rPr>
+              <w:t xml:space="preserve">*(Frontend SPA)*</w:t>
+            </w:r>
+          </w:p>
+        </w:tc>
+        <w:tc>
+          <w:tcPr>
+            <w:tcW w:type="dxa" w:w="1800"/>
+            <w:tcBorders>
+              <w:top w:val="single" w:color="CBD5E1" w:sz="4"/>
+              <w:left w:val="single" w:color="CBD5E1" w:sz="4"/>
+              <w:bottom w:val="single" w:color="CBD5E1" w:sz="4"/>
+              <w:right w:val="single" w:color="CBD5E1" w:sz="4"/>
+            </w:tcBorders>
+            <w:tcMar>
+              <w:top w:type="dxa" w:w="100"/>
+              <w:left w:type="dxa" w:w="140"/>
+              <w:bottom w:type="dxa" w:w="100"/>
+              <w:right w:type="dxa" w:w="140"/>
+            </w:tcMar>
+          </w:tcPr>
+          <w:p>
+            <w:pPr>
+              <w:spacing w:after="40" w:before="40"/>
+            </w:pPr>
+            <w:r>
+              <w:rPr>
+                <w:rFonts w:ascii="Arial" w:cs="Arial" w:eastAsia="Arial" w:hAnsi="Arial"/>
+                <w:b/>
+                <w:bCs/>
+                <w:color w:val="1F2937"/>
+                <w:sz w:val="19"/>
+                <w:szCs w:val="19"/>
+              </w:rPr>
+              <w:t xml:space="preserve">Trang chủ tương tác</w:t>
+            </w:r>
+          </w:p>
+        </w:tc>
+        <w:tc>
+          <w:tcPr>
+            <w:tcW w:type="dxa" w:w="2200"/>
+            <w:tcBorders>
+              <w:top w:val="single" w:color="CBD5E1" w:sz="4"/>
+              <w:left w:val="single" w:color="CBD5E1" w:sz="4"/>
+              <w:bottom w:val="single" w:color="CBD5E1" w:sz="4"/>
+              <w:right w:val="single" w:color="CBD5E1" w:sz="4"/>
+            </w:tcBorders>
+            <w:tcMar>
+              <w:top w:type="dxa" w:w="100"/>
+              <w:left w:type="dxa" w:w="140"/>
+              <w:bottom w:type="dxa" w:w="100"/>
+              <w:right w:type="dxa" w:w="140"/>
+            </w:tcMar>
+          </w:tcPr>
+          <w:p>
+            <w:pPr>
+              <w:spacing w:after="40" w:before="40"/>
+            </w:pPr>
+            <w:r>
+              <w:rPr>
+                <w:rFonts w:ascii="Arial" w:cs="Arial" w:eastAsia="Arial" w:hAnsi="Arial"/>
+                <w:b w:val="false"/>
+                <w:bCs w:val="false"/>
+                <w:color w:val="1F2937"/>
+                <w:sz w:val="19"/>
+                <w:szCs w:val="19"/>
+              </w:rPr>
+              <w:t xml:space="preserve">Angular 20, TailwindCSS, three.js</w:t>
+            </w:r>
+          </w:p>
+        </w:tc>
+        <w:tc>
+          <w:tcPr>
+            <w:tcW w:type="dxa" w:w="3560"/>
+            <w:tcBorders>
+              <w:top w:val="single" w:color="CBD5E1" w:sz="4"/>
+              <w:left w:val="single" w:color="CBD5E1" w:sz="4"/>
+              <w:bottom w:val="single" w:color="CBD5E1" w:sz="4"/>
+              <w:right w:val="single" w:color="CBD5E1" w:sz="4"/>
+            </w:tcBorders>
+            <w:tcMar>
+              <w:top w:type="dxa" w:w="100"/>
+              <w:left w:type="dxa" w:w="140"/>
+              <w:bottom w:type="dxa" w:w="100"/>
+              <w:right w:type="dxa" w:w="140"/>
+            </w:tcMar>
+          </w:tcPr>
+          <w:p>
+            <w:pPr>
+              <w:spacing w:after="40" w:before="40"/>
+            </w:pPr>
+            <w:r>
+              <w:rPr>
+                <w:rFonts w:ascii="Arial" w:cs="Arial" w:eastAsia="Arial" w:hAnsi="Arial"/>
+                <w:b w:val="false"/>
+                <w:bCs w:val="false"/>
+                <w:color w:val="1F2937"/>
+                <w:sz w:val="19"/>
+                <w:szCs w:val="19"/>
+              </w:rPr>
+              <w:t xml:space="preserve">Hiển thị Hero 3D, About, kỹ năng với thanh đo %, timeline kinh nghiệm trượt 2 bên, lưới dự án kèm bộ lọc công nghệ.</w:t>
+            </w:r>
+          </w:p>
+        </w:tc>
+      </w:tr>
+      <w:tr>
+        <w:tc>
+          <w:tcPr>
+            <w:tcW w:type="dxa" w:w="1800"/>
+            <w:tcBorders>
+              <w:top w:val="single" w:color="CBD5E1" w:sz="4"/>
+              <w:left w:val="single" w:color="CBD5E1" w:sz="4"/>
+              <w:bottom w:val="single" w:color="CBD5E1" w:sz="4"/>
+              <w:right w:val="single" w:color="CBD5E1" w:sz="4"/>
+            </w:tcBorders>
+            <w:tcMar>
+              <w:top w:type="dxa" w:w="100"/>
+              <w:left w:type="dxa" w:w="140"/>
+              <w:bottom w:type="dxa" w:w="100"/>
+              <w:right w:type="dxa" w:w="140"/>
+            </w:tcMar>
+          </w:tcPr>
+          <w:p>
+            <w:r>
+              <w:t xml:space="preserve"/>
+            </w:r>
+          </w:p>
+        </w:tc>
+        <w:tc>
+          <w:tcPr>
+            <w:tcW w:type="dxa" w:w="1800"/>
+            <w:tcBorders>
+              <w:top w:val="single" w:color="CBD5E1" w:sz="4"/>
+              <w:left w:val="single" w:color="CBD5E1" w:sz="4"/>
+              <w:bottom w:val="single" w:color="CBD5E1" w:sz="4"/>
+              <w:right w:val="single" w:color="CBD5E1" w:sz="4"/>
+            </w:tcBorders>
+            <w:tcMar>
+              <w:top w:type="dxa" w:w="100"/>
+              <w:left w:type="dxa" w:w="140"/>
+              <w:bottom w:type="dxa" w:w="100"/>
+              <w:right w:type="dxa" w:w="140"/>
+            </w:tcMar>
+          </w:tcPr>
+          <w:p>
+            <w:pPr>
+              <w:spacing w:after="40" w:before="40"/>
+            </w:pPr>
+            <w:r>
+              <w:rPr>
+                <w:rFonts w:ascii="Arial" w:cs="Arial" w:eastAsia="Arial" w:hAnsi="Arial"/>
+                <w:b/>
+                <w:bCs/>
+                <w:color w:val="1F2937"/>
+                <w:sz w:val="19"/>
+                <w:szCs w:val="19"/>
+              </w:rPr>
+              <w:t xml:space="preserve">Technical Blog</w:t>
+            </w:r>
+          </w:p>
+        </w:tc>
+        <w:tc>
+          <w:tcPr>
+            <w:tcW w:type="dxa" w:w="2200"/>
+            <w:tcBorders>
+              <w:top w:val="single" w:color="CBD5E1" w:sz="4"/>
+              <w:left w:val="single" w:color="CBD5E1" w:sz="4"/>
+              <w:bottom w:val="single" w:color="CBD5E1" w:sz="4"/>
+              <w:right w:val="single" w:color="CBD5E1" w:sz="4"/>
+            </w:tcBorders>
+            <w:tcMar>
+              <w:top w:type="dxa" w:w="100"/>
+              <w:left w:type="dxa" w:w="140"/>
+              <w:bottom w:type="dxa" w:w="100"/>
+              <w:right w:type="dxa" w:w="140"/>
+            </w:tcMar>
+          </w:tcPr>
+          <w:p>
+            <w:pPr>
+              <w:spacing w:after="40" w:before="40"/>
+            </w:pPr>
+            <w:r>
+              <w:rPr>
+                <w:rFonts w:ascii="Arial" w:cs="Arial" w:eastAsia="Arial" w:hAnsi="Arial"/>
+                <w:b w:val="false"/>
+                <w:bCs w:val="false"/>
+                <w:color w:val="1F2937"/>
+                <w:sz w:val="19"/>
+                <w:szCs w:val="19"/>
+              </w:rPr>
+              <w:t xml:space="preserve">Angular, Markdown Renderer</w:t>
+            </w:r>
+          </w:p>
+        </w:tc>
+        <w:tc>
+          <w:tcPr>
+            <w:tcW w:type="dxa" w:w="3560"/>
+            <w:tcBorders>
+              <w:top w:val="single" w:color="CBD5E1" w:sz="4"/>
+              <w:left w:val="single" w:color="CBD5E1" w:sz="4"/>
+              <w:bottom w:val="single" w:color="CBD5E1" w:sz="4"/>
+              <w:right w:val="single" w:color="CBD5E1" w:sz="4"/>
+            </w:tcBorders>
+            <w:tcMar>
+              <w:top w:type="dxa" w:w="100"/>
+              <w:left w:type="dxa" w:w="140"/>
+              <w:bottom w:type="dxa" w:w="100"/>
+              <w:right w:type="dxa" w:w="140"/>
+            </w:tcMar>
+          </w:tcPr>
+          <w:p>
+            <w:pPr>
+              <w:spacing w:after="40" w:before="40"/>
+            </w:pPr>
+            <w:r>
+              <w:rPr>
+                <w:rFonts w:ascii="Arial" w:cs="Arial" w:eastAsia="Arial" w:hAnsi="Arial"/>
+                <w:b w:val="false"/>
+                <w:bCs w:val="false"/>
+                <w:color w:val="1F2937"/>
+                <w:sz w:val="19"/>
+                <w:szCs w:val="19"/>
+              </w:rPr>
+              <w:t xml:space="preserve">Danh sách bài viết </w:t>
+            </w:r>
+            <w:r>
+              <w:rPr>
+                <w:rFonts w:ascii="Consolas" w:cs="Consolas" w:eastAsia="Consolas" w:hAnsi="Consolas"/>
+                <w:color w:val="0F172A"/>
+                <w:sz w:val="17"/>
+                <w:szCs w:val="17"/>
+                <w:shd w:fill="F1F5F9" w:color="auto" w:val="solid"/>
+              </w:rPr>
+              <w:t xml:space="preserve">/blog</w:t>
+            </w:r>
+            <w:r>
+              <w:rPr>
+                <w:rFonts w:ascii="Arial" w:cs="Arial" w:eastAsia="Arial" w:hAnsi="Arial"/>
+                <w:b w:val="false"/>
+                <w:bCs w:val="false"/>
+                <w:color w:val="1F2937"/>
+                <w:sz w:val="19"/>
+                <w:szCs w:val="19"/>
+              </w:rPr>
+              <w:t xml:space="preserve">, đọc chi tiết bài viết </w:t>
+            </w:r>
+            <w:r>
+              <w:rPr>
+                <w:rFonts w:ascii="Consolas" w:cs="Consolas" w:eastAsia="Consolas" w:hAnsi="Consolas"/>
+                <w:color w:val="0F172A"/>
+                <w:sz w:val="17"/>
+                <w:szCs w:val="17"/>
+                <w:shd w:fill="F1F5F9" w:color="auto" w:val="solid"/>
+              </w:rPr>
+              <w:t xml:space="preserve">/blog/:slug</w:t>
+            </w:r>
+            <w:r>
+              <w:rPr>
+                <w:rFonts w:ascii="Arial" w:cs="Arial" w:eastAsia="Arial" w:hAnsi="Arial"/>
+                <w:b w:val="false"/>
+                <w:bCs w:val="false"/>
+                <w:color w:val="1F2937"/>
+                <w:sz w:val="19"/>
+                <w:szCs w:val="19"/>
+              </w:rPr>
+              <w:t xml:space="preserve">, syntax highlight cho code block, bộ đếm lượt xem.</w:t>
+            </w:r>
+          </w:p>
+        </w:tc>
+      </w:tr>
+      <w:tr>
+        <w:tc>
+          <w:tcPr>
+            <w:tcW w:type="dxa" w:w="1800"/>
+            <w:tcBorders>
+              <w:top w:val="single" w:color="CBD5E1" w:sz="4"/>
+              <w:left w:val="single" w:color="CBD5E1" w:sz="4"/>
+              <w:bottom w:val="single" w:color="CBD5E1" w:sz="4"/>
+              <w:right w:val="single" w:color="CBD5E1" w:sz="4"/>
+            </w:tcBorders>
+            <w:tcMar>
+              <w:top w:type="dxa" w:w="100"/>
+              <w:left w:type="dxa" w:w="140"/>
+              <w:bottom w:type="dxa" w:w="100"/>
+              <w:right w:type="dxa" w:w="140"/>
+            </w:tcMar>
+          </w:tcPr>
+          <w:p>
+            <w:r>
+              <w:t xml:space="preserve"/>
+            </w:r>
+          </w:p>
+        </w:tc>
+        <w:tc>
+          <w:tcPr>
+            <w:tcW w:type="dxa" w:w="1800"/>
+            <w:tcBorders>
+              <w:top w:val="single" w:color="CBD5E1" w:sz="4"/>
+              <w:left w:val="single" w:color="CBD5E1" w:sz="4"/>
+              <w:bottom w:val="single" w:color="CBD5E1" w:sz="4"/>
+              <w:right w:val="single" w:color="CBD5E1" w:sz="4"/>
+            </w:tcBorders>
+            <w:tcMar>
+              <w:top w:type="dxa" w:w="100"/>
+              <w:left w:type="dxa" w:w="140"/>
+              <w:bottom w:type="dxa" w:w="100"/>
+              <w:right w:type="dxa" w:w="140"/>
+            </w:tcMar>
+          </w:tcPr>
+          <w:p>
+            <w:pPr>
+              <w:spacing w:after="40" w:before="40"/>
+            </w:pPr>
+            <w:r>
+              <w:rPr>
+                <w:rFonts w:ascii="Arial" w:cs="Arial" w:eastAsia="Arial" w:hAnsi="Arial"/>
+                <w:b/>
+                <w:bCs/>
+                <w:color w:val="1F2937"/>
+                <w:sz w:val="19"/>
+                <w:szCs w:val="19"/>
+              </w:rPr>
+              <w:t xml:space="preserve">Kênh liên hệ trực tuyến</w:t>
+            </w:r>
+          </w:p>
+        </w:tc>
+        <w:tc>
+          <w:tcPr>
+            <w:tcW w:type="dxa" w:w="2200"/>
+            <w:tcBorders>
+              <w:top w:val="single" w:color="CBD5E1" w:sz="4"/>
+              <w:left w:val="single" w:color="CBD5E1" w:sz="4"/>
+              <w:bottom w:val="single" w:color="CBD5E1" w:sz="4"/>
+              <w:right w:val="single" w:color="CBD5E1" w:sz="4"/>
+            </w:tcBorders>
+            <w:tcMar>
+              <w:top w:type="dxa" w:w="100"/>
+              <w:left w:type="dxa" w:w="140"/>
+              <w:bottom w:type="dxa" w:w="100"/>
+              <w:right w:type="dxa" w:w="140"/>
+            </w:tcMar>
+          </w:tcPr>
+          <w:p>
+            <w:pPr>
+              <w:spacing w:after="40" w:before="40"/>
+            </w:pPr>
+            <w:r>
+              <w:rPr>
+                <w:rFonts w:ascii="Arial" w:cs="Arial" w:eastAsia="Arial" w:hAnsi="Arial"/>
+                <w:b w:val="false"/>
+                <w:bCs w:val="false"/>
+                <w:color w:val="1F2937"/>
+                <w:sz w:val="19"/>
+                <w:szCs w:val="19"/>
+              </w:rPr>
+              <w:t xml:space="preserve">Reactive Forms, Rate Limit</w:t>
+            </w:r>
+          </w:p>
+        </w:tc>
+        <w:tc>
+          <w:tcPr>
+            <w:tcW w:type="dxa" w:w="3560"/>
+            <w:tcBorders>
+              <w:top w:val="single" w:color="CBD5E1" w:sz="4"/>
+              <w:left w:val="single" w:color="CBD5E1" w:sz="4"/>
+              <w:bottom w:val="single" w:color="CBD5E1" w:sz="4"/>
+              <w:right w:val="single" w:color="CBD5E1" w:sz="4"/>
+            </w:tcBorders>
+            <w:tcMar>
+              <w:top w:type="dxa" w:w="100"/>
+              <w:left w:type="dxa" w:w="140"/>
+              <w:bottom w:type="dxa" w:w="100"/>
+              <w:right w:type="dxa" w:w="140"/>
+            </w:tcMar>
+          </w:tcPr>
+          <w:p>
+            <w:pPr>
+              <w:spacing w:after="40" w:before="40"/>
+            </w:pPr>
+            <w:r>
+              <w:rPr>
+                <w:rFonts w:ascii="Arial" w:cs="Arial" w:eastAsia="Arial" w:hAnsi="Arial"/>
+                <w:b w:val="false"/>
+                <w:bCs w:val="false"/>
+                <w:color w:val="1F2937"/>
+                <w:sz w:val="19"/>
+                <w:szCs w:val="19"/>
+              </w:rPr>
+              <w:t xml:space="preserve">Form nhập thông điệp liên hệ, xác thực dữ liệu tức thì, rate-limit 3 req/phút/IP, kích hoạt gửi mail thông báo ngầm.</w:t>
+            </w:r>
+          </w:p>
+        </w:tc>
+      </w:tr>
+      <w:tr>
+        <w:tc>
+          <w:tcPr>
+            <w:tcW w:type="dxa" w:w="1800"/>
+            <w:tcBorders>
+              <w:top w:val="single" w:color="CBD5E1" w:sz="4"/>
+              <w:left w:val="single" w:color="CBD5E1" w:sz="4"/>
+              <w:bottom w:val="single" w:color="CBD5E1" w:sz="4"/>
+              <w:right w:val="single" w:color="CBD5E1" w:sz="4"/>
+            </w:tcBorders>
+            <w:tcMar>
+              <w:top w:type="dxa" w:w="100"/>
+              <w:left w:type="dxa" w:w="140"/>
+              <w:bottom w:type="dxa" w:w="100"/>
+              <w:right w:type="dxa" w:w="140"/>
+            </w:tcMar>
+          </w:tcPr>
+          <w:p>
+            <w:r>
+              <w:t xml:space="preserve"/>
+            </w:r>
+          </w:p>
+        </w:tc>
+        <w:tc>
+          <w:tcPr>
+            <w:tcW w:type="dxa" w:w="1800"/>
+            <w:tcBorders>
+              <w:top w:val="single" w:color="CBD5E1" w:sz="4"/>
+              <w:left w:val="single" w:color="CBD5E1" w:sz="4"/>
+              <w:bottom w:val="single" w:color="CBD5E1" w:sz="4"/>
+              <w:right w:val="single" w:color="CBD5E1" w:sz="4"/>
+            </w:tcBorders>
+            <w:tcMar>
+              <w:top w:type="dxa" w:w="100"/>
+              <w:left w:type="dxa" w:w="140"/>
+              <w:bottom w:type="dxa" w:w="100"/>
+              <w:right w:type="dxa" w:w="140"/>
+            </w:tcMar>
+          </w:tcPr>
+          <w:p>
+            <w:pPr>
+              <w:spacing w:after="40" w:before="40"/>
+            </w:pPr>
+            <w:r>
+              <w:rPr>
+                <w:rFonts w:ascii="Arial" w:cs="Arial" w:eastAsia="Arial" w:hAnsi="Arial"/>
+                <w:b/>
+                <w:bCs/>
+                <w:color w:val="1F2937"/>
+                <w:sz w:val="19"/>
+                <w:szCs w:val="19"/>
+              </w:rPr>
+              <w:t xml:space="preserve">Tiện ích tương tác</w:t>
+            </w:r>
+          </w:p>
+        </w:tc>
+        <w:tc>
+          <w:tcPr>
+            <w:tcW w:type="dxa" w:w="2200"/>
+            <w:tcBorders>
+              <w:top w:val="single" w:color="CBD5E1" w:sz="4"/>
+              <w:left w:val="single" w:color="CBD5E1" w:sz="4"/>
+              <w:bottom w:val="single" w:color="CBD5E1" w:sz="4"/>
+              <w:right w:val="single" w:color="CBD5E1" w:sz="4"/>
+            </w:tcBorders>
+            <w:tcMar>
+              <w:top w:type="dxa" w:w="100"/>
+              <w:left w:type="dxa" w:w="140"/>
+              <w:bottom w:type="dxa" w:w="100"/>
+              <w:right w:type="dxa" w:w="140"/>
+            </w:tcMar>
+          </w:tcPr>
+          <w:p>
+            <w:pPr>
+              <w:spacing w:after="40" w:before="40"/>
+            </w:pPr>
+            <w:r>
+              <w:rPr>
+                <w:rFonts w:ascii="Arial" w:cs="Arial" w:eastAsia="Arial" w:hAnsi="Arial"/>
+                <w:b w:val="false"/>
+                <w:bCs w:val="false"/>
+                <w:color w:val="1F2937"/>
+                <w:sz w:val="19"/>
+                <w:szCs w:val="19"/>
+              </w:rPr>
+              <w:t xml:space="preserve">Angular Signals, CDK</w:t>
+            </w:r>
+          </w:p>
+        </w:tc>
+        <w:tc>
+          <w:tcPr>
+            <w:tcW w:type="dxa" w:w="3560"/>
+            <w:tcBorders>
+              <w:top w:val="single" w:color="CBD5E1" w:sz="4"/>
+              <w:left w:val="single" w:color="CBD5E1" w:sz="4"/>
+              <w:bottom w:val="single" w:color="CBD5E1" w:sz="4"/>
+              <w:right w:val="single" w:color="CBD5E1" w:sz="4"/>
+            </w:tcBorders>
+            <w:tcMar>
+              <w:top w:type="dxa" w:w="100"/>
+              <w:left w:type="dxa" w:w="140"/>
+              <w:bottom w:type="dxa" w:w="100"/>
+              <w:right w:type="dxa" w:w="140"/>
+            </w:tcMar>
+          </w:tcPr>
+          <w:p>
+            <w:pPr>
+              <w:spacing w:after="40" w:before="40"/>
+            </w:pPr>
+            <w:r>
+              <w:rPr>
+                <w:rFonts w:ascii="Arial" w:cs="Arial" w:eastAsia="Arial" w:hAnsi="Arial"/>
+                <w:b w:val="false"/>
+                <w:bCs w:val="false"/>
+                <w:color w:val="1F2937"/>
+                <w:sz w:val="19"/>
+                <w:szCs w:val="19"/>
+              </w:rPr>
+              <w:t xml:space="preserve">Terminal giả lập (</w:t>
+            </w:r>
+            <w:r>
+              <w:rPr>
+                <w:rFonts w:ascii="Consolas" w:cs="Consolas" w:eastAsia="Consolas" w:hAnsi="Consolas"/>
+                <w:color w:val="0F172A"/>
+                <w:sz w:val="17"/>
+                <w:szCs w:val="17"/>
+                <w:shd w:fill="F1F5F9" w:color="auto" w:val="solid"/>
+              </w:rPr>
+              <w:t xml:space="preserve">Ctrl + ~</w:t>
+            </w:r>
+            <w:r>
+              <w:rPr>
+                <w:rFonts w:ascii="Arial" w:cs="Arial" w:eastAsia="Arial" w:hAnsi="Arial"/>
+                <w:b w:val="false"/>
+                <w:bCs w:val="false"/>
+                <w:color w:val="1F2937"/>
+                <w:sz w:val="19"/>
+                <w:szCs w:val="19"/>
+              </w:rPr>
+              <w:t xml:space="preserve">), Modal xem/tải CV đa ngôn ngữ (</w:t>
+            </w:r>
+            <w:r>
+              <w:rPr>
+                <w:rFonts w:ascii="Consolas" w:cs="Consolas" w:eastAsia="Consolas" w:hAnsi="Consolas"/>
+                <w:color w:val="0F172A"/>
+                <w:sz w:val="17"/>
+                <w:szCs w:val="17"/>
+                <w:shd w:fill="F1F5F9" w:color="auto" w:val="solid"/>
+              </w:rPr>
+              <w:t xml:space="preserve">/cv-vi.pdf</w:t>
+            </w:r>
+            <w:r>
+              <w:rPr>
+                <w:rFonts w:ascii="Arial" w:cs="Arial" w:eastAsia="Arial" w:hAnsi="Arial"/>
+                <w:b w:val="false"/>
+                <w:bCs w:val="false"/>
+                <w:color w:val="1F2937"/>
+                <w:sz w:val="19"/>
+                <w:szCs w:val="19"/>
+              </w:rPr>
+              <w:t xml:space="preserve">, </w:t>
+            </w:r>
+            <w:r>
+              <w:rPr>
+                <w:rFonts w:ascii="Consolas" w:cs="Consolas" w:eastAsia="Consolas" w:hAnsi="Consolas"/>
+                <w:color w:val="0F172A"/>
+                <w:sz w:val="17"/>
+                <w:szCs w:val="17"/>
+                <w:shd w:fill="F1F5F9" w:color="auto" w:val="solid"/>
+              </w:rPr>
+              <w:t xml:space="preserve">/cv-en.pdf</w:t>
+            </w:r>
+            <w:r>
+              <w:rPr>
+                <w:rFonts w:ascii="Arial" w:cs="Arial" w:eastAsia="Arial" w:hAnsi="Arial"/>
+                <w:b w:val="false"/>
+                <w:bCs w:val="false"/>
+                <w:color w:val="1F2937"/>
+                <w:sz w:val="19"/>
+                <w:szCs w:val="19"/>
+              </w:rPr>
+              <w:t xml:space="preserve">), GitHub live stats counter.</w:t>
+            </w:r>
+          </w:p>
+        </w:tc>
+      </w:tr>
+      <w:tr>
+        <w:tc>
+          <w:tcPr>
+            <w:tcW w:type="dxa" w:w="1800"/>
+            <w:tcBorders>
+              <w:top w:val="single" w:color="CBD5E1" w:sz="4"/>
+              <w:left w:val="single" w:color="CBD5E1" w:sz="4"/>
+              <w:bottom w:val="single" w:color="CBD5E1" w:sz="4"/>
+              <w:right w:val="single" w:color="CBD5E1" w:sz="4"/>
+            </w:tcBorders>
+            <w:tcMar>
+              <w:top w:type="dxa" w:w="100"/>
+              <w:left w:type="dxa" w:w="140"/>
+              <w:bottom w:type="dxa" w:w="100"/>
+              <w:right w:type="dxa" w:w="140"/>
+            </w:tcMar>
+          </w:tcPr>
+          <w:p>
+            <w:pPr>
+              <w:spacing w:after="20" w:before="40"/>
+            </w:pPr>
+            <w:r>
+              <w:rPr>
+                <w:rFonts w:ascii="Arial" w:cs="Arial" w:eastAsia="Arial" w:hAnsi="Arial"/>
+                <w:b/>
+                <w:bCs/>
+                <w:color w:val="1F2937"/>
+                <w:sz w:val="19"/>
+                <w:szCs w:val="19"/>
+              </w:rPr>
+              <w:t xml:space="preserve">2. Admin CMS</w:t>
+            </w:r>
+          </w:p>
+          <w:p>
+            <w:pPr>
+              <w:spacing w:after="40" w:before="20"/>
+            </w:pPr>
+            <w:r>
+              <w:rPr>
+                <w:rFonts w:ascii="Arial" w:cs="Arial" w:eastAsia="Arial" w:hAnsi="Arial"/>
+                <w:b w:val="false"/>
+                <w:bCs w:val="false"/>
+                <w:color w:val="1F2937"/>
+                <w:sz w:val="19"/>
+                <w:szCs w:val="19"/>
+              </w:rPr>
+              <w:t xml:space="preserve">*(Bảo mật cao)*</w:t>
+            </w:r>
+          </w:p>
+        </w:tc>
+        <w:tc>
+          <w:tcPr>
+            <w:tcW w:type="dxa" w:w="1800"/>
+            <w:tcBorders>
+              <w:top w:val="single" w:color="CBD5E1" w:sz="4"/>
+              <w:left w:val="single" w:color="CBD5E1" w:sz="4"/>
+              <w:bottom w:val="single" w:color="CBD5E1" w:sz="4"/>
+              <w:right w:val="single" w:color="CBD5E1" w:sz="4"/>
+            </w:tcBorders>
+            <w:tcMar>
+              <w:top w:type="dxa" w:w="100"/>
+              <w:left w:type="dxa" w:w="140"/>
+              <w:bottom w:type="dxa" w:w="100"/>
+              <w:right w:type="dxa" w:w="140"/>
+            </w:tcMar>
+          </w:tcPr>
+          <w:p>
+            <w:pPr>
+              <w:spacing w:after="40" w:before="40"/>
+            </w:pPr>
+            <w:r>
+              <w:rPr>
+                <w:rFonts w:ascii="Arial" w:cs="Arial" w:eastAsia="Arial" w:hAnsi="Arial"/>
+                <w:b/>
+                <w:bCs/>
+                <w:color w:val="1F2937"/>
+                <w:sz w:val="19"/>
+                <w:szCs w:val="19"/>
+              </w:rPr>
+              <w:t xml:space="preserve">Xác thực &amp; Quản lý phiên</w:t>
+            </w:r>
+          </w:p>
+        </w:tc>
+        <w:tc>
+          <w:tcPr>
+            <w:tcW w:type="dxa" w:w="2200"/>
+            <w:tcBorders>
+              <w:top w:val="single" w:color="CBD5E1" w:sz="4"/>
+              <w:left w:val="single" w:color="CBD5E1" w:sz="4"/>
+              <w:bottom w:val="single" w:color="CBD5E1" w:sz="4"/>
+              <w:right w:val="single" w:color="CBD5E1" w:sz="4"/>
+            </w:tcBorders>
+            <w:tcMar>
+              <w:top w:type="dxa" w:w="100"/>
+              <w:left w:type="dxa" w:w="140"/>
+              <w:bottom w:type="dxa" w:w="100"/>
+              <w:right w:type="dxa" w:w="140"/>
+            </w:tcMar>
+          </w:tcPr>
+          <w:p>
+            <w:pPr>
+              <w:spacing w:after="40" w:before="40"/>
+            </w:pPr>
+            <w:r>
+              <w:rPr>
+                <w:rFonts w:ascii="Arial" w:cs="Arial" w:eastAsia="Arial" w:hAnsi="Arial"/>
+                <w:b w:val="false"/>
+                <w:bCs w:val="false"/>
+                <w:color w:val="1F2937"/>
+                <w:sz w:val="19"/>
+                <w:szCs w:val="19"/>
+              </w:rPr>
+              <w:t xml:space="preserve">Spring Security 6, JWT, BCrypt</w:t>
+            </w:r>
+          </w:p>
+        </w:tc>
+        <w:tc>
+          <w:tcPr>
+            <w:tcW w:type="dxa" w:w="3560"/>
+            <w:tcBorders>
+              <w:top w:val="single" w:color="CBD5E1" w:sz="4"/>
+              <w:left w:val="single" w:color="CBD5E1" w:sz="4"/>
+              <w:bottom w:val="single" w:color="CBD5E1" w:sz="4"/>
+              <w:right w:val="single" w:color="CBD5E1" w:sz="4"/>
+            </w:tcBorders>
+            <w:tcMar>
+              <w:top w:type="dxa" w:w="100"/>
+              <w:left w:type="dxa" w:w="140"/>
+              <w:bottom w:type="dxa" w:w="100"/>
+              <w:right w:type="dxa" w:w="140"/>
+            </w:tcMar>
+          </w:tcPr>
+          <w:p>
+            <w:pPr>
+              <w:spacing w:after="40" w:before="40"/>
+            </w:pPr>
+            <w:r>
+              <w:rPr>
+                <w:rFonts w:ascii="Arial" w:cs="Arial" w:eastAsia="Arial" w:hAnsi="Arial"/>
+                <w:b w:val="false"/>
+                <w:bCs w:val="false"/>
+                <w:color w:val="1F2937"/>
+                <w:sz w:val="19"/>
+                <w:szCs w:val="19"/>
+              </w:rPr>
+              <w:t xml:space="preserve">Đăng nhập tài khoản quản trị, cấp JWT 15m + Refresh Token 7 ngày qua HttpOnly Cookie, khóa tài khoản khi sai 5 lần.</w:t>
+            </w:r>
+          </w:p>
+        </w:tc>
+      </w:tr>
+      <w:tr>
+        <w:tc>
+          <w:tcPr>
+            <w:tcW w:type="dxa" w:w="1800"/>
+            <w:tcBorders>
+              <w:top w:val="single" w:color="CBD5E1" w:sz="4"/>
+              <w:left w:val="single" w:color="CBD5E1" w:sz="4"/>
+              <w:bottom w:val="single" w:color="CBD5E1" w:sz="4"/>
+              <w:right w:val="single" w:color="CBD5E1" w:sz="4"/>
+            </w:tcBorders>
+            <w:tcMar>
+              <w:top w:type="dxa" w:w="100"/>
+              <w:left w:type="dxa" w:w="140"/>
+              <w:bottom w:type="dxa" w:w="100"/>
+              <w:right w:type="dxa" w:w="140"/>
+            </w:tcMar>
+          </w:tcPr>
+          <w:p>
+            <w:r>
+              <w:t xml:space="preserve"/>
+            </w:r>
+          </w:p>
+        </w:tc>
+        <w:tc>
+          <w:tcPr>
+            <w:tcW w:type="dxa" w:w="1800"/>
+            <w:tcBorders>
+              <w:top w:val="single" w:color="CBD5E1" w:sz="4"/>
+              <w:left w:val="single" w:color="CBD5E1" w:sz="4"/>
+              <w:bottom w:val="single" w:color="CBD5E1" w:sz="4"/>
+              <w:right w:val="single" w:color="CBD5E1" w:sz="4"/>
+            </w:tcBorders>
+            <w:tcMar>
+              <w:top w:type="dxa" w:w="100"/>
+              <w:left w:type="dxa" w:w="140"/>
+              <w:bottom w:type="dxa" w:w="100"/>
+              <w:right w:type="dxa" w:w="140"/>
+            </w:tcMar>
+          </w:tcPr>
+          <w:p>
+            <w:pPr>
+              <w:spacing w:after="40" w:before="40"/>
+            </w:pPr>
+            <w:r>
+              <w:rPr>
+                <w:rFonts w:ascii="Arial" w:cs="Arial" w:eastAsia="Arial" w:hAnsi="Arial"/>
+                <w:b/>
+                <w:bCs/>
+                <w:color w:val="1F2937"/>
+                <w:sz w:val="19"/>
+                <w:szCs w:val="19"/>
+              </w:rPr>
+              <w:t xml:space="preserve">Dashboard Analytics</w:t>
+            </w:r>
+          </w:p>
+        </w:tc>
+        <w:tc>
+          <w:tcPr>
+            <w:tcW w:type="dxa" w:w="2200"/>
+            <w:tcBorders>
+              <w:top w:val="single" w:color="CBD5E1" w:sz="4"/>
+              <w:left w:val="single" w:color="CBD5E1" w:sz="4"/>
+              <w:bottom w:val="single" w:color="CBD5E1" w:sz="4"/>
+              <w:right w:val="single" w:color="CBD5E1" w:sz="4"/>
+            </w:tcBorders>
+            <w:tcMar>
+              <w:top w:type="dxa" w:w="100"/>
+              <w:left w:type="dxa" w:w="140"/>
+              <w:bottom w:type="dxa" w:w="100"/>
+              <w:right w:type="dxa" w:w="140"/>
+            </w:tcMar>
+          </w:tcPr>
+          <w:p>
+            <w:pPr>
+              <w:spacing w:after="40" w:before="40"/>
+            </w:pPr>
+            <w:r>
+              <w:rPr>
+                <w:rFonts w:ascii="Arial" w:cs="Arial" w:eastAsia="Arial" w:hAnsi="Arial"/>
+                <w:b w:val="false"/>
+                <w:bCs w:val="false"/>
+                <w:color w:val="1F2937"/>
+                <w:sz w:val="19"/>
+                <w:szCs w:val="19"/>
+              </w:rPr>
+              <w:t xml:space="preserve">Chart / Signal state</w:t>
+            </w:r>
+          </w:p>
+        </w:tc>
+        <w:tc>
+          <w:tcPr>
+            <w:tcW w:type="dxa" w:w="3560"/>
+            <w:tcBorders>
+              <w:top w:val="single" w:color="CBD5E1" w:sz="4"/>
+              <w:left w:val="single" w:color="CBD5E1" w:sz="4"/>
+              <w:bottom w:val="single" w:color="CBD5E1" w:sz="4"/>
+              <w:right w:val="single" w:color="CBD5E1" w:sz="4"/>
+            </w:tcBorders>
+            <w:tcMar>
+              <w:top w:type="dxa" w:w="100"/>
+              <w:left w:type="dxa" w:w="140"/>
+              <w:bottom w:type="dxa" w:w="100"/>
+              <w:right w:type="dxa" w:w="140"/>
+            </w:tcMar>
+          </w:tcPr>
+          <w:p>
+            <w:pPr>
+              <w:spacing w:after="40" w:before="40"/>
+            </w:pPr>
+            <w:r>
+              <w:rPr>
+                <w:rFonts w:ascii="Arial" w:cs="Arial" w:eastAsia="Arial" w:hAnsi="Arial"/>
+                <w:b w:val="false"/>
+                <w:bCs w:val="false"/>
+                <w:color w:val="1F2937"/>
+                <w:sz w:val="19"/>
+                <w:szCs w:val="19"/>
+              </w:rPr>
+              <w:t xml:space="preserve">Biểu đồ theo dõi tổng lượt xem, người dùng duy nhất, tỷ lệ thiết bị (desktop/mobile) và danh sách bài viết xem nhiều nhất.</w:t>
+            </w:r>
+          </w:p>
+        </w:tc>
+      </w:tr>
+      <w:tr>
+        <w:tc>
+          <w:tcPr>
+            <w:tcW w:type="dxa" w:w="1800"/>
+            <w:tcBorders>
+              <w:top w:val="single" w:color="CBD5E1" w:sz="4"/>
+              <w:left w:val="single" w:color="CBD5E1" w:sz="4"/>
+              <w:bottom w:val="single" w:color="CBD5E1" w:sz="4"/>
+              <w:right w:val="single" w:color="CBD5E1" w:sz="4"/>
+            </w:tcBorders>
+            <w:tcMar>
+              <w:top w:type="dxa" w:w="100"/>
+              <w:left w:type="dxa" w:w="140"/>
+              <w:bottom w:type="dxa" w:w="100"/>
+              <w:right w:type="dxa" w:w="140"/>
+            </w:tcMar>
+          </w:tcPr>
+          <w:p>
+            <w:r>
+              <w:t xml:space="preserve"/>
+            </w:r>
+          </w:p>
+        </w:tc>
+        <w:tc>
+          <w:tcPr>
+            <w:tcW w:type="dxa" w:w="1800"/>
+            <w:tcBorders>
+              <w:top w:val="single" w:color="CBD5E1" w:sz="4"/>
+              <w:left w:val="single" w:color="CBD5E1" w:sz="4"/>
+              <w:bottom w:val="single" w:color="CBD5E1" w:sz="4"/>
+              <w:right w:val="single" w:color="CBD5E1" w:sz="4"/>
+            </w:tcBorders>
+            <w:tcMar>
+              <w:top w:type="dxa" w:w="100"/>
+              <w:left w:type="dxa" w:w="140"/>
+              <w:bottom w:type="dxa" w:w="100"/>
+              <w:right w:type="dxa" w:w="140"/>
+            </w:tcMar>
+          </w:tcPr>
+          <w:p>
+            <w:pPr>
+              <w:spacing w:after="40" w:before="40"/>
+            </w:pPr>
+            <w:r>
+              <w:rPr>
+                <w:rFonts w:ascii="Arial" w:cs="Arial" w:eastAsia="Arial" w:hAnsi="Arial"/>
+                <w:b/>
+                <w:bCs/>
+                <w:color w:val="1F2937"/>
+                <w:sz w:val="19"/>
+                <w:szCs w:val="19"/>
+              </w:rPr>
+              <w:t xml:space="preserve">Quản lý tài nguyên CMS</w:t>
+            </w:r>
+          </w:p>
+        </w:tc>
+        <w:tc>
+          <w:tcPr>
+            <w:tcW w:type="dxa" w:w="2200"/>
+            <w:tcBorders>
+              <w:top w:val="single" w:color="CBD5E1" w:sz="4"/>
+              <w:left w:val="single" w:color="CBD5E1" w:sz="4"/>
+              <w:bottom w:val="single" w:color="CBD5E1" w:sz="4"/>
+              <w:right w:val="single" w:color="CBD5E1" w:sz="4"/>
+            </w:tcBorders>
+            <w:tcMar>
+              <w:top w:type="dxa" w:w="100"/>
+              <w:left w:type="dxa" w:w="140"/>
+              <w:bottom w:type="dxa" w:w="100"/>
+              <w:right w:type="dxa" w:w="140"/>
+            </w:tcMar>
+          </w:tcPr>
+          <w:p>
+            <w:pPr>
+              <w:spacing w:after="40" w:before="40"/>
+            </w:pPr>
+            <w:r>
+              <w:rPr>
+                <w:rFonts w:ascii="Arial" w:cs="Arial" w:eastAsia="Arial" w:hAnsi="Arial"/>
+                <w:b w:val="false"/>
+                <w:bCs w:val="false"/>
+                <w:color w:val="1F2937"/>
+                <w:sz w:val="19"/>
+                <w:szCs w:val="19"/>
+              </w:rPr>
+              <w:t xml:space="preserve">Angular Dynamic CRUD</w:t>
+            </w:r>
+          </w:p>
+        </w:tc>
+        <w:tc>
+          <w:tcPr>
+            <w:tcW w:type="dxa" w:w="3560"/>
+            <w:tcBorders>
+              <w:top w:val="single" w:color="CBD5E1" w:sz="4"/>
+              <w:left w:val="single" w:color="CBD5E1" w:sz="4"/>
+              <w:bottom w:val="single" w:color="CBD5E1" w:sz="4"/>
+              <w:right w:val="single" w:color="CBD5E1" w:sz="4"/>
+            </w:tcBorders>
+            <w:tcMar>
+              <w:top w:type="dxa" w:w="100"/>
+              <w:left w:type="dxa" w:w="140"/>
+              <w:bottom w:type="dxa" w:w="100"/>
+              <w:right w:type="dxa" w:w="140"/>
+            </w:tcMar>
+          </w:tcPr>
+          <w:p>
+            <w:pPr>
+              <w:spacing w:after="40" w:before="40"/>
+            </w:pPr>
+            <w:r>
+              <w:rPr>
+                <w:rFonts w:ascii="Arial" w:cs="Arial" w:eastAsia="Arial" w:hAnsi="Arial"/>
+                <w:b w:val="false"/>
+                <w:bCs w:val="false"/>
+                <w:color w:val="1F2937"/>
+                <w:sz w:val="19"/>
+                <w:szCs w:val="19"/>
+              </w:rPr>
+              <w:t xml:space="preserve">Toàn diện Create/Read/Update/Delete 6 thực thể (kỹ năng, kinh nghiệm, dự án, học vấn, chứng chỉ, bài viết); kéo thả sắp xếp thứ tự.</w:t>
+            </w:r>
+          </w:p>
+        </w:tc>
+      </w:tr>
+      <w:tr>
+        <w:tc>
+          <w:tcPr>
+            <w:tcW w:type="dxa" w:w="1800"/>
+            <w:tcBorders>
+              <w:top w:val="single" w:color="CBD5E1" w:sz="4"/>
+              <w:left w:val="single" w:color="CBD5E1" w:sz="4"/>
+              <w:bottom w:val="single" w:color="CBD5E1" w:sz="4"/>
+              <w:right w:val="single" w:color="CBD5E1" w:sz="4"/>
+            </w:tcBorders>
+            <w:tcMar>
+              <w:top w:type="dxa" w:w="100"/>
+              <w:left w:type="dxa" w:w="140"/>
+              <w:bottom w:type="dxa" w:w="100"/>
+              <w:right w:type="dxa" w:w="140"/>
+            </w:tcMar>
+          </w:tcPr>
+          <w:p>
+            <w:r>
+              <w:t xml:space="preserve"/>
+            </w:r>
+          </w:p>
+        </w:tc>
+        <w:tc>
+          <w:tcPr>
+            <w:tcW w:type="dxa" w:w="1800"/>
+            <w:tcBorders>
+              <w:top w:val="single" w:color="CBD5E1" w:sz="4"/>
+              <w:left w:val="single" w:color="CBD5E1" w:sz="4"/>
+              <w:bottom w:val="single" w:color="CBD5E1" w:sz="4"/>
+              <w:right w:val="single" w:color="CBD5E1" w:sz="4"/>
+            </w:tcBorders>
+            <w:tcMar>
+              <w:top w:type="dxa" w:w="100"/>
+              <w:left w:type="dxa" w:w="140"/>
+              <w:bottom w:type="dxa" w:w="100"/>
+              <w:right w:type="dxa" w:w="140"/>
+            </w:tcMar>
+          </w:tcPr>
+          <w:p>
+            <w:pPr>
+              <w:spacing w:after="40" w:before="40"/>
+            </w:pPr>
+            <w:r>
+              <w:rPr>
+                <w:rFonts w:ascii="Arial" w:cs="Arial" w:eastAsia="Arial" w:hAnsi="Arial"/>
+                <w:b/>
+                <w:bCs/>
+                <w:color w:val="1F2937"/>
+                <w:sz w:val="19"/>
+                <w:szCs w:val="19"/>
+              </w:rPr>
+              <w:t xml:space="preserve">Hộp thư &amp; Lưu trữ tệp</w:t>
+            </w:r>
+          </w:p>
+        </w:tc>
+        <w:tc>
+          <w:tcPr>
+            <w:tcW w:type="dxa" w:w="2200"/>
+            <w:tcBorders>
+              <w:top w:val="single" w:color="CBD5E1" w:sz="4"/>
+              <w:left w:val="single" w:color="CBD5E1" w:sz="4"/>
+              <w:bottom w:val="single" w:color="CBD5E1" w:sz="4"/>
+              <w:right w:val="single" w:color="CBD5E1" w:sz="4"/>
+            </w:tcBorders>
+            <w:tcMar>
+              <w:top w:type="dxa" w:w="100"/>
+              <w:left w:type="dxa" w:w="140"/>
+              <w:bottom w:type="dxa" w:w="100"/>
+              <w:right w:type="dxa" w:w="140"/>
+            </w:tcMar>
+          </w:tcPr>
+          <w:p>
+            <w:pPr>
+              <w:spacing w:after="40" w:before="40"/>
+            </w:pPr>
+            <w:r>
+              <w:rPr>
+                <w:rFonts w:ascii="Arial" w:cs="Arial" w:eastAsia="Arial" w:hAnsi="Arial"/>
+                <w:b w:val="false"/>
+                <w:bCs w:val="false"/>
+                <w:color w:val="1F2937"/>
+                <w:sz w:val="19"/>
+                <w:szCs w:val="19"/>
+              </w:rPr>
+              <w:t xml:space="preserve">Supabase Storage REST API</w:t>
+            </w:r>
+          </w:p>
+        </w:tc>
+        <w:tc>
+          <w:tcPr>
+            <w:tcW w:type="dxa" w:w="3560"/>
+            <w:tcBorders>
+              <w:top w:val="single" w:color="CBD5E1" w:sz="4"/>
+              <w:left w:val="single" w:color="CBD5E1" w:sz="4"/>
+              <w:bottom w:val="single" w:color="CBD5E1" w:sz="4"/>
+              <w:right w:val="single" w:color="CBD5E1" w:sz="4"/>
+            </w:tcBorders>
+            <w:tcMar>
+              <w:top w:type="dxa" w:w="100"/>
+              <w:left w:type="dxa" w:w="140"/>
+              <w:bottom w:type="dxa" w:w="100"/>
+              <w:right w:type="dxa" w:w="140"/>
+            </w:tcMar>
+          </w:tcPr>
+          <w:p>
+            <w:pPr>
+              <w:spacing w:after="40" w:before="40"/>
+            </w:pPr>
+            <w:r>
+              <w:rPr>
+                <w:rFonts w:ascii="Arial" w:cs="Arial" w:eastAsia="Arial" w:hAnsi="Arial"/>
+                <w:b w:val="false"/>
+                <w:bCs w:val="false"/>
+                <w:color w:val="1F2937"/>
+                <w:sz w:val="19"/>
+                <w:szCs w:val="19"/>
+              </w:rPr>
+              <w:t xml:space="preserve">Xem và quản lý tin nhắn liên hệ gửi đến, tải ảnh avatar/dự án lên bucket đám mây với kiểm tra định dạng và dung lượng ≤2MB.</w:t>
+            </w:r>
+          </w:p>
+        </w:tc>
+      </w:tr>
+      <w:tr>
+        <w:tc>
+          <w:tcPr>
+            <w:tcW w:type="dxa" w:w="1800"/>
+            <w:tcBorders>
+              <w:top w:val="single" w:color="CBD5E1" w:sz="4"/>
+              <w:left w:val="single" w:color="CBD5E1" w:sz="4"/>
+              <w:bottom w:val="single" w:color="CBD5E1" w:sz="4"/>
+              <w:right w:val="single" w:color="CBD5E1" w:sz="4"/>
+            </w:tcBorders>
+            <w:tcMar>
+              <w:top w:type="dxa" w:w="100"/>
+              <w:left w:type="dxa" w:w="140"/>
+              <w:bottom w:type="dxa" w:w="100"/>
+              <w:right w:type="dxa" w:w="140"/>
+            </w:tcMar>
+          </w:tcPr>
+          <w:p>
+            <w:pPr>
+              <w:spacing w:after="20" w:before="40"/>
+            </w:pPr>
+            <w:r>
+              <w:rPr>
+                <w:rFonts w:ascii="Arial" w:cs="Arial" w:eastAsia="Arial" w:hAnsi="Arial"/>
+                <w:b/>
+                <w:bCs/>
+                <w:color w:val="1F2937"/>
+                <w:sz w:val="19"/>
+                <w:szCs w:val="19"/>
+              </w:rPr>
+              <w:t xml:space="preserve">3. Backend &amp; Hạ tầng</w:t>
+            </w:r>
+          </w:p>
+          <w:p>
+            <w:pPr>
+              <w:spacing w:after="40" w:before="20"/>
+            </w:pPr>
+            <w:r>
+              <w:rPr>
+                <w:rFonts w:ascii="Arial" w:cs="Arial" w:eastAsia="Arial" w:hAnsi="Arial"/>
+                <w:b w:val="false"/>
+                <w:bCs w:val="false"/>
+                <w:color w:val="1F2937"/>
+                <w:sz w:val="19"/>
+                <w:szCs w:val="19"/>
+              </w:rPr>
+              <w:t xml:space="preserve">*(Core Services)*</w:t>
+            </w:r>
+          </w:p>
+        </w:tc>
+        <w:tc>
+          <w:tcPr>
+            <w:tcW w:type="dxa" w:w="1800"/>
+            <w:tcBorders>
+              <w:top w:val="single" w:color="CBD5E1" w:sz="4"/>
+              <w:left w:val="single" w:color="CBD5E1" w:sz="4"/>
+              <w:bottom w:val="single" w:color="CBD5E1" w:sz="4"/>
+              <w:right w:val="single" w:color="CBD5E1" w:sz="4"/>
+            </w:tcBorders>
+            <w:tcMar>
+              <w:top w:type="dxa" w:w="100"/>
+              <w:left w:type="dxa" w:w="140"/>
+              <w:bottom w:type="dxa" w:w="100"/>
+              <w:right w:type="dxa" w:w="140"/>
+            </w:tcMar>
+          </w:tcPr>
+          <w:p>
+            <w:pPr>
+              <w:spacing w:after="40" w:before="40"/>
+            </w:pPr>
+            <w:r>
+              <w:rPr>
+                <w:rFonts w:ascii="Arial" w:cs="Arial" w:eastAsia="Arial" w:hAnsi="Arial"/>
+                <w:b/>
+                <w:bCs/>
+                <w:color w:val="1F2937"/>
+                <w:sz w:val="19"/>
+                <w:szCs w:val="19"/>
+              </w:rPr>
+              <w:t xml:space="preserve">REST API &amp; Caching</w:t>
+            </w:r>
+          </w:p>
+        </w:tc>
+        <w:tc>
+          <w:tcPr>
+            <w:tcW w:type="dxa" w:w="2200"/>
+            <w:tcBorders>
+              <w:top w:val="single" w:color="CBD5E1" w:sz="4"/>
+              <w:left w:val="single" w:color="CBD5E1" w:sz="4"/>
+              <w:bottom w:val="single" w:color="CBD5E1" w:sz="4"/>
+              <w:right w:val="single" w:color="CBD5E1" w:sz="4"/>
+            </w:tcBorders>
+            <w:tcMar>
+              <w:top w:type="dxa" w:w="100"/>
+              <w:left w:type="dxa" w:w="140"/>
+              <w:bottom w:type="dxa" w:w="100"/>
+              <w:right w:type="dxa" w:w="140"/>
+            </w:tcMar>
+          </w:tcPr>
+          <w:p>
+            <w:pPr>
+              <w:spacing w:after="40" w:before="40"/>
+            </w:pPr>
+            <w:r>
+              <w:rPr>
+                <w:rFonts w:ascii="Arial" w:cs="Arial" w:eastAsia="Arial" w:hAnsi="Arial"/>
+                <w:b w:val="false"/>
+                <w:bCs w:val="false"/>
+                <w:color w:val="1F2937"/>
+                <w:sz w:val="19"/>
+                <w:szCs w:val="19"/>
+              </w:rPr>
+              <w:t xml:space="preserve">Spring Boot 3.5, Cacheable</w:t>
+            </w:r>
+          </w:p>
+        </w:tc>
+        <w:tc>
+          <w:tcPr>
+            <w:tcW w:type="dxa" w:w="3560"/>
+            <w:tcBorders>
+              <w:top w:val="single" w:color="CBD5E1" w:sz="4"/>
+              <w:left w:val="single" w:color="CBD5E1" w:sz="4"/>
+              <w:bottom w:val="single" w:color="CBD5E1" w:sz="4"/>
+              <w:right w:val="single" w:color="CBD5E1" w:sz="4"/>
+            </w:tcBorders>
+            <w:tcMar>
+              <w:top w:type="dxa" w:w="100"/>
+              <w:left w:type="dxa" w:w="140"/>
+              <w:bottom w:type="dxa" w:w="100"/>
+              <w:right w:type="dxa" w:w="140"/>
+            </w:tcMar>
+          </w:tcPr>
+          <w:p>
+            <w:pPr>
+              <w:spacing w:after="40" w:before="40"/>
+            </w:pPr>
+            <w:r>
+              <w:rPr>
+                <w:rFonts w:ascii="Arial" w:cs="Arial" w:eastAsia="Arial" w:hAnsi="Arial"/>
+                <w:b w:val="false"/>
+                <w:bCs w:val="false"/>
+                <w:color w:val="1F2937"/>
+                <w:sz w:val="19"/>
+                <w:szCs w:val="19"/>
+              </w:rPr>
+              <w:t xml:space="preserve">Cung cấp chuẩn REST API </w:t>
+            </w:r>
+            <w:r>
+              <w:rPr>
+                <w:rFonts w:ascii="Consolas" w:cs="Consolas" w:eastAsia="Consolas" w:hAnsi="Consolas"/>
+                <w:color w:val="0F172A"/>
+                <w:sz w:val="17"/>
+                <w:szCs w:val="17"/>
+                <w:shd w:fill="F1F5F9" w:color="auto" w:val="solid"/>
+              </w:rPr>
+              <w:t xml:space="preserve">/api/v1</w:t>
+            </w:r>
+            <w:r>
+              <w:rPr>
+                <w:rFonts w:ascii="Arial" w:cs="Arial" w:eastAsia="Arial" w:hAnsi="Arial"/>
+                <w:b w:val="false"/>
+                <w:bCs w:val="false"/>
+                <w:color w:val="1F2937"/>
+                <w:sz w:val="19"/>
+                <w:szCs w:val="19"/>
+              </w:rPr>
+              <w:t xml:space="preserve">, endpoint tổng hợp </w:t>
+            </w:r>
+            <w:r>
+              <w:rPr>
+                <w:rFonts w:ascii="Consolas" w:cs="Consolas" w:eastAsia="Consolas" w:hAnsi="Consolas"/>
+                <w:color w:val="0F172A"/>
+                <w:sz w:val="17"/>
+                <w:szCs w:val="17"/>
+                <w:shd w:fill="F1F5F9" w:color="auto" w:val="solid"/>
+              </w:rPr>
+              <w:t xml:space="preserve">/portfolio</w:t>
+            </w:r>
+            <w:r>
+              <w:rPr>
+                <w:rFonts w:ascii="Arial" w:cs="Arial" w:eastAsia="Arial" w:hAnsi="Arial"/>
+                <w:b w:val="false"/>
+                <w:bCs w:val="false"/>
+                <w:color w:val="1F2937"/>
+                <w:sz w:val="19"/>
+                <w:szCs w:val="19"/>
+              </w:rPr>
+              <w:t xml:space="preserve"> cache 10 phút, Global Exception Envelope chuẩn hóa.</w:t>
+            </w:r>
+          </w:p>
+        </w:tc>
+      </w:tr>
+      <w:tr>
+        <w:tc>
+          <w:tcPr>
+            <w:tcW w:type="dxa" w:w="1800"/>
+            <w:tcBorders>
+              <w:top w:val="single" w:color="CBD5E1" w:sz="4"/>
+              <w:left w:val="single" w:color="CBD5E1" w:sz="4"/>
+              <w:bottom w:val="single" w:color="CBD5E1" w:sz="4"/>
+              <w:right w:val="single" w:color="CBD5E1" w:sz="4"/>
+            </w:tcBorders>
+            <w:tcMar>
+              <w:top w:type="dxa" w:w="100"/>
+              <w:left w:type="dxa" w:w="140"/>
+              <w:bottom w:type="dxa" w:w="100"/>
+              <w:right w:type="dxa" w:w="140"/>
+            </w:tcMar>
+          </w:tcPr>
+          <w:p>
+            <w:r>
+              <w:t xml:space="preserve"/>
+            </w:r>
+          </w:p>
+        </w:tc>
+        <w:tc>
+          <w:tcPr>
+            <w:tcW w:type="dxa" w:w="1800"/>
+            <w:tcBorders>
+              <w:top w:val="single" w:color="CBD5E1" w:sz="4"/>
+              <w:left w:val="single" w:color="CBD5E1" w:sz="4"/>
+              <w:bottom w:val="single" w:color="CBD5E1" w:sz="4"/>
+              <w:right w:val="single" w:color="CBD5E1" w:sz="4"/>
+            </w:tcBorders>
+            <w:tcMar>
+              <w:top w:type="dxa" w:w="100"/>
+              <w:left w:type="dxa" w:w="140"/>
+              <w:bottom w:type="dxa" w:w="100"/>
+              <w:right w:type="dxa" w:w="140"/>
+            </w:tcMar>
+          </w:tcPr>
+          <w:p>
+            <w:pPr>
+              <w:spacing w:after="40" w:before="40"/>
+            </w:pPr>
+            <w:r>
+              <w:rPr>
+                <w:rFonts w:ascii="Arial" w:cs="Arial" w:eastAsia="Arial" w:hAnsi="Arial"/>
+                <w:b/>
+                <w:bCs/>
+                <w:color w:val="1F2937"/>
+                <w:sz w:val="19"/>
+                <w:szCs w:val="19"/>
+              </w:rPr>
+              <w:t xml:space="preserve">Bảo mật mạng đa tầng</w:t>
+            </w:r>
+          </w:p>
+        </w:tc>
+        <w:tc>
+          <w:tcPr>
+            <w:tcW w:type="dxa" w:w="2200"/>
+            <w:tcBorders>
+              <w:top w:val="single" w:color="CBD5E1" w:sz="4"/>
+              <w:left w:val="single" w:color="CBD5E1" w:sz="4"/>
+              <w:bottom w:val="single" w:color="CBD5E1" w:sz="4"/>
+              <w:right w:val="single" w:color="CBD5E1" w:sz="4"/>
+            </w:tcBorders>
+            <w:tcMar>
+              <w:top w:type="dxa" w:w="100"/>
+              <w:left w:type="dxa" w:w="140"/>
+              <w:bottom w:type="dxa" w:w="100"/>
+              <w:right w:type="dxa" w:w="140"/>
+            </w:tcMar>
+          </w:tcPr>
+          <w:p>
+            <w:pPr>
+              <w:spacing w:after="40" w:before="40"/>
+            </w:pPr>
+            <w:r>
+              <w:rPr>
+                <w:rFonts w:ascii="Arial" w:cs="Arial" w:eastAsia="Arial" w:hAnsi="Arial"/>
+                <w:b w:val="false"/>
+                <w:bCs w:val="false"/>
+                <w:color w:val="1F2937"/>
+                <w:sz w:val="19"/>
+                <w:szCs w:val="19"/>
+              </w:rPr>
+              <w:t xml:space="preserve">Bucket4j, CORS, HSTS, CSP</w:t>
+            </w:r>
+          </w:p>
+        </w:tc>
+        <w:tc>
+          <w:tcPr>
+            <w:tcW w:type="dxa" w:w="3560"/>
+            <w:tcBorders>
+              <w:top w:val="single" w:color="CBD5E1" w:sz="4"/>
+              <w:left w:val="single" w:color="CBD5E1" w:sz="4"/>
+              <w:bottom w:val="single" w:color="CBD5E1" w:sz="4"/>
+              <w:right w:val="single" w:color="CBD5E1" w:sz="4"/>
+            </w:tcBorders>
+            <w:tcMar>
+              <w:top w:type="dxa" w:w="100"/>
+              <w:left w:type="dxa" w:w="140"/>
+              <w:bottom w:type="dxa" w:w="100"/>
+              <w:right w:type="dxa" w:w="140"/>
+            </w:tcMar>
+          </w:tcPr>
+          <w:p>
+            <w:pPr>
+              <w:spacing w:after="40" w:before="40"/>
+            </w:pPr>
+            <w:r>
+              <w:rPr>
+                <w:rFonts w:ascii="Arial" w:cs="Arial" w:eastAsia="Arial" w:hAnsi="Arial"/>
+                <w:b w:val="false"/>
+                <w:bCs w:val="false"/>
+                <w:color w:val="1F2937"/>
+                <w:sz w:val="19"/>
+                <w:szCs w:val="19"/>
+              </w:rPr>
+              <w:t xml:space="preserve">Giới hạn tốc độ request per IP, kiểm soát chặt domain gọi API qua CORS allowed origins, tiêu đề an ninh HTTP chống XSS/Clickjacking.</w:t>
+            </w:r>
+          </w:p>
+        </w:tc>
+      </w:tr>
+      <w:tr>
+        <w:tc>
+          <w:tcPr>
+            <w:tcW w:type="dxa" w:w="1800"/>
+            <w:tcBorders>
+              <w:top w:val="single" w:color="CBD5E1" w:sz="4"/>
+              <w:left w:val="single" w:color="CBD5E1" w:sz="4"/>
+              <w:bottom w:val="single" w:color="CBD5E1" w:sz="4"/>
+              <w:right w:val="single" w:color="CBD5E1" w:sz="4"/>
+            </w:tcBorders>
+            <w:tcMar>
+              <w:top w:type="dxa" w:w="100"/>
+              <w:left w:type="dxa" w:w="140"/>
+              <w:bottom w:type="dxa" w:w="100"/>
+              <w:right w:type="dxa" w:w="140"/>
+            </w:tcMar>
+          </w:tcPr>
+          <w:p>
+            <w:r>
+              <w:t xml:space="preserve"/>
+            </w:r>
+          </w:p>
+        </w:tc>
+        <w:tc>
+          <w:tcPr>
+            <w:tcW w:type="dxa" w:w="1800"/>
+            <w:tcBorders>
+              <w:top w:val="single" w:color="CBD5E1" w:sz="4"/>
+              <w:left w:val="single" w:color="CBD5E1" w:sz="4"/>
+              <w:bottom w:val="single" w:color="CBD5E1" w:sz="4"/>
+              <w:right w:val="single" w:color="CBD5E1" w:sz="4"/>
+            </w:tcBorders>
+            <w:tcMar>
+              <w:top w:type="dxa" w:w="100"/>
+              <w:left w:type="dxa" w:w="140"/>
+              <w:bottom w:type="dxa" w:w="100"/>
+              <w:right w:type="dxa" w:w="140"/>
+            </w:tcMar>
+          </w:tcPr>
+          <w:p>
+            <w:pPr>
+              <w:spacing w:after="40" w:before="40"/>
+            </w:pPr>
+            <w:r>
+              <w:rPr>
+                <w:rFonts w:ascii="Arial" w:cs="Arial" w:eastAsia="Arial" w:hAnsi="Arial"/>
+                <w:b/>
+                <w:bCs/>
+                <w:color w:val="1F2937"/>
+                <w:sz w:val="19"/>
+                <w:szCs w:val="19"/>
+              </w:rPr>
+              <w:t xml:space="preserve">Gửi Email bất đồng bộ</w:t>
+            </w:r>
+          </w:p>
+        </w:tc>
+        <w:tc>
+          <w:tcPr>
+            <w:tcW w:type="dxa" w:w="2200"/>
+            <w:tcBorders>
+              <w:top w:val="single" w:color="CBD5E1" w:sz="4"/>
+              <w:left w:val="single" w:color="CBD5E1" w:sz="4"/>
+              <w:bottom w:val="single" w:color="CBD5E1" w:sz="4"/>
+              <w:right w:val="single" w:color="CBD5E1" w:sz="4"/>
+            </w:tcBorders>
+            <w:tcMar>
+              <w:top w:type="dxa" w:w="100"/>
+              <w:left w:type="dxa" w:w="140"/>
+              <w:bottom w:type="dxa" w:w="100"/>
+              <w:right w:type="dxa" w:w="140"/>
+            </w:tcMar>
+          </w:tcPr>
+          <w:p>
+            <w:pPr>
+              <w:spacing w:after="40" w:before="40"/>
+            </w:pPr>
+            <w:r>
+              <w:rPr>
+                <w:rFonts w:ascii="Arial" w:cs="Arial" w:eastAsia="Arial" w:hAnsi="Arial"/>
+                <w:b w:val="false"/>
+                <w:bCs w:val="false"/>
+                <w:color w:val="1F2937"/>
+                <w:sz w:val="19"/>
+                <w:szCs w:val="19"/>
+              </w:rPr>
+              <w:t xml:space="preserve">JavaMail, Resend HTTPS API</w:t>
+            </w:r>
+          </w:p>
+        </w:tc>
+        <w:tc>
+          <w:tcPr>
+            <w:tcW w:type="dxa" w:w="3560"/>
+            <w:tcBorders>
+              <w:top w:val="single" w:color="CBD5E1" w:sz="4"/>
+              <w:left w:val="single" w:color="CBD5E1" w:sz="4"/>
+              <w:bottom w:val="single" w:color="CBD5E1" w:sz="4"/>
+              <w:right w:val="single" w:color="CBD5E1" w:sz="4"/>
+            </w:tcBorders>
+            <w:tcMar>
+              <w:top w:type="dxa" w:w="100"/>
+              <w:left w:type="dxa" w:w="140"/>
+              <w:bottom w:type="dxa" w:w="100"/>
+              <w:right w:type="dxa" w:w="140"/>
+            </w:tcMar>
+          </w:tcPr>
+          <w:p>
+            <w:pPr>
+              <w:spacing w:after="40" w:before="40"/>
+            </w:pPr>
+            <w:r>
+              <w:rPr>
+                <w:rFonts w:ascii="Arial" w:cs="Arial" w:eastAsia="Arial" w:hAnsi="Arial"/>
+                <w:b w:val="false"/>
+                <w:bCs w:val="false"/>
+                <w:color w:val="1F2937"/>
+                <w:sz w:val="19"/>
+                <w:szCs w:val="19"/>
+              </w:rPr>
+              <w:t xml:space="preserve">Kiến trúc Dual Mail Sender: tự động chuyển đổi giữa Gmail SMTP và Resend API (cổng 443 không bị chặn bởi đám mây).</w:t>
+            </w:r>
+          </w:p>
+        </w:tc>
+      </w:tr>
+      <w:tr>
+        <w:tc>
+          <w:tcPr>
+            <w:tcW w:type="dxa" w:w="1800"/>
+            <w:tcBorders>
+              <w:top w:val="single" w:color="CBD5E1" w:sz="4"/>
+              <w:left w:val="single" w:color="CBD5E1" w:sz="4"/>
+              <w:bottom w:val="single" w:color="CBD5E1" w:sz="4"/>
+              <w:right w:val="single" w:color="CBD5E1" w:sz="4"/>
+            </w:tcBorders>
+            <w:tcMar>
+              <w:top w:type="dxa" w:w="100"/>
+              <w:left w:type="dxa" w:w="140"/>
+              <w:bottom w:type="dxa" w:w="100"/>
+              <w:right w:type="dxa" w:w="140"/>
+            </w:tcMar>
+          </w:tcPr>
+          <w:p>
+            <w:r>
+              <w:t xml:space="preserve"/>
+            </w:r>
+          </w:p>
+        </w:tc>
+        <w:tc>
+          <w:tcPr>
+            <w:tcW w:type="dxa" w:w="1800"/>
+            <w:tcBorders>
+              <w:top w:val="single" w:color="CBD5E1" w:sz="4"/>
+              <w:left w:val="single" w:color="CBD5E1" w:sz="4"/>
+              <w:bottom w:val="single" w:color="CBD5E1" w:sz="4"/>
+              <w:right w:val="single" w:color="CBD5E1" w:sz="4"/>
+            </w:tcBorders>
+            <w:tcMar>
+              <w:top w:type="dxa" w:w="100"/>
+              <w:left w:type="dxa" w:w="140"/>
+              <w:bottom w:type="dxa" w:w="100"/>
+              <w:right w:type="dxa" w:w="140"/>
+            </w:tcMar>
+          </w:tcPr>
+          <w:p>
+            <w:pPr>
+              <w:spacing w:after="40" w:before="40"/>
+            </w:pPr>
+            <w:r>
+              <w:rPr>
+                <w:rFonts w:ascii="Arial" w:cs="Arial" w:eastAsia="Arial" w:hAnsi="Arial"/>
+                <w:b/>
+                <w:bCs/>
+                <w:color w:val="1F2937"/>
+                <w:sz w:val="19"/>
+                <w:szCs w:val="19"/>
+              </w:rPr>
+              <w:t xml:space="preserve">Cơ sở dữ liệu &amp; DevOps</w:t>
+            </w:r>
+          </w:p>
+        </w:tc>
+        <w:tc>
+          <w:tcPr>
+            <w:tcW w:type="dxa" w:w="2200"/>
+            <w:tcBorders>
+              <w:top w:val="single" w:color="CBD5E1" w:sz="4"/>
+              <w:left w:val="single" w:color="CBD5E1" w:sz="4"/>
+              <w:bottom w:val="single" w:color="CBD5E1" w:sz="4"/>
+              <w:right w:val="single" w:color="CBD5E1" w:sz="4"/>
+            </w:tcBorders>
+            <w:tcMar>
+              <w:top w:type="dxa" w:w="100"/>
+              <w:left w:type="dxa" w:w="140"/>
+              <w:bottom w:type="dxa" w:w="100"/>
+              <w:right w:type="dxa" w:w="140"/>
+            </w:tcMar>
+          </w:tcPr>
+          <w:p>
+            <w:pPr>
+              <w:spacing w:after="40" w:before="40"/>
+            </w:pPr>
+            <w:r>
+              <w:rPr>
+                <w:rFonts w:ascii="Arial" w:cs="Arial" w:eastAsia="Arial" w:hAnsi="Arial"/>
+                <w:b w:val="false"/>
+                <w:bCs w:val="false"/>
+                <w:color w:val="1F2937"/>
+                <w:sz w:val="19"/>
+                <w:szCs w:val="19"/>
+              </w:rPr>
+              <w:t xml:space="preserve">Supabase PostgreSQL, Flyway</w:t>
+            </w:r>
+          </w:p>
+        </w:tc>
+        <w:tc>
+          <w:tcPr>
+            <w:tcW w:type="dxa" w:w="3560"/>
+            <w:tcBorders>
+              <w:top w:val="single" w:color="CBD5E1" w:sz="4"/>
+              <w:left w:val="single" w:color="CBD5E1" w:sz="4"/>
+              <w:bottom w:val="single" w:color="CBD5E1" w:sz="4"/>
+              <w:right w:val="single" w:color="CBD5E1" w:sz="4"/>
+            </w:tcBorders>
+            <w:tcMar>
+              <w:top w:type="dxa" w:w="100"/>
+              <w:left w:type="dxa" w:w="140"/>
+              <w:bottom w:type="dxa" w:w="100"/>
+              <w:right w:type="dxa" w:w="140"/>
+            </w:tcMar>
+          </w:tcPr>
+          <w:p>
+            <w:pPr>
+              <w:spacing w:after="40" w:before="40"/>
+            </w:pPr>
+            <w:r>
+              <w:rPr>
+                <w:rFonts w:ascii="Arial" w:cs="Arial" w:eastAsia="Arial" w:hAnsi="Arial"/>
+                <w:b w:val="false"/>
+                <w:bCs w:val="false"/>
+                <w:color w:val="1F2937"/>
+                <w:sz w:val="19"/>
+                <w:szCs w:val="19"/>
+              </w:rPr>
+              <w:t xml:space="preserve">Quản lý 11 bảng CSDL, tự động nạp dữ liệu và kiểm soát phiên bản qua Flyway migrations (</w:t>
+            </w:r>
+            <w:r>
+              <w:rPr>
+                <w:rFonts w:ascii="Consolas" w:cs="Consolas" w:eastAsia="Consolas" w:hAnsi="Consolas"/>
+                <w:color w:val="0F172A"/>
+                <w:sz w:val="17"/>
+                <w:szCs w:val="17"/>
+                <w:shd w:fill="F1F5F9" w:color="auto" w:val="solid"/>
+              </w:rPr>
+              <w:t xml:space="preserve">V1__schema.sql</w:t>
+            </w:r>
+            <w:r>
+              <w:rPr>
+                <w:rFonts w:ascii="Arial" w:cs="Arial" w:eastAsia="Arial" w:hAnsi="Arial"/>
+                <w:b w:val="false"/>
+                <w:bCs w:val="false"/>
+                <w:color w:val="1F2937"/>
+                <w:sz w:val="19"/>
+                <w:szCs w:val="19"/>
+              </w:rPr>
+              <w:t xml:space="preserve">, </w:t>
+            </w:r>
+            <w:r>
+              <w:rPr>
+                <w:rFonts w:ascii="Consolas" w:cs="Consolas" w:eastAsia="Consolas" w:hAnsi="Consolas"/>
+                <w:color w:val="0F172A"/>
+                <w:sz w:val="17"/>
+                <w:szCs w:val="17"/>
+                <w:shd w:fill="F1F5F9" w:color="auto" w:val="solid"/>
+              </w:rPr>
+              <w:t xml:space="preserve">V2__seed.sql</w:t>
+            </w:r>
+            <w:r>
+              <w:rPr>
+                <w:rFonts w:ascii="Arial" w:cs="Arial" w:eastAsia="Arial" w:hAnsi="Arial"/>
+                <w:b w:val="false"/>
+                <w:bCs w:val="false"/>
+                <w:color w:val="1F2937"/>
+                <w:sz w:val="19"/>
+                <w:szCs w:val="19"/>
+              </w:rPr>
+              <w:t xml:space="preserve">).</w:t>
+            </w:r>
+          </w:p>
+        </w:tc>
+      </w:tr>
+    </w:tbl>
+    <w:p>
+      <w:pPr>
+        <w:spacing w:after="140"/>
       </w:pPr>
     </w:p>
     <w:p>
@@ -8975,7 +10898,7 @@
       <w:r>
         <w:drawing>
           <wp:inline distT="0" distB="0" distL="0" distR="0">
-            <wp:extent cx="5334000" cy="1666875"/>
+            <wp:extent cx="5429250" cy="2800350"/>
             <wp:effectExtent t="0" r="0" b="0" l="0"/>
             <wp:docPr id="1" name="" descr="" title=""/>
             <wp:cNvGraphicFramePr>
@@ -9000,7 +10923,7 @@
                   <pic:spPr bwMode="auto">
                     <a:xfrm>
                       <a:off x="0" y="0"/>
-                      <a:ext cx="5334000" cy="1666875"/>
+                      <a:ext cx="5429250" cy="2800350"/>
                     </a:xfrm>
                     <a:prstGeom prst="rect">
                       <a:avLst/>
@@ -9029,6 +10952,1559 @@
         </w:rPr>
         <w:t xml:space="preserve">Hình: Sơ đồ thực thể liên kết ERD</w:t>
       </w:r>
+    </w:p>
+    <w:p>
+      <w:pPr>
+        <w:pStyle w:val="Heading3"/>
+        <w:spacing w:after="80" w:before="180"/>
+      </w:pPr>
+      <w:r>
+        <w:rPr>
+          <w:rFonts w:ascii="Arial" w:cs="Arial" w:eastAsia="Arial" w:hAnsi="Arial"/>
+          <w:b/>
+          <w:bCs/>
+          <w:color w:val="334155"/>
+          <w:sz w:val="22"/>
+          <w:szCs w:val="22"/>
+        </w:rPr>
+        <w:t xml:space="preserve">Bảng 5.1: Danh mục quan hệ và ràng buộc khóa giữa các thực thể CSDL</w:t>
+      </w:r>
+    </w:p>
+    <w:tbl>
+      <w:tblPr>
+        <w:tblW w:type="dxa" w:w="9360"/>
+        <w:tblBorders>
+          <w:top w:val="single" w:color="auto" w:sz="4"/>
+          <w:left w:val="single" w:color="auto" w:sz="4"/>
+          <w:bottom w:val="single" w:color="auto" w:sz="4"/>
+          <w:right w:val="single" w:color="auto" w:sz="4"/>
+          <w:insideH w:val="single" w:color="auto" w:sz="4"/>
+          <w:insideV w:val="single" w:color="auto" w:sz="4"/>
+        </w:tblBorders>
+      </w:tblPr>
+      <w:tblGrid>
+        <w:gridCol w:w="1800"/>
+        <w:gridCol w:w="1800"/>
+        <w:gridCol w:w="2200"/>
+        <w:gridCol w:w="3560"/>
+      </w:tblGrid>
+      <w:tr>
+        <w:trPr>
+          <w:tblHeader/>
+        </w:trPr>
+        <w:tc>
+          <w:tcPr>
+            <w:tcW w:type="dxa" w:w="1800"/>
+            <w:tcBorders>
+              <w:top w:val="single" w:color="CBD5E1" w:sz="4"/>
+              <w:left w:val="single" w:color="CBD5E1" w:sz="4"/>
+              <w:bottom w:val="single" w:color="CBD5E1" w:sz="4"/>
+              <w:right w:val="single" w:color="CBD5E1" w:sz="4"/>
+            </w:tcBorders>
+            <w:shd w:fill="1E3A8A" w:color="auto" w:val="solid"/>
+            <w:tcMar>
+              <w:top w:type="dxa" w:w="100"/>
+              <w:left w:type="dxa" w:w="140"/>
+              <w:bottom w:type="dxa" w:w="100"/>
+              <w:right w:type="dxa" w:w="140"/>
+            </w:tcMar>
+          </w:tcPr>
+          <w:p>
+            <w:pPr>
+              <w:spacing w:after="40" w:before="40"/>
+            </w:pPr>
+            <w:r>
+              <w:rPr>
+                <w:rFonts w:ascii="Arial" w:cs="Arial" w:eastAsia="Arial" w:hAnsi="Arial"/>
+                <w:b/>
+                <w:bCs/>
+                <w:color w:val="FFFFFF"/>
+                <w:sz w:val="19"/>
+                <w:szCs w:val="19"/>
+              </w:rPr>
+              <w:t xml:space="preserve">Thực thể cha (Parent)</w:t>
+            </w:r>
+          </w:p>
+        </w:tc>
+        <w:tc>
+          <w:tcPr>
+            <w:tcW w:type="dxa" w:w="1800"/>
+            <w:tcBorders>
+              <w:top w:val="single" w:color="CBD5E1" w:sz="4"/>
+              <w:left w:val="single" w:color="CBD5E1" w:sz="4"/>
+              <w:bottom w:val="single" w:color="CBD5E1" w:sz="4"/>
+              <w:right w:val="single" w:color="CBD5E1" w:sz="4"/>
+            </w:tcBorders>
+            <w:shd w:fill="1E3A8A" w:color="auto" w:val="solid"/>
+            <w:tcMar>
+              <w:top w:type="dxa" w:w="100"/>
+              <w:left w:type="dxa" w:w="140"/>
+              <w:bottom w:type="dxa" w:w="100"/>
+              <w:right w:type="dxa" w:w="140"/>
+            </w:tcMar>
+          </w:tcPr>
+          <w:p>
+            <w:pPr>
+              <w:spacing w:after="40" w:before="40"/>
+            </w:pPr>
+            <w:r>
+              <w:rPr>
+                <w:rFonts w:ascii="Arial" w:cs="Arial" w:eastAsia="Arial" w:hAnsi="Arial"/>
+                <w:b/>
+                <w:bCs/>
+                <w:color w:val="FFFFFF"/>
+                <w:sz w:val="19"/>
+                <w:szCs w:val="19"/>
+              </w:rPr>
+              <w:t xml:space="preserve">Bản số (Cardinality)</w:t>
+            </w:r>
+          </w:p>
+        </w:tc>
+        <w:tc>
+          <w:tcPr>
+            <w:tcW w:type="dxa" w:w="2200"/>
+            <w:tcBorders>
+              <w:top w:val="single" w:color="CBD5E1" w:sz="4"/>
+              <w:left w:val="single" w:color="CBD5E1" w:sz="4"/>
+              <w:bottom w:val="single" w:color="CBD5E1" w:sz="4"/>
+              <w:right w:val="single" w:color="CBD5E1" w:sz="4"/>
+            </w:tcBorders>
+            <w:shd w:fill="1E3A8A" w:color="auto" w:val="solid"/>
+            <w:tcMar>
+              <w:top w:type="dxa" w:w="100"/>
+              <w:left w:type="dxa" w:w="140"/>
+              <w:bottom w:type="dxa" w:w="100"/>
+              <w:right w:type="dxa" w:w="140"/>
+            </w:tcMar>
+          </w:tcPr>
+          <w:p>
+            <w:pPr>
+              <w:spacing w:after="40" w:before="40"/>
+            </w:pPr>
+            <w:r>
+              <w:rPr>
+                <w:rFonts w:ascii="Arial" w:cs="Arial" w:eastAsia="Arial" w:hAnsi="Arial"/>
+                <w:b/>
+                <w:bCs/>
+                <w:color w:val="FFFFFF"/>
+                <w:sz w:val="19"/>
+                <w:szCs w:val="19"/>
+              </w:rPr>
+              <w:t xml:space="preserve">Thực thể con (Child)</w:t>
+            </w:r>
+          </w:p>
+        </w:tc>
+        <w:tc>
+          <w:tcPr>
+            <w:tcW w:type="dxa" w:w="3560"/>
+            <w:tcBorders>
+              <w:top w:val="single" w:color="CBD5E1" w:sz="4"/>
+              <w:left w:val="single" w:color="CBD5E1" w:sz="4"/>
+              <w:bottom w:val="single" w:color="CBD5E1" w:sz="4"/>
+              <w:right w:val="single" w:color="CBD5E1" w:sz="4"/>
+            </w:tcBorders>
+            <w:shd w:fill="1E3A8A" w:color="auto" w:val="solid"/>
+            <w:tcMar>
+              <w:top w:type="dxa" w:w="100"/>
+              <w:left w:type="dxa" w:w="140"/>
+              <w:bottom w:type="dxa" w:w="100"/>
+              <w:right w:type="dxa" w:w="140"/>
+            </w:tcMar>
+          </w:tcPr>
+          <w:p>
+            <w:pPr>
+              <w:spacing w:after="40" w:before="40"/>
+            </w:pPr>
+            <w:r>
+              <w:rPr>
+                <w:rFonts w:ascii="Arial" w:cs="Arial" w:eastAsia="Arial" w:hAnsi="Arial"/>
+                <w:b/>
+                <w:bCs/>
+                <w:color w:val="FFFFFF"/>
+                <w:sz w:val="19"/>
+                <w:szCs w:val="19"/>
+              </w:rPr>
+              <w:t xml:space="preserve">Khóa ngoại (FK) &amp; Ràng buộc toàn vẹn</w:t>
+            </w:r>
+          </w:p>
+        </w:tc>
+      </w:tr>
+      <w:tr>
+        <w:tc>
+          <w:tcPr>
+            <w:tcW w:type="dxa" w:w="1800"/>
+            <w:tcBorders>
+              <w:top w:val="single" w:color="CBD5E1" w:sz="4"/>
+              <w:left w:val="single" w:color="CBD5E1" w:sz="4"/>
+              <w:bottom w:val="single" w:color="CBD5E1" w:sz="4"/>
+              <w:right w:val="single" w:color="CBD5E1" w:sz="4"/>
+            </w:tcBorders>
+            <w:tcMar>
+              <w:top w:type="dxa" w:w="100"/>
+              <w:left w:type="dxa" w:w="140"/>
+              <w:bottom w:type="dxa" w:w="100"/>
+              <w:right w:type="dxa" w:w="140"/>
+            </w:tcMar>
+          </w:tcPr>
+          <w:p>
+            <w:pPr>
+              <w:spacing w:after="40" w:before="40"/>
+            </w:pPr>
+            <w:r>
+              <w:rPr>
+                <w:rFonts w:ascii="Arial" w:cs="Arial" w:eastAsia="Arial" w:hAnsi="Arial"/>
+                <w:b/>
+                <w:bCs/>
+                <w:color w:val="1F2937"/>
+                <w:sz w:val="19"/>
+                <w:szCs w:val="19"/>
+              </w:rPr>
+              <w:t xml:space="preserve">users</w:t>
+            </w:r>
+          </w:p>
+        </w:tc>
+        <w:tc>
+          <w:tcPr>
+            <w:tcW w:type="dxa" w:w="1800"/>
+            <w:tcBorders>
+              <w:top w:val="single" w:color="CBD5E1" w:sz="4"/>
+              <w:left w:val="single" w:color="CBD5E1" w:sz="4"/>
+              <w:bottom w:val="single" w:color="CBD5E1" w:sz="4"/>
+              <w:right w:val="single" w:color="CBD5E1" w:sz="4"/>
+            </w:tcBorders>
+            <w:tcMar>
+              <w:top w:type="dxa" w:w="100"/>
+              <w:left w:type="dxa" w:w="140"/>
+              <w:bottom w:type="dxa" w:w="100"/>
+              <w:right w:type="dxa" w:w="140"/>
+            </w:tcMar>
+          </w:tcPr>
+          <w:p>
+            <w:pPr>
+              <w:spacing w:after="40" w:before="40"/>
+            </w:pPr>
+            <w:r>
+              <w:rPr>
+                <w:rFonts w:ascii="Arial" w:cs="Arial" w:eastAsia="Arial" w:hAnsi="Arial"/>
+                <w:b w:val="false"/>
+                <w:bCs w:val="false"/>
+                <w:color w:val="1F2937"/>
+                <w:sz w:val="19"/>
+                <w:szCs w:val="19"/>
+              </w:rPr>
+              <w:t xml:space="preserve">1 — N *(Một - Nhiều)*</w:t>
+            </w:r>
+          </w:p>
+        </w:tc>
+        <w:tc>
+          <w:tcPr>
+            <w:tcW w:type="dxa" w:w="2200"/>
+            <w:tcBorders>
+              <w:top w:val="single" w:color="CBD5E1" w:sz="4"/>
+              <w:left w:val="single" w:color="CBD5E1" w:sz="4"/>
+              <w:bottom w:val="single" w:color="CBD5E1" w:sz="4"/>
+              <w:right w:val="single" w:color="CBD5E1" w:sz="4"/>
+            </w:tcBorders>
+            <w:tcMar>
+              <w:top w:type="dxa" w:w="100"/>
+              <w:left w:type="dxa" w:w="140"/>
+              <w:bottom w:type="dxa" w:w="100"/>
+              <w:right w:type="dxa" w:w="140"/>
+            </w:tcMar>
+          </w:tcPr>
+          <w:p>
+            <w:pPr>
+              <w:spacing w:after="40" w:before="40"/>
+            </w:pPr>
+            <w:r>
+              <w:rPr>
+                <w:rFonts w:ascii="Arial" w:cs="Arial" w:eastAsia="Arial" w:hAnsi="Arial"/>
+                <w:b/>
+                <w:bCs/>
+                <w:color w:val="1F2937"/>
+                <w:sz w:val="19"/>
+                <w:szCs w:val="19"/>
+              </w:rPr>
+              <w:t xml:space="preserve">refresh_tokens</w:t>
+            </w:r>
+          </w:p>
+        </w:tc>
+        <w:tc>
+          <w:tcPr>
+            <w:tcW w:type="dxa" w:w="3560"/>
+            <w:tcBorders>
+              <w:top w:val="single" w:color="CBD5E1" w:sz="4"/>
+              <w:left w:val="single" w:color="CBD5E1" w:sz="4"/>
+              <w:bottom w:val="single" w:color="CBD5E1" w:sz="4"/>
+              <w:right w:val="single" w:color="CBD5E1" w:sz="4"/>
+            </w:tcBorders>
+            <w:tcMar>
+              <w:top w:type="dxa" w:w="100"/>
+              <w:left w:type="dxa" w:w="140"/>
+              <w:bottom w:type="dxa" w:w="100"/>
+              <w:right w:type="dxa" w:w="140"/>
+            </w:tcMar>
+          </w:tcPr>
+          <w:p>
+            <w:pPr>
+              <w:spacing w:after="40" w:before="40"/>
+            </w:pPr>
+            <w:r>
+              <w:rPr>
+                <w:rFonts w:ascii="Consolas" w:cs="Consolas" w:eastAsia="Consolas" w:hAnsi="Consolas"/>
+                <w:color w:val="0F172A"/>
+                <w:sz w:val="17"/>
+                <w:szCs w:val="17"/>
+                <w:shd w:fill="F1F5F9" w:color="auto" w:val="solid"/>
+              </w:rPr>
+              <w:t xml:space="preserve">user_id</w:t>
+            </w:r>
+            <w:r>
+              <w:rPr>
+                <w:rFonts w:ascii="Arial" w:cs="Arial" w:eastAsia="Arial" w:hAnsi="Arial"/>
+                <w:b w:val="false"/>
+                <w:bCs w:val="false"/>
+                <w:color w:val="1F2937"/>
+                <w:sz w:val="19"/>
+                <w:szCs w:val="19"/>
+              </w:rPr>
+              <w:t xml:space="preserve"> FK → </w:t>
+            </w:r>
+            <w:r>
+              <w:rPr>
+                <w:rFonts w:ascii="Consolas" w:cs="Consolas" w:eastAsia="Consolas" w:hAnsi="Consolas"/>
+                <w:color w:val="0F172A"/>
+                <w:sz w:val="17"/>
+                <w:szCs w:val="17"/>
+                <w:shd w:fill="F1F5F9" w:color="auto" w:val="solid"/>
+              </w:rPr>
+              <w:t xml:space="preserve">users(id)</w:t>
+            </w:r>
+            <w:r>
+              <w:rPr>
+                <w:rFonts w:ascii="Arial" w:cs="Arial" w:eastAsia="Arial" w:hAnsi="Arial"/>
+                <w:b w:val="false"/>
+                <w:bCs w:val="false"/>
+                <w:color w:val="1F2937"/>
+                <w:sz w:val="19"/>
+                <w:szCs w:val="19"/>
+              </w:rPr>
+              <w:t xml:space="preserve"> (ON DELETE CASCADE, revoked status).</w:t>
+            </w:r>
+          </w:p>
+        </w:tc>
+      </w:tr>
+      <w:tr>
+        <w:tc>
+          <w:tcPr>
+            <w:tcW w:type="dxa" w:w="1800"/>
+            <w:tcBorders>
+              <w:top w:val="single" w:color="CBD5E1" w:sz="4"/>
+              <w:left w:val="single" w:color="CBD5E1" w:sz="4"/>
+              <w:bottom w:val="single" w:color="CBD5E1" w:sz="4"/>
+              <w:right w:val="single" w:color="CBD5E1" w:sz="4"/>
+            </w:tcBorders>
+            <w:tcMar>
+              <w:top w:type="dxa" w:w="100"/>
+              <w:left w:type="dxa" w:w="140"/>
+              <w:bottom w:type="dxa" w:w="100"/>
+              <w:right w:type="dxa" w:w="140"/>
+            </w:tcMar>
+          </w:tcPr>
+          <w:p>
+            <w:pPr>
+              <w:spacing w:after="40" w:before="40"/>
+            </w:pPr>
+            <w:r>
+              <w:rPr>
+                <w:rFonts w:ascii="Arial" w:cs="Arial" w:eastAsia="Arial" w:hAnsi="Arial"/>
+                <w:b/>
+                <w:bCs/>
+                <w:color w:val="1F2937"/>
+                <w:sz w:val="19"/>
+                <w:szCs w:val="19"/>
+              </w:rPr>
+              <w:t xml:space="preserve">users</w:t>
+            </w:r>
+          </w:p>
+        </w:tc>
+        <w:tc>
+          <w:tcPr>
+            <w:tcW w:type="dxa" w:w="1800"/>
+            <w:tcBorders>
+              <w:top w:val="single" w:color="CBD5E1" w:sz="4"/>
+              <w:left w:val="single" w:color="CBD5E1" w:sz="4"/>
+              <w:bottom w:val="single" w:color="CBD5E1" w:sz="4"/>
+              <w:right w:val="single" w:color="CBD5E1" w:sz="4"/>
+            </w:tcBorders>
+            <w:tcMar>
+              <w:top w:type="dxa" w:w="100"/>
+              <w:left w:type="dxa" w:w="140"/>
+              <w:bottom w:type="dxa" w:w="100"/>
+              <w:right w:type="dxa" w:w="140"/>
+            </w:tcMar>
+          </w:tcPr>
+          <w:p>
+            <w:pPr>
+              <w:spacing w:after="40" w:before="40"/>
+            </w:pPr>
+            <w:r>
+              <w:rPr>
+                <w:rFonts w:ascii="Arial" w:cs="Arial" w:eastAsia="Arial" w:hAnsi="Arial"/>
+                <w:b w:val="false"/>
+                <w:bCs w:val="false"/>
+                <w:color w:val="1F2937"/>
+                <w:sz w:val="19"/>
+                <w:szCs w:val="19"/>
+              </w:rPr>
+              <w:t xml:space="preserve">1 — 1 *(Một - Một)*</w:t>
+            </w:r>
+          </w:p>
+        </w:tc>
+        <w:tc>
+          <w:tcPr>
+            <w:tcW w:type="dxa" w:w="2200"/>
+            <w:tcBorders>
+              <w:top w:val="single" w:color="CBD5E1" w:sz="4"/>
+              <w:left w:val="single" w:color="CBD5E1" w:sz="4"/>
+              <w:bottom w:val="single" w:color="CBD5E1" w:sz="4"/>
+              <w:right w:val="single" w:color="CBD5E1" w:sz="4"/>
+            </w:tcBorders>
+            <w:tcMar>
+              <w:top w:type="dxa" w:w="100"/>
+              <w:left w:type="dxa" w:w="140"/>
+              <w:bottom w:type="dxa" w:w="100"/>
+              <w:right w:type="dxa" w:w="140"/>
+            </w:tcMar>
+          </w:tcPr>
+          <w:p>
+            <w:pPr>
+              <w:spacing w:after="40" w:before="40"/>
+            </w:pPr>
+            <w:r>
+              <w:rPr>
+                <w:rFonts w:ascii="Arial" w:cs="Arial" w:eastAsia="Arial" w:hAnsi="Arial"/>
+                <w:b/>
+                <w:bCs/>
+                <w:color w:val="1F2937"/>
+                <w:sz w:val="19"/>
+                <w:szCs w:val="19"/>
+              </w:rPr>
+              <w:t xml:space="preserve">profile</w:t>
+            </w:r>
+          </w:p>
+        </w:tc>
+        <w:tc>
+          <w:tcPr>
+            <w:tcW w:type="dxa" w:w="3560"/>
+            <w:tcBorders>
+              <w:top w:val="single" w:color="CBD5E1" w:sz="4"/>
+              <w:left w:val="single" w:color="CBD5E1" w:sz="4"/>
+              <w:bottom w:val="single" w:color="CBD5E1" w:sz="4"/>
+              <w:right w:val="single" w:color="CBD5E1" w:sz="4"/>
+            </w:tcBorders>
+            <w:tcMar>
+              <w:top w:type="dxa" w:w="100"/>
+              <w:left w:type="dxa" w:w="140"/>
+              <w:bottom w:type="dxa" w:w="100"/>
+              <w:right w:type="dxa" w:w="140"/>
+            </w:tcMar>
+          </w:tcPr>
+          <w:p>
+            <w:pPr>
+              <w:spacing w:after="40" w:before="40"/>
+            </w:pPr>
+            <w:r>
+              <w:rPr>
+                <w:rFonts w:ascii="Arial" w:cs="Arial" w:eastAsia="Arial" w:hAnsi="Arial"/>
+                <w:b w:val="false"/>
+                <w:bCs w:val="false"/>
+                <w:color w:val="1F2937"/>
+                <w:sz w:val="19"/>
+                <w:szCs w:val="19"/>
+              </w:rPr>
+              <w:t xml:space="preserve">Quản lý thông tin hồ sơ cá nhân và tiểu sử hiển thị.</w:t>
+            </w:r>
+          </w:p>
+        </w:tc>
+      </w:tr>
+      <w:tr>
+        <w:tc>
+          <w:tcPr>
+            <w:tcW w:type="dxa" w:w="1800"/>
+            <w:tcBorders>
+              <w:top w:val="single" w:color="CBD5E1" w:sz="4"/>
+              <w:left w:val="single" w:color="CBD5E1" w:sz="4"/>
+              <w:bottom w:val="single" w:color="CBD5E1" w:sz="4"/>
+              <w:right w:val="single" w:color="CBD5E1" w:sz="4"/>
+            </w:tcBorders>
+            <w:tcMar>
+              <w:top w:type="dxa" w:w="100"/>
+              <w:left w:type="dxa" w:w="140"/>
+              <w:bottom w:type="dxa" w:w="100"/>
+              <w:right w:type="dxa" w:w="140"/>
+            </w:tcMar>
+          </w:tcPr>
+          <w:p>
+            <w:pPr>
+              <w:spacing w:after="40" w:before="40"/>
+            </w:pPr>
+            <w:r>
+              <w:rPr>
+                <w:rFonts w:ascii="Arial" w:cs="Arial" w:eastAsia="Arial" w:hAnsi="Arial"/>
+                <w:b/>
+                <w:bCs/>
+                <w:color w:val="1F2937"/>
+                <w:sz w:val="19"/>
+                <w:szCs w:val="19"/>
+              </w:rPr>
+              <w:t xml:space="preserve">users</w:t>
+            </w:r>
+          </w:p>
+        </w:tc>
+        <w:tc>
+          <w:tcPr>
+            <w:tcW w:type="dxa" w:w="1800"/>
+            <w:tcBorders>
+              <w:top w:val="single" w:color="CBD5E1" w:sz="4"/>
+              <w:left w:val="single" w:color="CBD5E1" w:sz="4"/>
+              <w:bottom w:val="single" w:color="CBD5E1" w:sz="4"/>
+              <w:right w:val="single" w:color="CBD5E1" w:sz="4"/>
+            </w:tcBorders>
+            <w:tcMar>
+              <w:top w:type="dxa" w:w="100"/>
+              <w:left w:type="dxa" w:w="140"/>
+              <w:bottom w:type="dxa" w:w="100"/>
+              <w:right w:type="dxa" w:w="140"/>
+            </w:tcMar>
+          </w:tcPr>
+          <w:p>
+            <w:pPr>
+              <w:spacing w:after="40" w:before="40"/>
+            </w:pPr>
+            <w:r>
+              <w:rPr>
+                <w:rFonts w:ascii="Arial" w:cs="Arial" w:eastAsia="Arial" w:hAnsi="Arial"/>
+                <w:b w:val="false"/>
+                <w:bCs w:val="false"/>
+                <w:color w:val="1F2937"/>
+                <w:sz w:val="19"/>
+                <w:szCs w:val="19"/>
+              </w:rPr>
+              <w:t xml:space="preserve">1 — N *(Một - Nhiều)*</w:t>
+            </w:r>
+          </w:p>
+        </w:tc>
+        <w:tc>
+          <w:tcPr>
+            <w:tcW w:type="dxa" w:w="2200"/>
+            <w:tcBorders>
+              <w:top w:val="single" w:color="CBD5E1" w:sz="4"/>
+              <w:left w:val="single" w:color="CBD5E1" w:sz="4"/>
+              <w:bottom w:val="single" w:color="CBD5E1" w:sz="4"/>
+              <w:right w:val="single" w:color="CBD5E1" w:sz="4"/>
+            </w:tcBorders>
+            <w:tcMar>
+              <w:top w:type="dxa" w:w="100"/>
+              <w:left w:type="dxa" w:w="140"/>
+              <w:bottom w:type="dxa" w:w="100"/>
+              <w:right w:type="dxa" w:w="140"/>
+            </w:tcMar>
+          </w:tcPr>
+          <w:p>
+            <w:pPr>
+              <w:spacing w:after="40" w:before="40"/>
+            </w:pPr>
+            <w:r>
+              <w:rPr>
+                <w:rFonts w:ascii="Arial" w:cs="Arial" w:eastAsia="Arial" w:hAnsi="Arial"/>
+                <w:b/>
+                <w:bCs/>
+                <w:color w:val="1F2937"/>
+                <w:sz w:val="19"/>
+                <w:szCs w:val="19"/>
+              </w:rPr>
+              <w:t xml:space="preserve">posts</w:t>
+            </w:r>
+          </w:p>
+        </w:tc>
+        <w:tc>
+          <w:tcPr>
+            <w:tcW w:type="dxa" w:w="3560"/>
+            <w:tcBorders>
+              <w:top w:val="single" w:color="CBD5E1" w:sz="4"/>
+              <w:left w:val="single" w:color="CBD5E1" w:sz="4"/>
+              <w:bottom w:val="single" w:color="CBD5E1" w:sz="4"/>
+              <w:right w:val="single" w:color="CBD5E1" w:sz="4"/>
+            </w:tcBorders>
+            <w:tcMar>
+              <w:top w:type="dxa" w:w="100"/>
+              <w:left w:type="dxa" w:w="140"/>
+              <w:bottom w:type="dxa" w:w="100"/>
+              <w:right w:type="dxa" w:w="140"/>
+            </w:tcMar>
+          </w:tcPr>
+          <w:p>
+            <w:pPr>
+              <w:spacing w:after="40" w:before="40"/>
+            </w:pPr>
+            <w:r>
+              <w:rPr>
+                <w:rFonts w:ascii="Arial" w:cs="Arial" w:eastAsia="Arial" w:hAnsi="Arial"/>
+                <w:b w:val="false"/>
+                <w:bCs w:val="false"/>
+                <w:color w:val="1F2937"/>
+                <w:sz w:val="19"/>
+                <w:szCs w:val="19"/>
+              </w:rPr>
+              <w:t xml:space="preserve">Quản lý danh sách và xuất bản các bài viết kỹ thuật trên blog.</w:t>
+            </w:r>
+          </w:p>
+        </w:tc>
+      </w:tr>
+      <w:tr>
+        <w:tc>
+          <w:tcPr>
+            <w:tcW w:type="dxa" w:w="1800"/>
+            <w:tcBorders>
+              <w:top w:val="single" w:color="CBD5E1" w:sz="4"/>
+              <w:left w:val="single" w:color="CBD5E1" w:sz="4"/>
+              <w:bottom w:val="single" w:color="CBD5E1" w:sz="4"/>
+              <w:right w:val="single" w:color="CBD5E1" w:sz="4"/>
+            </w:tcBorders>
+            <w:tcMar>
+              <w:top w:type="dxa" w:w="100"/>
+              <w:left w:type="dxa" w:w="140"/>
+              <w:bottom w:type="dxa" w:w="100"/>
+              <w:right w:type="dxa" w:w="140"/>
+            </w:tcMar>
+          </w:tcPr>
+          <w:p>
+            <w:pPr>
+              <w:spacing w:after="40" w:before="40"/>
+            </w:pPr>
+            <w:r>
+              <w:rPr>
+                <w:rFonts w:ascii="Arial" w:cs="Arial" w:eastAsia="Arial" w:hAnsi="Arial"/>
+                <w:b/>
+                <w:bCs/>
+                <w:color w:val="1F2937"/>
+                <w:sz w:val="19"/>
+                <w:szCs w:val="19"/>
+              </w:rPr>
+              <w:t xml:space="preserve">profile</w:t>
+            </w:r>
+          </w:p>
+        </w:tc>
+        <w:tc>
+          <w:tcPr>
+            <w:tcW w:type="dxa" w:w="1800"/>
+            <w:tcBorders>
+              <w:top w:val="single" w:color="CBD5E1" w:sz="4"/>
+              <w:left w:val="single" w:color="CBD5E1" w:sz="4"/>
+              <w:bottom w:val="single" w:color="CBD5E1" w:sz="4"/>
+              <w:right w:val="single" w:color="CBD5E1" w:sz="4"/>
+            </w:tcBorders>
+            <w:tcMar>
+              <w:top w:type="dxa" w:w="100"/>
+              <w:left w:type="dxa" w:w="140"/>
+              <w:bottom w:type="dxa" w:w="100"/>
+              <w:right w:type="dxa" w:w="140"/>
+            </w:tcMar>
+          </w:tcPr>
+          <w:p>
+            <w:pPr>
+              <w:spacing w:after="40" w:before="40"/>
+            </w:pPr>
+            <w:r>
+              <w:rPr>
+                <w:rFonts w:ascii="Arial" w:cs="Arial" w:eastAsia="Arial" w:hAnsi="Arial"/>
+                <w:b w:val="false"/>
+                <w:bCs w:val="false"/>
+                <w:color w:val="1F2937"/>
+                <w:sz w:val="19"/>
+                <w:szCs w:val="19"/>
+              </w:rPr>
+              <w:t xml:space="preserve">1 — N *(Một - Nhiều)*</w:t>
+            </w:r>
+          </w:p>
+        </w:tc>
+        <w:tc>
+          <w:tcPr>
+            <w:tcW w:type="dxa" w:w="2200"/>
+            <w:tcBorders>
+              <w:top w:val="single" w:color="CBD5E1" w:sz="4"/>
+              <w:left w:val="single" w:color="CBD5E1" w:sz="4"/>
+              <w:bottom w:val="single" w:color="CBD5E1" w:sz="4"/>
+              <w:right w:val="single" w:color="CBD5E1" w:sz="4"/>
+            </w:tcBorders>
+            <w:tcMar>
+              <w:top w:type="dxa" w:w="100"/>
+              <w:left w:type="dxa" w:w="140"/>
+              <w:bottom w:type="dxa" w:w="100"/>
+              <w:right w:type="dxa" w:w="140"/>
+            </w:tcMar>
+          </w:tcPr>
+          <w:p>
+            <w:pPr>
+              <w:spacing w:after="40" w:before="40"/>
+            </w:pPr>
+            <w:r>
+              <w:rPr>
+                <w:rFonts w:ascii="Arial" w:cs="Arial" w:eastAsia="Arial" w:hAnsi="Arial"/>
+                <w:b/>
+                <w:bCs/>
+                <w:color w:val="1F2937"/>
+                <w:sz w:val="19"/>
+                <w:szCs w:val="19"/>
+              </w:rPr>
+              <w:t xml:space="preserve">skills</w:t>
+            </w:r>
+          </w:p>
+        </w:tc>
+        <w:tc>
+          <w:tcPr>
+            <w:tcW w:type="dxa" w:w="3560"/>
+            <w:tcBorders>
+              <w:top w:val="single" w:color="CBD5E1" w:sz="4"/>
+              <w:left w:val="single" w:color="CBD5E1" w:sz="4"/>
+              <w:bottom w:val="single" w:color="CBD5E1" w:sz="4"/>
+              <w:right w:val="single" w:color="CBD5E1" w:sz="4"/>
+            </w:tcBorders>
+            <w:tcMar>
+              <w:top w:type="dxa" w:w="100"/>
+              <w:left w:type="dxa" w:w="140"/>
+              <w:bottom w:type="dxa" w:w="100"/>
+              <w:right w:type="dxa" w:w="140"/>
+            </w:tcMar>
+          </w:tcPr>
+          <w:p>
+            <w:pPr>
+              <w:spacing w:after="40" w:before="40"/>
+            </w:pPr>
+            <w:r>
+              <w:rPr>
+                <w:rFonts w:ascii="Arial" w:cs="Arial" w:eastAsia="Arial" w:hAnsi="Arial"/>
+                <w:b w:val="false"/>
+                <w:bCs w:val="false"/>
+                <w:color w:val="1F2937"/>
+                <w:sz w:val="19"/>
+                <w:szCs w:val="19"/>
+              </w:rPr>
+              <w:t xml:space="preserve">Danh mục kỹ năng phân loại theo 5 nhóm chuyên môn.</w:t>
+            </w:r>
+          </w:p>
+        </w:tc>
+      </w:tr>
+      <w:tr>
+        <w:tc>
+          <w:tcPr>
+            <w:tcW w:type="dxa" w:w="1800"/>
+            <w:tcBorders>
+              <w:top w:val="single" w:color="CBD5E1" w:sz="4"/>
+              <w:left w:val="single" w:color="CBD5E1" w:sz="4"/>
+              <w:bottom w:val="single" w:color="CBD5E1" w:sz="4"/>
+              <w:right w:val="single" w:color="CBD5E1" w:sz="4"/>
+            </w:tcBorders>
+            <w:tcMar>
+              <w:top w:type="dxa" w:w="100"/>
+              <w:left w:type="dxa" w:w="140"/>
+              <w:bottom w:type="dxa" w:w="100"/>
+              <w:right w:type="dxa" w:w="140"/>
+            </w:tcMar>
+          </w:tcPr>
+          <w:p>
+            <w:pPr>
+              <w:spacing w:after="40" w:before="40"/>
+            </w:pPr>
+            <w:r>
+              <w:rPr>
+                <w:rFonts w:ascii="Arial" w:cs="Arial" w:eastAsia="Arial" w:hAnsi="Arial"/>
+                <w:b/>
+                <w:bCs/>
+                <w:color w:val="1F2937"/>
+                <w:sz w:val="19"/>
+                <w:szCs w:val="19"/>
+              </w:rPr>
+              <w:t xml:space="preserve">profile</w:t>
+            </w:r>
+          </w:p>
+        </w:tc>
+        <w:tc>
+          <w:tcPr>
+            <w:tcW w:type="dxa" w:w="1800"/>
+            <w:tcBorders>
+              <w:top w:val="single" w:color="CBD5E1" w:sz="4"/>
+              <w:left w:val="single" w:color="CBD5E1" w:sz="4"/>
+              <w:bottom w:val="single" w:color="CBD5E1" w:sz="4"/>
+              <w:right w:val="single" w:color="CBD5E1" w:sz="4"/>
+            </w:tcBorders>
+            <w:tcMar>
+              <w:top w:type="dxa" w:w="100"/>
+              <w:left w:type="dxa" w:w="140"/>
+              <w:bottom w:type="dxa" w:w="100"/>
+              <w:right w:type="dxa" w:w="140"/>
+            </w:tcMar>
+          </w:tcPr>
+          <w:p>
+            <w:pPr>
+              <w:spacing w:after="40" w:before="40"/>
+            </w:pPr>
+            <w:r>
+              <w:rPr>
+                <w:rFonts w:ascii="Arial" w:cs="Arial" w:eastAsia="Arial" w:hAnsi="Arial"/>
+                <w:b w:val="false"/>
+                <w:bCs w:val="false"/>
+                <w:color w:val="1F2937"/>
+                <w:sz w:val="19"/>
+                <w:szCs w:val="19"/>
+              </w:rPr>
+              <w:t xml:space="preserve">1 — N *(Một - Nhiều)*</w:t>
+            </w:r>
+          </w:p>
+        </w:tc>
+        <w:tc>
+          <w:tcPr>
+            <w:tcW w:type="dxa" w:w="2200"/>
+            <w:tcBorders>
+              <w:top w:val="single" w:color="CBD5E1" w:sz="4"/>
+              <w:left w:val="single" w:color="CBD5E1" w:sz="4"/>
+              <w:bottom w:val="single" w:color="CBD5E1" w:sz="4"/>
+              <w:right w:val="single" w:color="CBD5E1" w:sz="4"/>
+            </w:tcBorders>
+            <w:tcMar>
+              <w:top w:type="dxa" w:w="100"/>
+              <w:left w:type="dxa" w:w="140"/>
+              <w:bottom w:type="dxa" w:w="100"/>
+              <w:right w:type="dxa" w:w="140"/>
+            </w:tcMar>
+          </w:tcPr>
+          <w:p>
+            <w:pPr>
+              <w:spacing w:after="40" w:before="40"/>
+            </w:pPr>
+            <w:r>
+              <w:rPr>
+                <w:rFonts w:ascii="Arial" w:cs="Arial" w:eastAsia="Arial" w:hAnsi="Arial"/>
+                <w:b/>
+                <w:bCs/>
+                <w:color w:val="1F2937"/>
+                <w:sz w:val="19"/>
+                <w:szCs w:val="19"/>
+              </w:rPr>
+              <w:t xml:space="preserve">experiences</w:t>
+            </w:r>
+          </w:p>
+        </w:tc>
+        <w:tc>
+          <w:tcPr>
+            <w:tcW w:type="dxa" w:w="3560"/>
+            <w:tcBorders>
+              <w:top w:val="single" w:color="CBD5E1" w:sz="4"/>
+              <w:left w:val="single" w:color="CBD5E1" w:sz="4"/>
+              <w:bottom w:val="single" w:color="CBD5E1" w:sz="4"/>
+              <w:right w:val="single" w:color="CBD5E1" w:sz="4"/>
+            </w:tcBorders>
+            <w:tcMar>
+              <w:top w:type="dxa" w:w="100"/>
+              <w:left w:type="dxa" w:w="140"/>
+              <w:bottom w:type="dxa" w:w="100"/>
+              <w:right w:type="dxa" w:w="140"/>
+            </w:tcMar>
+          </w:tcPr>
+          <w:p>
+            <w:pPr>
+              <w:spacing w:after="40" w:before="40"/>
+            </w:pPr>
+            <w:r>
+              <w:rPr>
+                <w:rFonts w:ascii="Arial" w:cs="Arial" w:eastAsia="Arial" w:hAnsi="Arial"/>
+                <w:b w:val="false"/>
+                <w:bCs w:val="false"/>
+                <w:color w:val="1F2937"/>
+                <w:sz w:val="19"/>
+                <w:szCs w:val="19"/>
+              </w:rPr>
+              <w:t xml:space="preserve">Các mốc kinh nghiệm làm việc sắp xếp theo thứ tự thời gian.</w:t>
+            </w:r>
+          </w:p>
+        </w:tc>
+      </w:tr>
+      <w:tr>
+        <w:tc>
+          <w:tcPr>
+            <w:tcW w:type="dxa" w:w="1800"/>
+            <w:tcBorders>
+              <w:top w:val="single" w:color="CBD5E1" w:sz="4"/>
+              <w:left w:val="single" w:color="CBD5E1" w:sz="4"/>
+              <w:bottom w:val="single" w:color="CBD5E1" w:sz="4"/>
+              <w:right w:val="single" w:color="CBD5E1" w:sz="4"/>
+            </w:tcBorders>
+            <w:tcMar>
+              <w:top w:type="dxa" w:w="100"/>
+              <w:left w:type="dxa" w:w="140"/>
+              <w:bottom w:type="dxa" w:w="100"/>
+              <w:right w:type="dxa" w:w="140"/>
+            </w:tcMar>
+          </w:tcPr>
+          <w:p>
+            <w:pPr>
+              <w:spacing w:after="40" w:before="40"/>
+            </w:pPr>
+            <w:r>
+              <w:rPr>
+                <w:rFonts w:ascii="Arial" w:cs="Arial" w:eastAsia="Arial" w:hAnsi="Arial"/>
+                <w:b/>
+                <w:bCs/>
+                <w:color w:val="1F2937"/>
+                <w:sz w:val="19"/>
+                <w:szCs w:val="19"/>
+              </w:rPr>
+              <w:t xml:space="preserve">profile</w:t>
+            </w:r>
+          </w:p>
+        </w:tc>
+        <w:tc>
+          <w:tcPr>
+            <w:tcW w:type="dxa" w:w="1800"/>
+            <w:tcBorders>
+              <w:top w:val="single" w:color="CBD5E1" w:sz="4"/>
+              <w:left w:val="single" w:color="CBD5E1" w:sz="4"/>
+              <w:bottom w:val="single" w:color="CBD5E1" w:sz="4"/>
+              <w:right w:val="single" w:color="CBD5E1" w:sz="4"/>
+            </w:tcBorders>
+            <w:tcMar>
+              <w:top w:type="dxa" w:w="100"/>
+              <w:left w:type="dxa" w:w="140"/>
+              <w:bottom w:type="dxa" w:w="100"/>
+              <w:right w:type="dxa" w:w="140"/>
+            </w:tcMar>
+          </w:tcPr>
+          <w:p>
+            <w:pPr>
+              <w:spacing w:after="40" w:before="40"/>
+            </w:pPr>
+            <w:r>
+              <w:rPr>
+                <w:rFonts w:ascii="Arial" w:cs="Arial" w:eastAsia="Arial" w:hAnsi="Arial"/>
+                <w:b w:val="false"/>
+                <w:bCs w:val="false"/>
+                <w:color w:val="1F2937"/>
+                <w:sz w:val="19"/>
+                <w:szCs w:val="19"/>
+              </w:rPr>
+              <w:t xml:space="preserve">1 — N *(Một - Nhiều)*</w:t>
+            </w:r>
+          </w:p>
+        </w:tc>
+        <w:tc>
+          <w:tcPr>
+            <w:tcW w:type="dxa" w:w="2200"/>
+            <w:tcBorders>
+              <w:top w:val="single" w:color="CBD5E1" w:sz="4"/>
+              <w:left w:val="single" w:color="CBD5E1" w:sz="4"/>
+              <w:bottom w:val="single" w:color="CBD5E1" w:sz="4"/>
+              <w:right w:val="single" w:color="CBD5E1" w:sz="4"/>
+            </w:tcBorders>
+            <w:tcMar>
+              <w:top w:type="dxa" w:w="100"/>
+              <w:left w:type="dxa" w:w="140"/>
+              <w:bottom w:type="dxa" w:w="100"/>
+              <w:right w:type="dxa" w:w="140"/>
+            </w:tcMar>
+          </w:tcPr>
+          <w:p>
+            <w:pPr>
+              <w:spacing w:after="40" w:before="40"/>
+            </w:pPr>
+            <w:r>
+              <w:rPr>
+                <w:rFonts w:ascii="Arial" w:cs="Arial" w:eastAsia="Arial" w:hAnsi="Arial"/>
+                <w:b/>
+                <w:bCs/>
+                <w:color w:val="1F2937"/>
+                <w:sz w:val="19"/>
+                <w:szCs w:val="19"/>
+              </w:rPr>
+              <w:t xml:space="preserve">projects</w:t>
+            </w:r>
+          </w:p>
+        </w:tc>
+        <w:tc>
+          <w:tcPr>
+            <w:tcW w:type="dxa" w:w="3560"/>
+            <w:tcBorders>
+              <w:top w:val="single" w:color="CBD5E1" w:sz="4"/>
+              <w:left w:val="single" w:color="CBD5E1" w:sz="4"/>
+              <w:bottom w:val="single" w:color="CBD5E1" w:sz="4"/>
+              <w:right w:val="single" w:color="CBD5E1" w:sz="4"/>
+            </w:tcBorders>
+            <w:tcMar>
+              <w:top w:type="dxa" w:w="100"/>
+              <w:left w:type="dxa" w:w="140"/>
+              <w:bottom w:type="dxa" w:w="100"/>
+              <w:right w:type="dxa" w:w="140"/>
+            </w:tcMar>
+          </w:tcPr>
+          <w:p>
+            <w:pPr>
+              <w:spacing w:after="40" w:before="40"/>
+            </w:pPr>
+            <w:r>
+              <w:rPr>
+                <w:rFonts w:ascii="Arial" w:cs="Arial" w:eastAsia="Arial" w:hAnsi="Arial"/>
+                <w:b w:val="false"/>
+                <w:bCs w:val="false"/>
+                <w:color w:val="1F2937"/>
+                <w:sz w:val="19"/>
+                <w:szCs w:val="19"/>
+              </w:rPr>
+              <w:t xml:space="preserve">Danh sách các dự án thực tế tiêu biểu kèm liên kết demo/repo.</w:t>
+            </w:r>
+          </w:p>
+        </w:tc>
+      </w:tr>
+      <w:tr>
+        <w:tc>
+          <w:tcPr>
+            <w:tcW w:type="dxa" w:w="1800"/>
+            <w:tcBorders>
+              <w:top w:val="single" w:color="CBD5E1" w:sz="4"/>
+              <w:left w:val="single" w:color="CBD5E1" w:sz="4"/>
+              <w:bottom w:val="single" w:color="CBD5E1" w:sz="4"/>
+              <w:right w:val="single" w:color="CBD5E1" w:sz="4"/>
+            </w:tcBorders>
+            <w:tcMar>
+              <w:top w:type="dxa" w:w="100"/>
+              <w:left w:type="dxa" w:w="140"/>
+              <w:bottom w:type="dxa" w:w="100"/>
+              <w:right w:type="dxa" w:w="140"/>
+            </w:tcMar>
+          </w:tcPr>
+          <w:p>
+            <w:pPr>
+              <w:spacing w:after="40" w:before="40"/>
+            </w:pPr>
+            <w:r>
+              <w:rPr>
+                <w:rFonts w:ascii="Arial" w:cs="Arial" w:eastAsia="Arial" w:hAnsi="Arial"/>
+                <w:b/>
+                <w:bCs/>
+                <w:color w:val="1F2937"/>
+                <w:sz w:val="19"/>
+                <w:szCs w:val="19"/>
+              </w:rPr>
+              <w:t xml:space="preserve">profile</w:t>
+            </w:r>
+          </w:p>
+        </w:tc>
+        <w:tc>
+          <w:tcPr>
+            <w:tcW w:type="dxa" w:w="1800"/>
+            <w:tcBorders>
+              <w:top w:val="single" w:color="CBD5E1" w:sz="4"/>
+              <w:left w:val="single" w:color="CBD5E1" w:sz="4"/>
+              <w:bottom w:val="single" w:color="CBD5E1" w:sz="4"/>
+              <w:right w:val="single" w:color="CBD5E1" w:sz="4"/>
+            </w:tcBorders>
+            <w:tcMar>
+              <w:top w:type="dxa" w:w="100"/>
+              <w:left w:type="dxa" w:w="140"/>
+              <w:bottom w:type="dxa" w:w="100"/>
+              <w:right w:type="dxa" w:w="140"/>
+            </w:tcMar>
+          </w:tcPr>
+          <w:p>
+            <w:pPr>
+              <w:spacing w:after="40" w:before="40"/>
+            </w:pPr>
+            <w:r>
+              <w:rPr>
+                <w:rFonts w:ascii="Arial" w:cs="Arial" w:eastAsia="Arial" w:hAnsi="Arial"/>
+                <w:b w:val="false"/>
+                <w:bCs w:val="false"/>
+                <w:color w:val="1F2937"/>
+                <w:sz w:val="19"/>
+                <w:szCs w:val="19"/>
+              </w:rPr>
+              <w:t xml:space="preserve">1 — N *(Một - Nhiều)*</w:t>
+            </w:r>
+          </w:p>
+        </w:tc>
+        <w:tc>
+          <w:tcPr>
+            <w:tcW w:type="dxa" w:w="2200"/>
+            <w:tcBorders>
+              <w:top w:val="single" w:color="CBD5E1" w:sz="4"/>
+              <w:left w:val="single" w:color="CBD5E1" w:sz="4"/>
+              <w:bottom w:val="single" w:color="CBD5E1" w:sz="4"/>
+              <w:right w:val="single" w:color="CBD5E1" w:sz="4"/>
+            </w:tcBorders>
+            <w:tcMar>
+              <w:top w:type="dxa" w:w="100"/>
+              <w:left w:type="dxa" w:w="140"/>
+              <w:bottom w:type="dxa" w:w="100"/>
+              <w:right w:type="dxa" w:w="140"/>
+            </w:tcMar>
+          </w:tcPr>
+          <w:p>
+            <w:pPr>
+              <w:spacing w:after="40" w:before="40"/>
+            </w:pPr>
+            <w:r>
+              <w:rPr>
+                <w:rFonts w:ascii="Arial" w:cs="Arial" w:eastAsia="Arial" w:hAnsi="Arial"/>
+                <w:b/>
+                <w:bCs/>
+                <w:color w:val="1F2937"/>
+                <w:sz w:val="19"/>
+                <w:szCs w:val="19"/>
+              </w:rPr>
+              <w:t xml:space="preserve">education</w:t>
+            </w:r>
+          </w:p>
+        </w:tc>
+        <w:tc>
+          <w:tcPr>
+            <w:tcW w:type="dxa" w:w="3560"/>
+            <w:tcBorders>
+              <w:top w:val="single" w:color="CBD5E1" w:sz="4"/>
+              <w:left w:val="single" w:color="CBD5E1" w:sz="4"/>
+              <w:bottom w:val="single" w:color="CBD5E1" w:sz="4"/>
+              <w:right w:val="single" w:color="CBD5E1" w:sz="4"/>
+            </w:tcBorders>
+            <w:tcMar>
+              <w:top w:type="dxa" w:w="100"/>
+              <w:left w:type="dxa" w:w="140"/>
+              <w:bottom w:type="dxa" w:w="100"/>
+              <w:right w:type="dxa" w:w="140"/>
+            </w:tcMar>
+          </w:tcPr>
+          <w:p>
+            <w:pPr>
+              <w:spacing w:after="40" w:before="40"/>
+            </w:pPr>
+            <w:r>
+              <w:rPr>
+                <w:rFonts w:ascii="Arial" w:cs="Arial" w:eastAsia="Arial" w:hAnsi="Arial"/>
+                <w:b w:val="false"/>
+                <w:bCs w:val="false"/>
+                <w:color w:val="1F2937"/>
+                <w:sz w:val="19"/>
+                <w:szCs w:val="19"/>
+              </w:rPr>
+              <w:t xml:space="preserve">Quá trình đào tạo đại học và học vấn chuyên ngành.</w:t>
+            </w:r>
+          </w:p>
+        </w:tc>
+      </w:tr>
+      <w:tr>
+        <w:tc>
+          <w:tcPr>
+            <w:tcW w:type="dxa" w:w="1800"/>
+            <w:tcBorders>
+              <w:top w:val="single" w:color="CBD5E1" w:sz="4"/>
+              <w:left w:val="single" w:color="CBD5E1" w:sz="4"/>
+              <w:bottom w:val="single" w:color="CBD5E1" w:sz="4"/>
+              <w:right w:val="single" w:color="CBD5E1" w:sz="4"/>
+            </w:tcBorders>
+            <w:tcMar>
+              <w:top w:type="dxa" w:w="100"/>
+              <w:left w:type="dxa" w:w="140"/>
+              <w:bottom w:type="dxa" w:w="100"/>
+              <w:right w:type="dxa" w:w="140"/>
+            </w:tcMar>
+          </w:tcPr>
+          <w:p>
+            <w:pPr>
+              <w:spacing w:after="40" w:before="40"/>
+            </w:pPr>
+            <w:r>
+              <w:rPr>
+                <w:rFonts w:ascii="Arial" w:cs="Arial" w:eastAsia="Arial" w:hAnsi="Arial"/>
+                <w:b/>
+                <w:bCs/>
+                <w:color w:val="1F2937"/>
+                <w:sz w:val="19"/>
+                <w:szCs w:val="19"/>
+              </w:rPr>
+              <w:t xml:space="preserve">profile</w:t>
+            </w:r>
+          </w:p>
+        </w:tc>
+        <w:tc>
+          <w:tcPr>
+            <w:tcW w:type="dxa" w:w="1800"/>
+            <w:tcBorders>
+              <w:top w:val="single" w:color="CBD5E1" w:sz="4"/>
+              <w:left w:val="single" w:color="CBD5E1" w:sz="4"/>
+              <w:bottom w:val="single" w:color="CBD5E1" w:sz="4"/>
+              <w:right w:val="single" w:color="CBD5E1" w:sz="4"/>
+            </w:tcBorders>
+            <w:tcMar>
+              <w:top w:type="dxa" w:w="100"/>
+              <w:left w:type="dxa" w:w="140"/>
+              <w:bottom w:type="dxa" w:w="100"/>
+              <w:right w:type="dxa" w:w="140"/>
+            </w:tcMar>
+          </w:tcPr>
+          <w:p>
+            <w:pPr>
+              <w:spacing w:after="40" w:before="40"/>
+            </w:pPr>
+            <w:r>
+              <w:rPr>
+                <w:rFonts w:ascii="Arial" w:cs="Arial" w:eastAsia="Arial" w:hAnsi="Arial"/>
+                <w:b w:val="false"/>
+                <w:bCs w:val="false"/>
+                <w:color w:val="1F2937"/>
+                <w:sz w:val="19"/>
+                <w:szCs w:val="19"/>
+              </w:rPr>
+              <w:t xml:space="preserve">1 — N *(Một - Nhiều)*</w:t>
+            </w:r>
+          </w:p>
+        </w:tc>
+        <w:tc>
+          <w:tcPr>
+            <w:tcW w:type="dxa" w:w="2200"/>
+            <w:tcBorders>
+              <w:top w:val="single" w:color="CBD5E1" w:sz="4"/>
+              <w:left w:val="single" w:color="CBD5E1" w:sz="4"/>
+              <w:bottom w:val="single" w:color="CBD5E1" w:sz="4"/>
+              <w:right w:val="single" w:color="CBD5E1" w:sz="4"/>
+            </w:tcBorders>
+            <w:tcMar>
+              <w:top w:type="dxa" w:w="100"/>
+              <w:left w:type="dxa" w:w="140"/>
+              <w:bottom w:type="dxa" w:w="100"/>
+              <w:right w:type="dxa" w:w="140"/>
+            </w:tcMar>
+          </w:tcPr>
+          <w:p>
+            <w:pPr>
+              <w:spacing w:after="40" w:before="40"/>
+            </w:pPr>
+            <w:r>
+              <w:rPr>
+                <w:rFonts w:ascii="Arial" w:cs="Arial" w:eastAsia="Arial" w:hAnsi="Arial"/>
+                <w:b/>
+                <w:bCs/>
+                <w:color w:val="1F2937"/>
+                <w:sz w:val="19"/>
+                <w:szCs w:val="19"/>
+              </w:rPr>
+              <w:t xml:space="preserve">certifications</w:t>
+            </w:r>
+          </w:p>
+        </w:tc>
+        <w:tc>
+          <w:tcPr>
+            <w:tcW w:type="dxa" w:w="3560"/>
+            <w:tcBorders>
+              <w:top w:val="single" w:color="CBD5E1" w:sz="4"/>
+              <w:left w:val="single" w:color="CBD5E1" w:sz="4"/>
+              <w:bottom w:val="single" w:color="CBD5E1" w:sz="4"/>
+              <w:right w:val="single" w:color="CBD5E1" w:sz="4"/>
+            </w:tcBorders>
+            <w:tcMar>
+              <w:top w:type="dxa" w:w="100"/>
+              <w:left w:type="dxa" w:w="140"/>
+              <w:bottom w:type="dxa" w:w="100"/>
+              <w:right w:type="dxa" w:w="140"/>
+            </w:tcMar>
+          </w:tcPr>
+          <w:p>
+            <w:pPr>
+              <w:spacing w:after="40" w:before="40"/>
+            </w:pPr>
+            <w:r>
+              <w:rPr>
+                <w:rFonts w:ascii="Arial" w:cs="Arial" w:eastAsia="Arial" w:hAnsi="Arial"/>
+                <w:b w:val="false"/>
+                <w:bCs w:val="false"/>
+                <w:color w:val="1F2937"/>
+                <w:sz w:val="19"/>
+                <w:szCs w:val="19"/>
+              </w:rPr>
+              <w:t xml:space="preserve">Danh mục chứng chỉ chuyên môn với liên kết xác minh.</w:t>
+            </w:r>
+          </w:p>
+        </w:tc>
+      </w:tr>
+      <w:tr>
+        <w:tc>
+          <w:tcPr>
+            <w:tcW w:type="dxa" w:w="1800"/>
+            <w:tcBorders>
+              <w:top w:val="single" w:color="CBD5E1" w:sz="4"/>
+              <w:left w:val="single" w:color="CBD5E1" w:sz="4"/>
+              <w:bottom w:val="single" w:color="CBD5E1" w:sz="4"/>
+              <w:right w:val="single" w:color="CBD5E1" w:sz="4"/>
+            </w:tcBorders>
+            <w:tcMar>
+              <w:top w:type="dxa" w:w="100"/>
+              <w:left w:type="dxa" w:w="140"/>
+              <w:bottom w:type="dxa" w:w="100"/>
+              <w:right w:type="dxa" w:w="140"/>
+            </w:tcMar>
+          </w:tcPr>
+          <w:p>
+            <w:pPr>
+              <w:spacing w:after="40" w:before="40"/>
+            </w:pPr>
+            <w:r>
+              <w:rPr>
+                <w:rFonts w:ascii="Arial" w:cs="Arial" w:eastAsia="Arial" w:hAnsi="Arial"/>
+                <w:b/>
+                <w:bCs/>
+                <w:color w:val="1F2937"/>
+                <w:sz w:val="19"/>
+                <w:szCs w:val="19"/>
+              </w:rPr>
+              <w:t xml:space="preserve">system</w:t>
+            </w:r>
+          </w:p>
+        </w:tc>
+        <w:tc>
+          <w:tcPr>
+            <w:tcW w:type="dxa" w:w="1800"/>
+            <w:tcBorders>
+              <w:top w:val="single" w:color="CBD5E1" w:sz="4"/>
+              <w:left w:val="single" w:color="CBD5E1" w:sz="4"/>
+              <w:bottom w:val="single" w:color="CBD5E1" w:sz="4"/>
+              <w:right w:val="single" w:color="CBD5E1" w:sz="4"/>
+            </w:tcBorders>
+            <w:tcMar>
+              <w:top w:type="dxa" w:w="100"/>
+              <w:left w:type="dxa" w:w="140"/>
+              <w:bottom w:type="dxa" w:w="100"/>
+              <w:right w:type="dxa" w:w="140"/>
+            </w:tcMar>
+          </w:tcPr>
+          <w:p>
+            <w:pPr>
+              <w:spacing w:after="40" w:before="40"/>
+            </w:pPr>
+            <w:r>
+              <w:rPr>
+                <w:rFonts w:ascii="Arial" w:cs="Arial" w:eastAsia="Arial" w:hAnsi="Arial"/>
+                <w:b w:val="false"/>
+                <w:bCs w:val="false"/>
+                <w:color w:val="1F2937"/>
+                <w:sz w:val="19"/>
+                <w:szCs w:val="19"/>
+              </w:rPr>
+              <w:t xml:space="preserve">1 — N *(Một - Nhiều)*</w:t>
+            </w:r>
+          </w:p>
+        </w:tc>
+        <w:tc>
+          <w:tcPr>
+            <w:tcW w:type="dxa" w:w="2200"/>
+            <w:tcBorders>
+              <w:top w:val="single" w:color="CBD5E1" w:sz="4"/>
+              <w:left w:val="single" w:color="CBD5E1" w:sz="4"/>
+              <w:bottom w:val="single" w:color="CBD5E1" w:sz="4"/>
+              <w:right w:val="single" w:color="CBD5E1" w:sz="4"/>
+            </w:tcBorders>
+            <w:tcMar>
+              <w:top w:type="dxa" w:w="100"/>
+              <w:left w:type="dxa" w:w="140"/>
+              <w:bottom w:type="dxa" w:w="100"/>
+              <w:right w:type="dxa" w:w="140"/>
+            </w:tcMar>
+          </w:tcPr>
+          <w:p>
+            <w:pPr>
+              <w:spacing w:after="40" w:before="40"/>
+            </w:pPr>
+            <w:r>
+              <w:rPr>
+                <w:rFonts w:ascii="Arial" w:cs="Arial" w:eastAsia="Arial" w:hAnsi="Arial"/>
+                <w:b/>
+                <w:bCs/>
+                <w:color w:val="1F2937"/>
+                <w:sz w:val="19"/>
+                <w:szCs w:val="19"/>
+              </w:rPr>
+              <w:t xml:space="preserve">contact_messages</w:t>
+            </w:r>
+          </w:p>
+        </w:tc>
+        <w:tc>
+          <w:tcPr>
+            <w:tcW w:type="dxa" w:w="3560"/>
+            <w:tcBorders>
+              <w:top w:val="single" w:color="CBD5E1" w:sz="4"/>
+              <w:left w:val="single" w:color="CBD5E1" w:sz="4"/>
+              <w:bottom w:val="single" w:color="CBD5E1" w:sz="4"/>
+              <w:right w:val="single" w:color="CBD5E1" w:sz="4"/>
+            </w:tcBorders>
+            <w:tcMar>
+              <w:top w:type="dxa" w:w="100"/>
+              <w:left w:type="dxa" w:w="140"/>
+              <w:bottom w:type="dxa" w:w="100"/>
+              <w:right w:type="dxa" w:w="140"/>
+            </w:tcMar>
+          </w:tcPr>
+          <w:p>
+            <w:pPr>
+              <w:spacing w:after="40" w:before="40"/>
+            </w:pPr>
+            <w:r>
+              <w:rPr>
+                <w:rFonts w:ascii="Arial" w:cs="Arial" w:eastAsia="Arial" w:hAnsi="Arial"/>
+                <w:b w:val="false"/>
+                <w:bCs w:val="false"/>
+                <w:color w:val="1F2937"/>
+                <w:sz w:val="19"/>
+                <w:szCs w:val="19"/>
+              </w:rPr>
+              <w:t xml:space="preserve">Hộp thư tiếp nhận thông điệp liên hệ gửi từ người dùng công khai.</w:t>
+            </w:r>
+          </w:p>
+        </w:tc>
+      </w:tr>
+      <w:tr>
+        <w:tc>
+          <w:tcPr>
+            <w:tcW w:type="dxa" w:w="1800"/>
+            <w:tcBorders>
+              <w:top w:val="single" w:color="CBD5E1" w:sz="4"/>
+              <w:left w:val="single" w:color="CBD5E1" w:sz="4"/>
+              <w:bottom w:val="single" w:color="CBD5E1" w:sz="4"/>
+              <w:right w:val="single" w:color="CBD5E1" w:sz="4"/>
+            </w:tcBorders>
+            <w:tcMar>
+              <w:top w:type="dxa" w:w="100"/>
+              <w:left w:type="dxa" w:w="140"/>
+              <w:bottom w:type="dxa" w:w="100"/>
+              <w:right w:type="dxa" w:w="140"/>
+            </w:tcMar>
+          </w:tcPr>
+          <w:p>
+            <w:pPr>
+              <w:spacing w:after="40" w:before="40"/>
+            </w:pPr>
+            <w:r>
+              <w:rPr>
+                <w:rFonts w:ascii="Arial" w:cs="Arial" w:eastAsia="Arial" w:hAnsi="Arial"/>
+                <w:b/>
+                <w:bCs/>
+                <w:color w:val="1F2937"/>
+                <w:sz w:val="19"/>
+                <w:szCs w:val="19"/>
+              </w:rPr>
+              <w:t xml:space="preserve">system</w:t>
+            </w:r>
+          </w:p>
+        </w:tc>
+        <w:tc>
+          <w:tcPr>
+            <w:tcW w:type="dxa" w:w="1800"/>
+            <w:tcBorders>
+              <w:top w:val="single" w:color="CBD5E1" w:sz="4"/>
+              <w:left w:val="single" w:color="CBD5E1" w:sz="4"/>
+              <w:bottom w:val="single" w:color="CBD5E1" w:sz="4"/>
+              <w:right w:val="single" w:color="CBD5E1" w:sz="4"/>
+            </w:tcBorders>
+            <w:tcMar>
+              <w:top w:type="dxa" w:w="100"/>
+              <w:left w:type="dxa" w:w="140"/>
+              <w:bottom w:type="dxa" w:w="100"/>
+              <w:right w:type="dxa" w:w="140"/>
+            </w:tcMar>
+          </w:tcPr>
+          <w:p>
+            <w:pPr>
+              <w:spacing w:after="40" w:before="40"/>
+            </w:pPr>
+            <w:r>
+              <w:rPr>
+                <w:rFonts w:ascii="Arial" w:cs="Arial" w:eastAsia="Arial" w:hAnsi="Arial"/>
+                <w:b w:val="false"/>
+                <w:bCs w:val="false"/>
+                <w:color w:val="1F2937"/>
+                <w:sz w:val="19"/>
+                <w:szCs w:val="19"/>
+              </w:rPr>
+              <w:t xml:space="preserve">1 — N *(Một - Nhiều)*</w:t>
+            </w:r>
+          </w:p>
+        </w:tc>
+        <w:tc>
+          <w:tcPr>
+            <w:tcW w:type="dxa" w:w="2200"/>
+            <w:tcBorders>
+              <w:top w:val="single" w:color="CBD5E1" w:sz="4"/>
+              <w:left w:val="single" w:color="CBD5E1" w:sz="4"/>
+              <w:bottom w:val="single" w:color="CBD5E1" w:sz="4"/>
+              <w:right w:val="single" w:color="CBD5E1" w:sz="4"/>
+            </w:tcBorders>
+            <w:tcMar>
+              <w:top w:type="dxa" w:w="100"/>
+              <w:left w:type="dxa" w:w="140"/>
+              <w:bottom w:type="dxa" w:w="100"/>
+              <w:right w:type="dxa" w:w="140"/>
+            </w:tcMar>
+          </w:tcPr>
+          <w:p>
+            <w:pPr>
+              <w:spacing w:after="40" w:before="40"/>
+            </w:pPr>
+            <w:r>
+              <w:rPr>
+                <w:rFonts w:ascii="Arial" w:cs="Arial" w:eastAsia="Arial" w:hAnsi="Arial"/>
+                <w:b/>
+                <w:bCs/>
+                <w:color w:val="1F2937"/>
+                <w:sz w:val="19"/>
+                <w:szCs w:val="19"/>
+              </w:rPr>
+              <w:t xml:space="preserve">analytics_events</w:t>
+            </w:r>
+          </w:p>
+        </w:tc>
+        <w:tc>
+          <w:tcPr>
+            <w:tcW w:type="dxa" w:w="3560"/>
+            <w:tcBorders>
+              <w:top w:val="single" w:color="CBD5E1" w:sz="4"/>
+              <w:left w:val="single" w:color="CBD5E1" w:sz="4"/>
+              <w:bottom w:val="single" w:color="CBD5E1" w:sz="4"/>
+              <w:right w:val="single" w:color="CBD5E1" w:sz="4"/>
+            </w:tcBorders>
+            <w:tcMar>
+              <w:top w:type="dxa" w:w="100"/>
+              <w:left w:type="dxa" w:w="140"/>
+              <w:bottom w:type="dxa" w:w="100"/>
+              <w:right w:type="dxa" w:w="140"/>
+            </w:tcMar>
+          </w:tcPr>
+          <w:p>
+            <w:pPr>
+              <w:spacing w:after="40" w:before="40"/>
+            </w:pPr>
+            <w:r>
+              <w:rPr>
+                <w:rFonts w:ascii="Arial" w:cs="Arial" w:eastAsia="Arial" w:hAnsi="Arial"/>
+                <w:b w:val="false"/>
+                <w:bCs w:val="false"/>
+                <w:color w:val="1F2937"/>
+                <w:sz w:val="19"/>
+                <w:szCs w:val="19"/>
+              </w:rPr>
+              <w:t xml:space="preserve">Nhật ký ghi nhận sự kiện truy cập trang và hành vi người dùng.</w:t>
+            </w:r>
+          </w:p>
+        </w:tc>
+      </w:tr>
+    </w:tbl>
+    <w:p>
+      <w:pPr>
+        <w:spacing w:after="140"/>
+      </w:pPr>
     </w:p>
     <w:p>
       <w:pPr>

</xml_diff>